<commit_message>
docs: rewrite the charter context and record D-036 to D-038
Rewrite the charter narrative and the adjusted registration form to the
Review 1 minutes (market context, identified gap, project opportunity).
Record D-036 (deprecated folder and migration baseline reset), D-037
(self-service Field Station credentials, one invoice per term, on-screen
handover signature) and D-038 (bare SePay acknowledgement, devices never
change incidents, lost devices from RETURN_DUE). Add D-033 rejection (e),
withdraw D-034 rule 4, amend D-035 and withdraw flow E03-8.

Co-Authored-By: Claude Opus 5.5 <noreply@anthropic.com>
</commit_message>
<xml_diff>
--- a/topics/docx/Phieu_FA26SE159_adjusted_2026-10.docx
+++ b/topics/docx/Phieu_FA26SE159_adjusted_2026-10.docx
@@ -4,12 +4,12 @@
   <w:body>
     <w:p>
       <w:pPr>
-        <w:pStyle w:val="CaptionedFigure"/>
+        <w:pStyle w:val="FirstParagraph"/>
       </w:pPr>
       <w:r>
         <w:drawing>
           <wp:inline>
-            <wp:extent cx="3365500" cy="939800"/>
+            <wp:extent cx="2524125" cy="704850"/>
             <wp:effectExtent b="0" l="0" r="0" t="0"/>
             <wp:docPr descr="Phieu_FA26SE159" title="" id="21" name="Picture"/>
             <a:graphic>
@@ -30,7 +30,7 @@
                   <pic:spPr bwMode="auto">
                     <a:xfrm>
                       <a:off x="0" y="0"/>
-                      <a:ext cx="3365500" cy="939800"/>
+                      <a:ext cx="2524125" cy="704850"/>
                     </a:xfrm>
                     <a:prstGeom prst="rect">
                       <a:avLst/>
@@ -51,14 +51,6 @@
     </w:p>
     <w:p>
       <w:pPr>
-        <w:pStyle w:val="ImageCaption"/>
-      </w:pPr>
-      <w:r>
-        <w:t xml:space="preserve">Phieu_FA26SE159</w:t>
-      </w:r>
-    </w:p>
-    <w:p>
-      <w:pPr>
         <w:pStyle w:val="BlockText"/>
       </w:pPr>
       <w:r>
@@ -113,40 +105,62 @@
     </w:p>
     <w:tbl>
       <w:tblPr>
-        <w:tblStyle w:val="Table"/>
-        <w:tblW w:type="pct" w:w="5000"/>
+        <w:tblStyle w:val="TableGrid"/>
+        <w:tblW w:type="dxa" w:w="9000"/>
         <w:jc w:val="left"/>
         <w:tblLayout w:type="fixed"/>
         <w:tblLook w:firstRow="1" w:lastRow="0" w:firstColumn="0" w:lastColumn="0" w:noHBand="0" w:noVBand="0" w:val="0020"/>
+        <w:tblBorders>
+          <w:top w:val="single" w:sz="4" w:space="0" w:color="000000"/>
+          <w:left w:val="single" w:sz="4" w:space="0" w:color="000000"/>
+          <w:bottom w:val="single" w:sz="4" w:space="0" w:color="000000"/>
+          <w:right w:val="single" w:sz="4" w:space="0" w:color="000000"/>
+          <w:insideH w:val="single" w:sz="4" w:space="0" w:color="000000"/>
+          <w:insideV w:val="single" w:sz="4" w:space="0" w:color="000000"/>
+        </w:tblBorders>
       </w:tblPr>
       <w:tblGrid>
-        <w:gridCol w:w="3960"/>
-        <w:gridCol w:w="3960"/>
+        <w:gridCol w:w="1065"/>
+        <w:gridCol w:w="7935"/>
       </w:tblGrid>
       <w:tr>
         <w:trPr>
           <w:tblHeader w:val="on"/>
         </w:trPr>
         <w:tc>
-          <w:tcPr/>
+          <w:tcPr>
+            <w:tcW w:w="1065" w:type="dxa"/>
+          </w:tcPr>
           <w:p>
             <w:pPr>
               <w:pStyle w:val="Compact"/>
+              <w:spacing w:after="0"/>
               <w:jc w:val="left"/>
             </w:pPr>
             <w:r>
+              <w:rPr>
+                <w:b/>
+                <w:sz w:val="18"/>
+              </w:rPr>
               <w:t xml:space="preserve">Section</w:t>
             </w:r>
           </w:p>
         </w:tc>
         <w:tc>
-          <w:tcPr/>
+          <w:tcPr>
+            <w:tcW w:w="7935" w:type="dxa"/>
+          </w:tcPr>
           <w:p>
             <w:pPr>
               <w:pStyle w:val="Compact"/>
+              <w:spacing w:after="0"/>
               <w:jc w:val="left"/>
             </w:pPr>
             <w:r>
+              <w:rPr>
+                <w:b/>
+                <w:sz w:val="18"/>
+              </w:rPr>
               <w:t xml:space="preserve">Change</w:t>
             </w:r>
           </w:p>
@@ -154,25 +168,37 @@
       </w:tr>
       <w:tr>
         <w:tc>
-          <w:tcPr/>
+          <w:tcPr>
+            <w:tcW w:w="1065" w:type="dxa"/>
+          </w:tcPr>
           <w:p>
             <w:pPr>
               <w:pStyle w:val="Compact"/>
+              <w:spacing w:after="0"/>
               <w:jc w:val="left"/>
             </w:pPr>
             <w:r>
+              <w:rPr>
+                <w:sz w:val="18"/>
+              </w:rPr>
               <w:t xml:space="preserve">1</w:t>
             </w:r>
           </w:p>
         </w:tc>
         <w:tc>
-          <w:tcPr/>
+          <w:tcPr>
+            <w:tcW w:w="7935" w:type="dxa"/>
+          </w:tcPr>
           <w:p>
             <w:pPr>
               <w:pStyle w:val="Compact"/>
+              <w:spacing w:after="0"/>
               <w:jc w:val="left"/>
             </w:pPr>
             <w:r>
+              <w:rPr>
+                <w:sz w:val="18"/>
+              </w:rPr>
               <w:t xml:space="preserve">Co-supervisor added, as listed in the Review 1 minutes</w:t>
             </w:r>
           </w:p>
@@ -180,51 +206,75 @@
       </w:tr>
       <w:tr>
         <w:tc>
-          <w:tcPr/>
+          <w:tcPr>
+            <w:tcW w:w="1065" w:type="dxa"/>
+          </w:tcPr>
           <w:p>
             <w:pPr>
               <w:pStyle w:val="Compact"/>
+              <w:spacing w:after="0"/>
               <w:jc w:val="left"/>
             </w:pPr>
             <w:r>
+              <w:rPr>
+                <w:sz w:val="18"/>
+              </w:rPr>
               <w:t xml:space="preserve">3.2 a</w:t>
             </w:r>
           </w:p>
         </w:tc>
         <w:tc>
-          <w:tcPr/>
+          <w:tcPr>
+            <w:tcW w:w="7935" w:type="dxa"/>
+          </w:tcPr>
           <w:p>
             <w:pPr>
               <w:pStyle w:val="Compact"/>
+              <w:spacing w:after="0"/>
               <w:jc w:val="left"/>
             </w:pPr>
             <w:r>
-              <w:t xml:space="preserve">Context and the five gaps rewritten for a rental provider serving many organizations; scope boundary credits targeted firmware work</w:t>
+              <w:rPr>
+                <w:sz w:val="18"/>
+              </w:rPr>
+              <w:t xml:space="preserve">Context rewritten as market context, identified gap and project opportunity, as in the Review 1 minutes; needs listed per party; scope boundary credits targeted firmware work</w:t>
             </w:r>
           </w:p>
         </w:tc>
       </w:tr>
       <w:tr>
         <w:tc>
-          <w:tcPr/>
+          <w:tcPr>
+            <w:tcW w:w="1065" w:type="dxa"/>
+          </w:tcPr>
           <w:p>
             <w:pPr>
               <w:pStyle w:val="Compact"/>
+              <w:spacing w:after="0"/>
               <w:jc w:val="left"/>
             </w:pPr>
             <w:r>
+              <w:rPr>
+                <w:sz w:val="18"/>
+              </w:rPr>
               <w:t xml:space="preserve">3.2 b</w:t>
             </w:r>
           </w:p>
         </w:tc>
         <w:tc>
-          <w:tcPr/>
+          <w:tcPr>
+            <w:tcW w:w="7935" w:type="dxa"/>
+          </w:tcPr>
           <w:p>
             <w:pPr>
               <w:pStyle w:val="Compact"/>
+              <w:spacing w:after="0"/>
               <w:jc w:val="left"/>
             </w:pPr>
             <w:r>
+              <w:rPr>
+                <w:sz w:val="18"/>
+              </w:rPr>
               <w:t xml:space="preserve">Solutions rewritten: organization and rental management, asset management, Field Station, tiered alerts, organization API; eventId formula corrected; Prisma and SePay added</w:t>
             </w:r>
           </w:p>
@@ -232,25 +282,37 @@
       </w:tr>
       <w:tr>
         <w:tc>
-          <w:tcPr/>
+          <w:tcPr>
+            <w:tcW w:w="1065" w:type="dxa"/>
+          </w:tcPr>
           <w:p>
             <w:pPr>
               <w:pStyle w:val="Compact"/>
+              <w:spacing w:after="0"/>
               <w:jc w:val="left"/>
             </w:pPr>
             <w:r>
+              <w:rPr>
+                <w:sz w:val="18"/>
+              </w:rPr>
               <w:t xml:space="preserve">3.2 c</w:t>
             </w:r>
           </w:p>
         </w:tc>
         <w:tc>
-          <w:tcPr/>
+          <w:tcPr>
+            <w:tcW w:w="7935" w:type="dxa"/>
+          </w:tcPr>
           <w:p>
             <w:pPr>
               <w:pStyle w:val="Compact"/>
+              <w:spacing w:after="0"/>
               <w:jc w:val="left"/>
             </w:pPr>
             <w:r>
+              <w:rPr>
+                <w:sz w:val="18"/>
+              </w:rPr>
               <w:t xml:space="preserve">Actors replaced: TrekLink Admin and Staff, Organization Manager and Operator, Organization System; Customer, Guide, bookings, trips and trek packages removed</w:t>
             </w:r>
           </w:p>
@@ -258,25 +320,37 @@
       </w:tr>
       <w:tr>
         <w:tc>
-          <w:tcPr/>
+          <w:tcPr>
+            <w:tcW w:w="1065" w:type="dxa"/>
+          </w:tcPr>
           <w:p>
             <w:pPr>
               <w:pStyle w:val="Compact"/>
+              <w:spacing w:after="0"/>
               <w:jc w:val="left"/>
             </w:pPr>
             <w:r>
+              <w:rPr>
+                <w:sz w:val="18"/>
+              </w:rPr>
               <w:t xml:space="preserve">3.2 d</w:t>
             </w:r>
           </w:p>
         </w:tc>
         <w:tc>
-          <w:tcPr/>
+          <w:tcPr>
+            <w:tcW w:w="7935" w:type="dxa"/>
+          </w:tcPr>
           <w:p>
             <w:pPr>
               <w:pStyle w:val="Compact"/>
+              <w:spacing w:after="0"/>
               <w:jc w:val="left"/>
             </w:pPr>
             <w:r>
+              <w:rPr>
+                <w:sz w:val="18"/>
+              </w:rPr>
               <w:t xml:space="preserve">Tenant isolation added to security; scalability stated per organization</w:t>
             </w:r>
           </w:p>
@@ -284,25 +358,37 @@
       </w:tr>
       <w:tr>
         <w:tc>
-          <w:tcPr/>
+          <w:tcPr>
+            <w:tcW w:w="1065" w:type="dxa"/>
+          </w:tcPr>
           <w:p>
             <w:pPr>
               <w:pStyle w:val="Compact"/>
+              <w:spacing w:after="0"/>
               <w:jc w:val="left"/>
             </w:pPr>
             <w:r>
+              <w:rPr>
+                <w:sz w:val="18"/>
+              </w:rPr>
               <w:t xml:space="preserve">3.2 e to g</w:t>
             </w:r>
           </w:p>
         </w:tc>
         <w:tc>
-          <w:tcPr/>
+          <w:tcPr>
+            <w:tcW w:w="7935" w:type="dxa"/>
+          </w:tcPr>
           <w:p>
             <w:pPr>
               <w:pStyle w:val="Compact"/>
+              <w:spacing w:after="0"/>
               <w:jc w:val="left"/>
             </w:pPr>
             <w:r>
+              <w:rPr>
+                <w:sz w:val="18"/>
+              </w:rPr>
               <w:t xml:space="preserve">State machines, RBAC, modules, products and task packages aligned</w:t>
             </w:r>
           </w:p>
@@ -310,51 +396,75 @@
       </w:tr>
       <w:tr>
         <w:tc>
-          <w:tcPr/>
+          <w:tcPr>
+            <w:tcW w:w="1065" w:type="dxa"/>
+          </w:tcPr>
           <w:p>
             <w:pPr>
               <w:pStyle w:val="Compact"/>
+              <w:spacing w:after="0"/>
               <w:jc w:val="left"/>
             </w:pPr>
             <w:r>
+              <w:rPr>
+                <w:sz w:val="18"/>
+              </w:rPr>
               <w:t xml:space="preserve">3.3</w:t>
             </w:r>
           </w:p>
         </w:tc>
         <w:tc>
-          <w:tcPr/>
+          <w:tcPr>
+            <w:tcW w:w="7935" w:type="dxa"/>
+          </w:tcPr>
           <w:p>
             <w:pPr>
               <w:pStyle w:val="Compact"/>
+              <w:spacing w:after="0"/>
               <w:jc w:val="left"/>
             </w:pPr>
             <w:r>
-              <w:t xml:space="preserve">Research text aligned; RQ1 to RQ3 unchanged in substance</w:t>
+              <w:rPr>
+                <w:sz w:val="18"/>
+              </w:rPr>
+              <w:t xml:space="preserve">Research problem reworded; RQ1 to RQ3 unchanged in substance; satellite messengers removed from related works, as the panel asked for comparison within Vietnam only</w:t>
             </w:r>
           </w:p>
         </w:tc>
       </w:tr>
       <w:tr>
         <w:tc>
-          <w:tcPr/>
+          <w:tcPr>
+            <w:tcW w:w="1065" w:type="dxa"/>
+          </w:tcPr>
           <w:p>
             <w:pPr>
               <w:pStyle w:val="Compact"/>
+              <w:spacing w:after="0"/>
               <w:jc w:val="left"/>
             </w:pPr>
             <w:r>
+              <w:rPr>
+                <w:sz w:val="18"/>
+              </w:rPr>
               <w:t xml:space="preserve">4</w:t>
             </w:r>
           </w:p>
         </w:tc>
         <w:tc>
-          <w:tcPr/>
+          <w:tcPr>
+            <w:tcW w:w="7935" w:type="dxa"/>
+          </w:tcPr>
           <w:p>
             <w:pPr>
               <w:pStyle w:val="Compact"/>
+              <w:spacing w:after="0"/>
               <w:jc w:val="left"/>
             </w:pPr>
             <w:r>
+              <w:rPr>
+                <w:sz w:val="18"/>
+              </w:rPr>
               <w:t xml:space="preserve">Firmware and hardware credit; reason for the adjustment</w:t>
             </w:r>
           </w:p>
@@ -406,31 +516,30 @@
         <w:pStyle w:val="BodyText"/>
       </w:pPr>
       <w:r>
-        <w:t xml:space="preserve">**(*) Profession:</w:t>
-      </w:r>
-      <w:r>
-        <w:rPr>
-          <w:b/>
-          <w:bCs/>
-        </w:rPr>
-        <w:t xml:space="preserve"> </w:t>
-      </w:r>
-      <w:r>
-        <w:rPr>
-          <w:b/>
-          <w:bCs/>
-        </w:rPr>
+        <w:rPr>
+          <w:b/>
+          <w:bCs/>
+        </w:rPr>
+        <w:t xml:space="preserve">(*) Profession:</w:t>
+      </w:r>
+      <w:r>
+        <w:t xml:space="preserve"> </w:t>
+      </w:r>
+      <w:r>
         <w:t xml:space="preserve">Software Engineer</w:t>
       </w:r>
       <w:r>
-        <w:rPr>
-          <w:b/>
-          <w:bCs/>
-        </w:rPr>
-        <w:t xml:space="preserve"> </w:t>
-      </w:r>
-      <w:r>
-        <w:t xml:space="preserve">Specialty**: SE</w:t>
+        <w:t xml:space="preserve"> </w:t>
+      </w:r>
+      <w:r>
+        <w:rPr>
+          <w:b/>
+          <w:bCs/>
+        </w:rPr>
+        <w:t xml:space="preserve">Specialty</w:t>
+      </w:r>
+      <w:r>
+        <w:t xml:space="preserve">: SE</w:t>
       </w:r>
       <w:r>
         <w:t xml:space="preserve"> </w:t>
@@ -438,7 +547,7 @@
       <w:r>
         <w:drawing>
           <wp:inline>
-            <wp:extent cx="266700" cy="266700"/>
+            <wp:extent cx="200025" cy="200025"/>
             <wp:effectExtent b="0" l="0" r="0" t="0"/>
             <wp:docPr descr="Phieu_FA26SE159" title="" id="24" name="Picture"/>
             <a:graphic>
@@ -459,7 +568,7 @@
                   <pic:spPr bwMode="auto">
                     <a:xfrm>
                       <a:off x="0" y="0"/>
-                      <a:ext cx="266700" cy="266700"/>
+                      <a:ext cx="200025" cy="200025"/>
                     </a:xfrm>
                     <a:prstGeom prst="rect">
                       <a:avLst/>
@@ -483,7 +592,17 @@
         <w:pStyle w:val="BodyText"/>
       </w:pPr>
       <w:r>
-        <w:t xml:space="preserve">**(*) Kinds of person make registers:** Lecturer</w:t>
+        <w:rPr>
+          <w:b/>
+          <w:bCs/>
+        </w:rPr>
+        <w:t xml:space="preserve">(*) Kinds of person make registers:</w:t>
+      </w:r>
+      <w:r>
+        <w:t xml:space="preserve"> </w:t>
+      </w:r>
+      <w:r>
+        <w:t xml:space="preserve">Lecturer</w:t>
       </w:r>
       <w:r>
         <w:t xml:space="preserve"> </w:t>
@@ -491,7 +610,7 @@
       <w:r>
         <w:drawing>
           <wp:inline>
-            <wp:extent cx="266700" cy="266700"/>
+            <wp:extent cx="200025" cy="200025"/>
             <wp:effectExtent b="0" l="0" r="0" t="0"/>
             <wp:docPr descr="Phieu_FA26SE159" title="" id="27" name="Picture"/>
             <a:graphic>
@@ -512,7 +631,7 @@
                   <pic:spPr bwMode="auto">
                     <a:xfrm>
                       <a:off x="0" y="0"/>
-                      <a:ext cx="266700" cy="266700"/>
+                      <a:ext cx="200025" cy="200025"/>
                     </a:xfrm>
                     <a:prstGeom prst="rect">
                       <a:avLst/>
@@ -551,86 +670,123 @@
     </w:p>
     <w:tbl>
       <w:tblPr>
-        <w:tblStyle w:val="Table"/>
-        <w:tblW w:type="pct" w:w="5000"/>
+        <w:tblStyle w:val="TableGrid"/>
+        <w:tblW w:type="dxa" w:w="9000"/>
         <w:jc w:val="left"/>
         <w:tblLayout w:type="fixed"/>
         <w:tblLook w:firstRow="1" w:lastRow="0" w:firstColumn="0" w:lastColumn="0" w:noHBand="0" w:noVBand="0" w:val="0020"/>
+        <w:tblBorders>
+          <w:top w:val="single" w:sz="4" w:space="0" w:color="000000"/>
+          <w:left w:val="single" w:sz="4" w:space="0" w:color="000000"/>
+          <w:bottom w:val="single" w:sz="4" w:space="0" w:color="000000"/>
+          <w:right w:val="single" w:sz="4" w:space="0" w:color="000000"/>
+          <w:insideH w:val="single" w:sz="4" w:space="0" w:color="000000"/>
+          <w:insideV w:val="single" w:sz="4" w:space="0" w:color="000000"/>
+        </w:tblBorders>
       </w:tblPr>
       <w:tblGrid>
-        <w:gridCol w:w="1320"/>
-        <w:gridCol w:w="2376"/>
-        <w:gridCol w:w="660"/>
-        <w:gridCol w:w="2244"/>
-        <w:gridCol w:w="1320"/>
+        <w:gridCol w:w="1755"/>
+        <w:gridCol w:w="2406"/>
+        <w:gridCol w:w="937"/>
+        <w:gridCol w:w="2215"/>
+        <w:gridCol w:w="1686"/>
       </w:tblGrid>
       <w:tr>
         <w:trPr>
           <w:tblHeader w:val="on"/>
         </w:trPr>
         <w:tc>
-          <w:tcPr/>
+          <w:tcPr>
+            <w:tcW w:w="1755" w:type="dxa"/>
+          </w:tcPr>
           <w:p>
             <w:pPr>
               <w:pStyle w:val="Compact"/>
+              <w:spacing w:after="0"/>
               <w:jc w:val="left"/>
             </w:pPr>
             <w:r>
+              <w:rPr>
+                <w:b/>
+                <w:sz w:val="18"/>
+              </w:rPr>
               <w:t xml:space="preserve">No.</w:t>
             </w:r>
           </w:p>
         </w:tc>
         <w:tc>
-          <w:tcPr/>
+          <w:tcPr>
+            <w:tcW w:w="2406" w:type="dxa"/>
+          </w:tcPr>
           <w:p>
             <w:pPr>
               <w:pStyle w:val="Compact"/>
+              <w:spacing w:after="0"/>
               <w:jc w:val="left"/>
             </w:pPr>
             <w:r>
+              <w:rPr>
+                <w:b/>
+                <w:sz w:val="18"/>
+              </w:rPr>
               <w:t xml:space="preserve">Full name</w:t>
             </w:r>
           </w:p>
         </w:tc>
         <w:tc>
-          <w:tcPr/>
+          <w:tcPr>
+            <w:tcW w:w="937" w:type="dxa"/>
+          </w:tcPr>
           <w:p>
             <w:pPr>
               <w:pStyle w:val="Compact"/>
+              <w:spacing w:after="0"/>
               <w:jc w:val="left"/>
             </w:pPr>
             <w:r>
+              <w:rPr>
+                <w:b/>
+                <w:sz w:val="18"/>
+              </w:rPr>
               <w:t xml:space="preserve">Phone</w:t>
             </w:r>
           </w:p>
         </w:tc>
         <w:tc>
-          <w:tcPr/>
+          <w:tcPr>
+            <w:tcW w:w="2215" w:type="dxa"/>
+          </w:tcPr>
           <w:p>
             <w:pPr>
               <w:pStyle w:val="Compact"/>
+              <w:spacing w:after="0"/>
               <w:jc w:val="left"/>
             </w:pPr>
             <w:r>
               <w:rPr>
                 <w:b/>
                 <w:bCs/>
+                <w:sz w:val="18"/>
               </w:rPr>
               <w:t xml:space="preserve">E-Mail</w:t>
             </w:r>
           </w:p>
         </w:tc>
         <w:tc>
-          <w:tcPr/>
+          <w:tcPr>
+            <w:tcW w:w="1686" w:type="dxa"/>
+          </w:tcPr>
           <w:p>
             <w:pPr>
               <w:pStyle w:val="Compact"/>
+              <w:spacing w:after="0"/>
               <w:jc w:val="left"/>
             </w:pPr>
             <w:r>
               <w:rPr>
                 <w:b/>
                 <w:bCs/>
+                <w:sz w:val="18"/>
               </w:rPr>
               <w:t xml:space="preserve">Title</w:t>
             </w:r>
@@ -639,57 +795,84 @@
       </w:tr>
       <w:tr>
         <w:tc>
-          <w:tcPr/>
+          <w:tcPr>
+            <w:tcW w:w="1755" w:type="dxa"/>
+          </w:tcPr>
           <w:p>
             <w:pPr>
               <w:pStyle w:val="Compact"/>
+              <w:spacing w:after="0"/>
               <w:jc w:val="left"/>
             </w:pPr>
             <w:r>
+              <w:rPr>
+                <w:sz w:val="18"/>
+              </w:rPr>
               <w:t xml:space="preserve">Supervisor</w:t>
             </w:r>
           </w:p>
         </w:tc>
         <w:tc>
-          <w:tcPr/>
+          <w:tcPr>
+            <w:tcW w:w="2406" w:type="dxa"/>
+          </w:tcPr>
           <w:p>
             <w:pPr>
               <w:pStyle w:val="Compact"/>
+              <w:spacing w:after="0"/>
               <w:jc w:val="left"/>
             </w:pPr>
             <w:r>
+              <w:rPr>
+                <w:sz w:val="18"/>
+              </w:rPr>
               <w:t xml:space="preserve">Đặng Ngọc Minh Đức</w:t>
             </w:r>
           </w:p>
         </w:tc>
         <w:tc>
-          <w:tcPr/>
+          <w:tcPr>
+            <w:tcW w:w="937" w:type="dxa"/>
+          </w:tcPr>
           <w:p>
             <w:pPr>
               <w:pStyle w:val="Compact"/>
+              <w:spacing w:after="0"/>
             </w:pPr>
           </w:p>
         </w:tc>
         <w:tc>
-          <w:tcPr/>
+          <w:tcPr>
+            <w:tcW w:w="2215" w:type="dxa"/>
+          </w:tcPr>
           <w:p>
             <w:pPr>
               <w:pStyle w:val="Compact"/>
+              <w:spacing w:after="0"/>
               <w:jc w:val="left"/>
             </w:pPr>
             <w:r>
+              <w:rPr>
+                <w:sz w:val="18"/>
+              </w:rPr>
               <w:t xml:space="preserve">ducdnm2@fe.edu.vn</w:t>
             </w:r>
           </w:p>
         </w:tc>
         <w:tc>
-          <w:tcPr/>
+          <w:tcPr>
+            <w:tcW w:w="1686" w:type="dxa"/>
+          </w:tcPr>
           <w:p>
             <w:pPr>
               <w:pStyle w:val="Compact"/>
+              <w:spacing w:after="0"/>
               <w:jc w:val="left"/>
             </w:pPr>
             <w:r>
+              <w:rPr>
+                <w:sz w:val="18"/>
+              </w:rPr>
               <w:t xml:space="preserve">Giảng viên</w:t>
             </w:r>
           </w:p>
@@ -697,14 +880,18 @@
       </w:tr>
       <w:tr>
         <w:tc>
-          <w:tcPr/>
+          <w:tcPr>
+            <w:tcW w:w="1755" w:type="dxa"/>
+          </w:tcPr>
           <w:p>
             <w:pPr>
               <w:pStyle w:val="Compact"/>
+              <w:spacing w:after="0"/>
               <w:jc w:val="left"/>
             </w:pPr>
             <w:r>
               <w:rPr>
+                <w:sz w:val="18"/>
                 <w:highlight w:val="yellow"/>
               </w:rPr>
               <w:t xml:space="preserve">Co-supervisor</w:t>
@@ -712,14 +899,18 @@
           </w:p>
         </w:tc>
         <w:tc>
-          <w:tcPr/>
+          <w:tcPr>
+            <w:tcW w:w="2406" w:type="dxa"/>
+          </w:tcPr>
           <w:p>
             <w:pPr>
               <w:pStyle w:val="Compact"/>
+              <w:spacing w:after="0"/>
               <w:jc w:val="left"/>
             </w:pPr>
             <w:r>
               <w:rPr>
+                <w:sz w:val="18"/>
                 <w:highlight w:val="yellow"/>
               </w:rPr>
               <w:t xml:space="preserve">Bùi Văn Phúc</w:t>
@@ -727,30 +918,40 @@
           </w:p>
         </w:tc>
         <w:tc>
-          <w:tcPr/>
+          <w:tcPr>
+            <w:tcW w:w="937" w:type="dxa"/>
+          </w:tcPr>
           <w:p>
             <w:pPr>
               <w:pStyle w:val="Compact"/>
+              <w:spacing w:after="0"/>
             </w:pPr>
           </w:p>
         </w:tc>
         <w:tc>
-          <w:tcPr/>
+          <w:tcPr>
+            <w:tcW w:w="2215" w:type="dxa"/>
+          </w:tcPr>
           <w:p>
             <w:pPr>
               <w:pStyle w:val="Compact"/>
+              <w:spacing w:after="0"/>
             </w:pPr>
           </w:p>
         </w:tc>
         <w:tc>
-          <w:tcPr/>
+          <w:tcPr>
+            <w:tcW w:w="1686" w:type="dxa"/>
+          </w:tcPr>
           <w:p>
             <w:pPr>
               <w:pStyle w:val="Compact"/>
+              <w:spacing w:after="0"/>
               <w:jc w:val="left"/>
             </w:pPr>
             <w:r>
               <w:rPr>
+                <w:sz w:val="18"/>
                 <w:highlight w:val="yellow"/>
               </w:rPr>
               <w:t xml:space="preserve">Giảng viên</w:t>
@@ -773,115 +974,147 @@
     </w:p>
     <w:tbl>
       <w:tblPr>
-        <w:tblStyle w:val="Table"/>
-        <w:tblW w:type="pct" w:w="5000"/>
+        <w:tblStyle w:val="TableGrid"/>
+        <w:tblW w:type="dxa" w:w="9000"/>
         <w:jc w:val="left"/>
         <w:tblLayout w:type="fixed"/>
         <w:tblLook w:firstRow="1" w:lastRow="0" w:firstColumn="0" w:lastColumn="0" w:noHBand="0" w:noVBand="0" w:val="0020"/>
+        <w:tblBorders>
+          <w:top w:val="single" w:sz="4" w:space="0" w:color="000000"/>
+          <w:left w:val="single" w:sz="4" w:space="0" w:color="000000"/>
+          <w:bottom w:val="single" w:sz="4" w:space="0" w:color="000000"/>
+          <w:right w:val="single" w:sz="4" w:space="0" w:color="000000"/>
+          <w:insideH w:val="single" w:sz="4" w:space="0" w:color="000000"/>
+          <w:insideV w:val="single" w:sz="4" w:space="0" w:color="000000"/>
+        </w:tblBorders>
       </w:tblPr>
       <w:tblGrid>
-        <w:gridCol w:w="602"/>
-        <w:gridCol w:w="1377"/>
-        <w:gridCol w:w="1377"/>
-        <w:gridCol w:w="774"/>
-        <w:gridCol w:w="2324"/>
-        <w:gridCol w:w="1463"/>
+        <w:gridCol w:w="700"/>
+        <w:gridCol w:w="1738"/>
+        <w:gridCol w:w="1270"/>
+        <w:gridCol w:w="835"/>
+        <w:gridCol w:w="3365"/>
+        <w:gridCol w:w="1091"/>
       </w:tblGrid>
       <w:tr>
         <w:trPr>
           <w:tblHeader w:val="on"/>
         </w:trPr>
         <w:tc>
-          <w:tcPr/>
+          <w:tcPr>
+            <w:tcW w:w="700" w:type="dxa"/>
+          </w:tcPr>
           <w:p>
             <w:pPr>
               <w:pStyle w:val="Compact"/>
+              <w:spacing w:after="0"/>
               <w:jc w:val="left"/>
             </w:pPr>
             <w:r>
               <w:rPr>
                 <w:b/>
                 <w:bCs/>
+                <w:sz w:val="18"/>
               </w:rPr>
               <w:t xml:space="preserve">No.</w:t>
             </w:r>
           </w:p>
         </w:tc>
         <w:tc>
-          <w:tcPr/>
+          <w:tcPr>
+            <w:tcW w:w="1738" w:type="dxa"/>
+          </w:tcPr>
           <w:p>
             <w:pPr>
               <w:pStyle w:val="Compact"/>
+              <w:spacing w:after="0"/>
               <w:jc w:val="left"/>
             </w:pPr>
             <w:r>
               <w:rPr>
                 <w:b/>
                 <w:bCs/>
+                <w:sz w:val="18"/>
               </w:rPr>
               <w:t xml:space="preserve">Full name</w:t>
             </w:r>
           </w:p>
         </w:tc>
         <w:tc>
-          <w:tcPr/>
+          <w:tcPr>
+            <w:tcW w:w="1270" w:type="dxa"/>
+          </w:tcPr>
           <w:p>
             <w:pPr>
               <w:pStyle w:val="Compact"/>
+              <w:spacing w:after="0"/>
               <w:jc w:val="left"/>
             </w:pPr>
             <w:r>
               <w:rPr>
                 <w:b/>
                 <w:bCs/>
+                <w:sz w:val="18"/>
               </w:rPr>
               <w:t xml:space="preserve">Student code</w:t>
             </w:r>
           </w:p>
         </w:tc>
         <w:tc>
-          <w:tcPr/>
+          <w:tcPr>
+            <w:tcW w:w="835" w:type="dxa"/>
+          </w:tcPr>
           <w:p>
             <w:pPr>
               <w:pStyle w:val="Compact"/>
+              <w:spacing w:after="0"/>
               <w:jc w:val="left"/>
             </w:pPr>
             <w:r>
               <w:rPr>
                 <w:b/>
                 <w:bCs/>
+                <w:sz w:val="18"/>
               </w:rPr>
               <w:t xml:space="preserve">Phone</w:t>
             </w:r>
           </w:p>
         </w:tc>
         <w:tc>
-          <w:tcPr/>
+          <w:tcPr>
+            <w:tcW w:w="3365" w:type="dxa"/>
+          </w:tcPr>
           <w:p>
             <w:pPr>
               <w:pStyle w:val="Compact"/>
+              <w:spacing w:after="0"/>
               <w:jc w:val="left"/>
             </w:pPr>
             <w:r>
               <w:rPr>
                 <w:b/>
                 <w:bCs/>
+                <w:sz w:val="18"/>
               </w:rPr>
               <w:t xml:space="preserve">E-mail</w:t>
             </w:r>
           </w:p>
         </w:tc>
         <w:tc>
-          <w:tcPr/>
+          <w:tcPr>
+            <w:tcW w:w="1091" w:type="dxa"/>
+          </w:tcPr>
           <w:p>
             <w:pPr>
               <w:pStyle w:val="Compact"/>
+              <w:spacing w:after="0"/>
               <w:jc w:val="left"/>
             </w:pPr>
             <w:r>
               <w:rPr>
                 <w:b/>
                 <w:bCs/>
+                <w:sz w:val="18"/>
               </w:rPr>
               <w:t xml:space="preserve">Role in Group</w:t>
             </w:r>
@@ -890,69 +1123,102 @@
       </w:tr>
       <w:tr>
         <w:tc>
-          <w:tcPr/>
+          <w:tcPr>
+            <w:tcW w:w="700" w:type="dxa"/>
+          </w:tcPr>
           <w:p>
             <w:pPr>
               <w:pStyle w:val="Compact"/>
+              <w:spacing w:after="0"/>
               <w:jc w:val="left"/>
             </w:pPr>
             <w:r>
+              <w:rPr>
+                <w:sz w:val="18"/>
+              </w:rPr>
               <w:t xml:space="preserve">1</w:t>
             </w:r>
           </w:p>
         </w:tc>
         <w:tc>
-          <w:tcPr/>
+          <w:tcPr>
+            <w:tcW w:w="1738" w:type="dxa"/>
+          </w:tcPr>
           <w:p>
             <w:pPr>
               <w:pStyle w:val="Compact"/>
+              <w:spacing w:after="0"/>
               <w:jc w:val="left"/>
             </w:pPr>
             <w:r>
+              <w:rPr>
+                <w:sz w:val="18"/>
+              </w:rPr>
               <w:t xml:space="preserve">Đỗ Đăng Khoa</w:t>
             </w:r>
           </w:p>
         </w:tc>
         <w:tc>
-          <w:tcPr/>
+          <w:tcPr>
+            <w:tcW w:w="1270" w:type="dxa"/>
+          </w:tcPr>
           <w:p>
             <w:pPr>
               <w:pStyle w:val="Compact"/>
+              <w:spacing w:after="0"/>
               <w:jc w:val="left"/>
             </w:pPr>
             <w:r>
+              <w:rPr>
+                <w:sz w:val="18"/>
+              </w:rPr>
               <w:t xml:space="preserve">SE192357</w:t>
             </w:r>
           </w:p>
         </w:tc>
         <w:tc>
-          <w:tcPr/>
+          <w:tcPr>
+            <w:tcW w:w="835" w:type="dxa"/>
+          </w:tcPr>
           <w:p>
             <w:pPr>
               <w:pStyle w:val="Compact"/>
+              <w:spacing w:after="0"/>
             </w:pPr>
           </w:p>
         </w:tc>
         <w:tc>
-          <w:tcPr/>
+          <w:tcPr>
+            <w:tcW w:w="3365" w:type="dxa"/>
+          </w:tcPr>
           <w:p>
             <w:pPr>
               <w:pStyle w:val="Compact"/>
+              <w:spacing w:after="0"/>
               <w:jc w:val="left"/>
             </w:pPr>
             <w:r>
+              <w:rPr>
+                <w:sz w:val="18"/>
+              </w:rPr>
               <w:t xml:space="preserve">khoado7577@gmail.com</w:t>
             </w:r>
           </w:p>
         </w:tc>
         <w:tc>
-          <w:tcPr/>
+          <w:tcPr>
+            <w:tcW w:w="1091" w:type="dxa"/>
+          </w:tcPr>
           <w:p>
             <w:pPr>
               <w:pStyle w:val="Compact"/>
+              <w:spacing w:after="0"/>
               <w:jc w:val="left"/>
             </w:pPr>
             <w:r>
+              <w:rPr>
+                <w:sz w:val="18"/>
+              </w:rPr>
               <w:t xml:space="preserve">Leader</w:t>
             </w:r>
           </w:p>
@@ -960,69 +1226,102 @@
       </w:tr>
       <w:tr>
         <w:tc>
-          <w:tcPr/>
+          <w:tcPr>
+            <w:tcW w:w="700" w:type="dxa"/>
+          </w:tcPr>
           <w:p>
             <w:pPr>
               <w:pStyle w:val="Compact"/>
+              <w:spacing w:after="0"/>
               <w:jc w:val="left"/>
             </w:pPr>
             <w:r>
+              <w:rPr>
+                <w:sz w:val="18"/>
+              </w:rPr>
               <w:t xml:space="preserve">2</w:t>
             </w:r>
           </w:p>
         </w:tc>
         <w:tc>
-          <w:tcPr/>
+          <w:tcPr>
+            <w:tcW w:w="1738" w:type="dxa"/>
+          </w:tcPr>
           <w:p>
             <w:pPr>
               <w:pStyle w:val="Compact"/>
+              <w:spacing w:after="0"/>
               <w:jc w:val="left"/>
             </w:pPr>
             <w:r>
+              <w:rPr>
+                <w:sz w:val="18"/>
+              </w:rPr>
               <w:t xml:space="preserve">Trần Khải Hoàng</w:t>
             </w:r>
           </w:p>
         </w:tc>
         <w:tc>
-          <w:tcPr/>
+          <w:tcPr>
+            <w:tcW w:w="1270" w:type="dxa"/>
+          </w:tcPr>
           <w:p>
             <w:pPr>
               <w:pStyle w:val="Compact"/>
+              <w:spacing w:after="0"/>
               <w:jc w:val="left"/>
             </w:pPr>
             <w:r>
+              <w:rPr>
+                <w:sz w:val="18"/>
+              </w:rPr>
               <w:t xml:space="preserve">SE182767</w:t>
             </w:r>
           </w:p>
         </w:tc>
         <w:tc>
-          <w:tcPr/>
+          <w:tcPr>
+            <w:tcW w:w="835" w:type="dxa"/>
+          </w:tcPr>
           <w:p>
             <w:pPr>
               <w:pStyle w:val="Compact"/>
+              <w:spacing w:after="0"/>
             </w:pPr>
           </w:p>
         </w:tc>
         <w:tc>
-          <w:tcPr/>
+          <w:tcPr>
+            <w:tcW w:w="3365" w:type="dxa"/>
+          </w:tcPr>
           <w:p>
             <w:pPr>
               <w:pStyle w:val="Compact"/>
+              <w:spacing w:after="0"/>
               <w:jc w:val="left"/>
             </w:pPr>
             <w:r>
+              <w:rPr>
+                <w:sz w:val="18"/>
+              </w:rPr>
               <w:t xml:space="preserve">HoangTKSE182767@fpt.edu.vn</w:t>
             </w:r>
           </w:p>
         </w:tc>
         <w:tc>
-          <w:tcPr/>
+          <w:tcPr>
+            <w:tcW w:w="1091" w:type="dxa"/>
+          </w:tcPr>
           <w:p>
             <w:pPr>
               <w:pStyle w:val="Compact"/>
+              <w:spacing w:after="0"/>
               <w:jc w:val="left"/>
             </w:pPr>
             <w:r>
+              <w:rPr>
+                <w:sz w:val="18"/>
+              </w:rPr>
               <w:t xml:space="preserve">Member</w:t>
             </w:r>
           </w:p>
@@ -1030,69 +1329,102 @@
       </w:tr>
       <w:tr>
         <w:tc>
-          <w:tcPr/>
+          <w:tcPr>
+            <w:tcW w:w="700" w:type="dxa"/>
+          </w:tcPr>
           <w:p>
             <w:pPr>
               <w:pStyle w:val="Compact"/>
+              <w:spacing w:after="0"/>
               <w:jc w:val="left"/>
             </w:pPr>
             <w:r>
+              <w:rPr>
+                <w:sz w:val="18"/>
+              </w:rPr>
               <w:t xml:space="preserve">3</w:t>
             </w:r>
           </w:p>
         </w:tc>
         <w:tc>
-          <w:tcPr/>
+          <w:tcPr>
+            <w:tcW w:w="1738" w:type="dxa"/>
+          </w:tcPr>
           <w:p>
             <w:pPr>
               <w:pStyle w:val="Compact"/>
+              <w:spacing w:after="0"/>
               <w:jc w:val="left"/>
             </w:pPr>
             <w:r>
+              <w:rPr>
+                <w:sz w:val="18"/>
+              </w:rPr>
               <w:t xml:space="preserve">Lâm Phi Long</w:t>
             </w:r>
           </w:p>
         </w:tc>
         <w:tc>
-          <w:tcPr/>
+          <w:tcPr>
+            <w:tcW w:w="1270" w:type="dxa"/>
+          </w:tcPr>
           <w:p>
             <w:pPr>
               <w:pStyle w:val="Compact"/>
+              <w:spacing w:after="0"/>
               <w:jc w:val="left"/>
             </w:pPr>
             <w:r>
+              <w:rPr>
+                <w:sz w:val="18"/>
+              </w:rPr>
               <w:t xml:space="preserve">SE182769</w:t>
             </w:r>
           </w:p>
         </w:tc>
         <w:tc>
-          <w:tcPr/>
+          <w:tcPr>
+            <w:tcW w:w="835" w:type="dxa"/>
+          </w:tcPr>
           <w:p>
             <w:pPr>
               <w:pStyle w:val="Compact"/>
+              <w:spacing w:after="0"/>
             </w:pPr>
           </w:p>
         </w:tc>
         <w:tc>
-          <w:tcPr/>
+          <w:tcPr>
+            <w:tcW w:w="3365" w:type="dxa"/>
+          </w:tcPr>
           <w:p>
             <w:pPr>
               <w:pStyle w:val="Compact"/>
+              <w:spacing w:after="0"/>
               <w:jc w:val="left"/>
             </w:pPr>
             <w:r>
+              <w:rPr>
+                <w:sz w:val="18"/>
+              </w:rPr>
               <w:t xml:space="preserve">LongLPSE182769@fpt.edu.vn</w:t>
             </w:r>
           </w:p>
         </w:tc>
         <w:tc>
-          <w:tcPr/>
+          <w:tcPr>
+            <w:tcW w:w="1091" w:type="dxa"/>
+          </w:tcPr>
           <w:p>
             <w:pPr>
               <w:pStyle w:val="Compact"/>
+              <w:spacing w:after="0"/>
               <w:jc w:val="left"/>
             </w:pPr>
             <w:r>
+              <w:rPr>
+                <w:sz w:val="18"/>
+              </w:rPr>
               <w:t xml:space="preserve">Member</w:t>
             </w:r>
           </w:p>
@@ -1100,69 +1432,102 @@
       </w:tr>
       <w:tr>
         <w:tc>
-          <w:tcPr/>
+          <w:tcPr>
+            <w:tcW w:w="700" w:type="dxa"/>
+          </w:tcPr>
           <w:p>
             <w:pPr>
               <w:pStyle w:val="Compact"/>
+              <w:spacing w:after="0"/>
               <w:jc w:val="left"/>
             </w:pPr>
             <w:r>
+              <w:rPr>
+                <w:sz w:val="18"/>
+              </w:rPr>
               <w:t xml:space="preserve">4</w:t>
             </w:r>
           </w:p>
         </w:tc>
         <w:tc>
-          <w:tcPr/>
+          <w:tcPr>
+            <w:tcW w:w="1738" w:type="dxa"/>
+          </w:tcPr>
           <w:p>
             <w:pPr>
               <w:pStyle w:val="Compact"/>
+              <w:spacing w:after="0"/>
               <w:jc w:val="left"/>
             </w:pPr>
             <w:r>
+              <w:rPr>
+                <w:sz w:val="18"/>
+              </w:rPr>
               <w:t xml:space="preserve">Nguyễn Bá Tân</w:t>
             </w:r>
           </w:p>
         </w:tc>
         <w:tc>
-          <w:tcPr/>
+          <w:tcPr>
+            <w:tcW w:w="1270" w:type="dxa"/>
+          </w:tcPr>
           <w:p>
             <w:pPr>
               <w:pStyle w:val="Compact"/>
+              <w:spacing w:after="0"/>
               <w:jc w:val="left"/>
             </w:pPr>
             <w:r>
+              <w:rPr>
+                <w:sz w:val="18"/>
+              </w:rPr>
               <w:t xml:space="preserve">SE183860</w:t>
             </w:r>
           </w:p>
         </w:tc>
         <w:tc>
-          <w:tcPr/>
+          <w:tcPr>
+            <w:tcW w:w="835" w:type="dxa"/>
+          </w:tcPr>
           <w:p>
             <w:pPr>
               <w:pStyle w:val="Compact"/>
+              <w:spacing w:after="0"/>
             </w:pPr>
           </w:p>
         </w:tc>
         <w:tc>
-          <w:tcPr/>
+          <w:tcPr>
+            <w:tcW w:w="3365" w:type="dxa"/>
+          </w:tcPr>
           <w:p>
             <w:pPr>
               <w:pStyle w:val="Compact"/>
+              <w:spacing w:after="0"/>
               <w:jc w:val="left"/>
             </w:pPr>
             <w:r>
+              <w:rPr>
+                <w:sz w:val="18"/>
+              </w:rPr>
               <w:t xml:space="preserve">TanNBSE183860@fpt.edu.vn</w:t>
             </w:r>
           </w:p>
         </w:tc>
         <w:tc>
-          <w:tcPr/>
+          <w:tcPr>
+            <w:tcW w:w="1091" w:type="dxa"/>
+          </w:tcPr>
           <w:p>
             <w:pPr>
               <w:pStyle w:val="Compact"/>
+              <w:spacing w:after="0"/>
               <w:jc w:val="left"/>
             </w:pPr>
             <w:r>
+              <w:rPr>
+                <w:sz w:val="18"/>
+              </w:rPr>
               <w:t xml:space="preserve">Member</w:t>
             </w:r>
           </w:p>
@@ -1170,69 +1535,102 @@
       </w:tr>
       <w:tr>
         <w:tc>
-          <w:tcPr/>
+          <w:tcPr>
+            <w:tcW w:w="700" w:type="dxa"/>
+          </w:tcPr>
           <w:p>
             <w:pPr>
               <w:pStyle w:val="Compact"/>
+              <w:spacing w:after="0"/>
               <w:jc w:val="left"/>
             </w:pPr>
             <w:r>
+              <w:rPr>
+                <w:sz w:val="18"/>
+              </w:rPr>
               <w:t xml:space="preserve">5</w:t>
             </w:r>
           </w:p>
         </w:tc>
         <w:tc>
-          <w:tcPr/>
+          <w:tcPr>
+            <w:tcW w:w="1738" w:type="dxa"/>
+          </w:tcPr>
           <w:p>
             <w:pPr>
               <w:pStyle w:val="Compact"/>
+              <w:spacing w:after="0"/>
               <w:jc w:val="left"/>
             </w:pPr>
             <w:r>
+              <w:rPr>
+                <w:sz w:val="18"/>
+              </w:rPr>
               <w:t xml:space="preserve">Nguyễn Ngọc Long</w:t>
             </w:r>
           </w:p>
         </w:tc>
         <w:tc>
-          <w:tcPr/>
+          <w:tcPr>
+            <w:tcW w:w="1270" w:type="dxa"/>
+          </w:tcPr>
           <w:p>
             <w:pPr>
               <w:pStyle w:val="Compact"/>
+              <w:spacing w:after="0"/>
               <w:jc w:val="left"/>
             </w:pPr>
             <w:r>
+              <w:rPr>
+                <w:sz w:val="18"/>
+              </w:rPr>
               <w:t xml:space="preserve">SE193490</w:t>
             </w:r>
           </w:p>
         </w:tc>
         <w:tc>
-          <w:tcPr/>
+          <w:tcPr>
+            <w:tcW w:w="835" w:type="dxa"/>
+          </w:tcPr>
           <w:p>
             <w:pPr>
               <w:pStyle w:val="Compact"/>
+              <w:spacing w:after="0"/>
             </w:pPr>
           </w:p>
         </w:tc>
         <w:tc>
-          <w:tcPr/>
+          <w:tcPr>
+            <w:tcW w:w="3365" w:type="dxa"/>
+          </w:tcPr>
           <w:p>
             <w:pPr>
               <w:pStyle w:val="Compact"/>
+              <w:spacing w:after="0"/>
               <w:jc w:val="left"/>
             </w:pPr>
             <w:r>
+              <w:rPr>
+                <w:sz w:val="18"/>
+              </w:rPr>
               <w:t xml:space="preserve">nguyenngoclong216@gmail.com</w:t>
             </w:r>
           </w:p>
         </w:tc>
         <w:tc>
-          <w:tcPr/>
+          <w:tcPr>
+            <w:tcW w:w="1091" w:type="dxa"/>
+          </w:tcPr>
           <w:p>
             <w:pPr>
               <w:pStyle w:val="Compact"/>
+              <w:spacing w:after="0"/>
               <w:jc w:val="left"/>
             </w:pPr>
             <w:r>
+              <w:rPr>
+                <w:sz w:val="18"/>
+              </w:rPr>
               <w:t xml:space="preserve">Member</w:t>
             </w:r>
           </w:p>
@@ -1256,7 +1654,11 @@
         <w:pStyle w:val="BodyText"/>
       </w:pPr>
       <w:r>
-        <w:t xml:space="preserve">**(*) 3.1. Capstone Project name:**</w:t>
+        <w:rPr>
+          <w:b/>
+          <w:bCs/>
+        </w:rPr>
+        <w:t xml:space="preserve">(*) 3.1. Capstone Project name:</w:t>
       </w:r>
     </w:p>
     <w:p>
@@ -1276,7 +1678,7 @@
           <w:i/>
           <w:iCs/>
         </w:rPr>
-        <w:t xml:space="preserve">TrekLink — An Integrated Off-Grid Communication and Smart Device Rental Management Platform for Trekking Agencies</w:t>
+        <w:t xml:space="preserve">TrekLink: An Integrated Off-Grid Communication and Smart Device Rental Management Platform for Trekking Agencies</w:t>
       </w:r>
     </w:p>
     <w:p>
@@ -1296,7 +1698,7 @@
           <w:i/>
           <w:iCs/>
         </w:rPr>
-        <w:t xml:space="preserve">TrekLink — Nền tảng tích hợp liên lạc ngoài vùng phủ sóng và quản lý cho thuê thiết bị thông minh cho doanh nghiệp trekking</w:t>
+        <w:t xml:space="preserve">TrekLink: Nền tảng tích hợp liên lạc ngoài vùng phủ sóng và quản lý cho thuê thiết bị thông minh cho doanh nghiệp trekking</w:t>
       </w:r>
     </w:p>
     <w:p>
@@ -1316,7 +1718,11 @@
         <w:pStyle w:val="BodyText"/>
       </w:pPr>
       <w:r>
-        <w:t xml:space="preserve">**(*) 3.2. Main proposal content (including result and product)**</w:t>
+        <w:rPr>
+          <w:b/>
+          <w:bCs/>
+        </w:rPr>
+        <w:t xml:space="preserve">(*) 3.2. Main proposal content (including result and product)</w:t>
       </w:r>
     </w:p>
     <w:p>
@@ -1336,7 +1742,24 @@
         <w:pStyle w:val="BodyText"/>
       </w:pPr>
       <w:r>
-        <w:t xml:space="preserve">Vietnam’s trekking and outdoor tourism sector has grown significantly in recent years, with major routes such as Tà Năng–Phan Dũng, Tả Liên Sơn, and Bạch Mộc Lương Tử attracting thousands of participants annually. These routes traverse mountainous and forested terrain where cellular connectivity is entirely unavailable for extended stretches, sometimes spanning multiple days. Search-and-rescue operations in these zones are routinely delayed because SOS signals cannot reach coordination staff in a structured or traceable way, and because agencies lack digital tools to monitor their groups in the field.</w:t>
+        <w:rPr>
+          <w:b/>
+          <w:bCs/>
+          <w:highlight w:val="yellow"/>
+        </w:rPr>
+        <w:t xml:space="preserve">Market context.</w:t>
+      </w:r>
+      <w:r>
+        <w:rPr>
+          <w:highlight w:val="yellow"/>
+        </w:rPr>
+        <w:t xml:space="preserve"> </w:t>
+      </w:r>
+      <w:r>
+        <w:rPr>
+          <w:highlight w:val="yellow"/>
+        </w:rPr>
+        <w:t xml:space="preserve">Trekking in Vietnam often takes place in remote mountainous areas, on routes such as Tà Năng–Phan Dũng, Tả Liên Sơn and Bạch Mộc Lương Tử, where cellular connectivity is limited or unavailable for long stretches. Many groups from different companies share the same routes on the same day.</w:t>
       </w:r>
     </w:p>
     <w:p>
@@ -1344,7 +1767,24 @@
         <w:pStyle w:val="BodyText"/>
       </w:pPr>
       <w:r>
-        <w:t xml:space="preserve">During Summer 2026, the project team developed TrekLink, an open-source LoRa mesh communication firmware for ESP32/ESP32-S3 devices. The firmware — authored by this team and based on Meshtastic — supports multi-hop mesh messaging, GPS tracking, fall detection, and automatic SOS broadcasting. It is version-controlled and serves as the inherited technical foundation for this Capstone; it will not be rebuilt.</w:t>
+        <w:rPr>
+          <w:b/>
+          <w:bCs/>
+          <w:highlight w:val="yellow"/>
+        </w:rPr>
+        <w:t xml:space="preserve">Identified gap.</w:t>
+      </w:r>
+      <w:r>
+        <w:rPr>
+          <w:highlight w:val="yellow"/>
+        </w:rPr>
+        <w:t xml:space="preserve"> </w:t>
+      </w:r>
+      <w:r>
+        <w:rPr>
+          <w:highlight w:val="yellow"/>
+        </w:rPr>
+        <w:t xml:space="preserve">Integrated platforms combining off-grid IoT communication, monitoring, device management and structured incident coordination are not yet widely adopted in Vietnam’s trekking service market.</w:t>
       </w:r>
     </w:p>
     <w:p>
@@ -1353,9 +1793,23 @@
       </w:pPr>
       <w:r>
         <w:rPr>
-          <w:highlight w:val="yellow"/>
-        </w:rPr>
-        <w:t xml:space="preserve">Although the embedded communication layer is operational, the organizations that need it in the field, trekking companies first, but also ranger units and similar groups, have no reason to build, maintain and monitor their own hardware, gateways and software. They need a provider that rents them working devices and stands behind them: a platform that manages every device as an asset across its whole life, delivers every field event even after an outage, and makes sure somebody is answerable for every SOS.</w:t>
+          <w:b/>
+          <w:bCs/>
+          <w:highlight w:val="yellow"/>
+        </w:rPr>
+        <w:t xml:space="preserve">Project opportunity.</w:t>
+      </w:r>
+      <w:r>
+        <w:rPr>
+          <w:highlight w:val="yellow"/>
+        </w:rPr>
+        <w:t xml:space="preserve"> </w:t>
+      </w:r>
+      <w:r>
+        <w:rPr>
+          <w:highlight w:val="yellow"/>
+        </w:rPr>
+        <w:t xml:space="preserve">TrekLink addresses this gap by extending its existing LoRa mesh communication technology into an integrated operational platform designed for the Vietnamese trekking environment.</w:t>
       </w:r>
     </w:p>
     <w:p>
@@ -1363,10 +1817,7 @@
         <w:pStyle w:val="BodyText"/>
       </w:pPr>
       <w:r>
-        <w:rPr>
-          <w:highlight w:val="yellow"/>
-        </w:rPr>
-        <w:t xml:space="preserve">This Capstone builds that provider platform. TrekLink owns the devices, the firmware, the Field Station software and the cloud platform, and rents devices to organizations by plan. Many organizations use one platform, each managing its own members, on-duty roster, rented devices, alerts and API keys; each keeps its own trips, customers and emergency response outside the platform.</w:t>
+        <w:t xml:space="preserve">During Summer 2026, the project team developed TrekLink, an open-source LoRa mesh communication firmware for ESP32/ESP32-S3 devices. The firmware, authored by this team and based on Meshtastic, supports multi-hop mesh messaging, GPS tracking, fall detection, and automatic SOS broadcasting. It is version-controlled and serves as the inherited technical foundation for this Capstone; it will not be rebuilt.</w:t>
       </w:r>
     </w:p>
     <w:p>
@@ -1375,6 +1826,17 @@
       </w:pPr>
       <w:r>
         <w:rPr>
+          <w:highlight w:val="yellow"/>
+        </w:rPr>
+        <w:t xml:space="preserve">TrekLink is a smart-device management platform whose customers are trekking companies; it does not manage tours. TrekLink owns the devices, the firmware, the Field Station software and the cloud platform, and rents devices to organizations by plan. Many organizations use one platform, each managing its own members, on-duty roster, rented devices, alerts and API keys; each keeps its own trips, customers and emergency response outside the platform.</w:t>
+      </w:r>
+    </w:p>
+    <w:p>
+      <w:pPr>
+        <w:pStyle w:val="BodyText"/>
+      </w:pPr>
+      <w:r>
+        <w:rPr>
           <w:b/>
           <w:bCs/>
         </w:rPr>
@@ -1395,7 +1857,10 @@
         <w:pStyle w:val="BodyText"/>
       </w:pPr>
       <w:r>
-        <w:t xml:space="preserve">The five operational gaps that drive this Capstone are:</w:t>
+        <w:rPr>
+          <w:highlight w:val="yellow"/>
+        </w:rPr>
+        <w:t xml:space="preserve">The needs this Capstone serves, per party:</w:t>
       </w:r>
     </w:p>
     <w:p>
@@ -1411,16 +1876,19 @@
           <w:bCs/>
           <w:highlight w:val="yellow"/>
         </w:rPr>
-        <w:t xml:space="preserve">No managed device supply:</w:t>
-      </w:r>
-      <w:r>
-        <w:t xml:space="preserve"> </w:t>
-      </w:r>
-      <w:r>
-        <w:rPr>
-          <w:highlight w:val="yellow"/>
-        </w:rPr>
-        <w:t xml:space="preserve">Organizations cannot rent off-grid safety devices with provisioning, monitoring and maintenance handled for them; nobody tracks each device’s custody, condition and history across renters.</w:t>
+        <w:t xml:space="preserve">Trekkers and guides:</w:t>
+      </w:r>
+      <w:r>
+        <w:rPr>
+          <w:highlight w:val="yellow"/>
+        </w:rPr>
+        <w:t xml:space="preserve"> </w:t>
+      </w:r>
+      <w:r>
+        <w:rPr>
+          <w:highlight w:val="yellow"/>
+        </w:rPr>
+        <w:t xml:space="preserve">share position and raise an alert from places a phone cannot reach.</w:t>
       </w:r>
     </w:p>
     <w:p>
@@ -1434,14 +1902,21 @@
         <w:rPr>
           <w:b/>
           <w:bCs/>
-        </w:rPr>
-        <w:t xml:space="preserve">Unreliable event delivery:</w:t>
-      </w:r>
-      <w:r>
-        <w:t xml:space="preserve"> </w:t>
-      </w:r>
-      <w:r>
-        <w:t xml:space="preserve">Field events generated during connectivity loss are silently discarded; no store-and-forward mechanism exists between the LoRa mesh and the cloud.</w:t>
+          <w:highlight w:val="yellow"/>
+        </w:rPr>
+        <w:t xml:space="preserve">Trekking companies:</w:t>
+      </w:r>
+      <w:r>
+        <w:rPr>
+          <w:highlight w:val="yellow"/>
+        </w:rPr>
+        <w:t xml:space="preserve"> </w:t>
+      </w:r>
+      <w:r>
+        <w:rPr>
+          <w:highlight w:val="yellow"/>
+        </w:rPr>
+        <w:t xml:space="preserve">see their own groups and devices, and receive alerts with a clear owner and a record, without buying or maintaining the hardware.</w:t>
       </w:r>
     </w:p>
     <w:p>
@@ -1457,16 +1932,19 @@
           <w:bCs/>
           <w:highlight w:val="yellow"/>
         </w:rPr>
-        <w:t xml:space="preserve">Nobody answerable for an SOS:</w:t>
-      </w:r>
-      <w:r>
-        <w:t xml:space="preserve"> </w:t>
-      </w:r>
-      <w:r>
-        <w:rPr>
-          <w:highlight w:val="yellow"/>
-        </w:rPr>
-        <w:t xml:space="preserve">A device-level SOS triggers no structured workflow; there is no record of who was alerted, who took responsibility and when, and no escalation when nobody responds.</w:t>
+        <w:t xml:space="preserve">Local authorities and rescue units:</w:t>
+      </w:r>
+      <w:r>
+        <w:rPr>
+          <w:highlight w:val="yellow"/>
+        </w:rPr>
+        <w:t xml:space="preserve"> </w:t>
+      </w:r>
+      <w:r>
+        <w:rPr>
+          <w:highlight w:val="yellow"/>
+        </w:rPr>
+        <w:t xml:space="preserve">receive a timely report with the last known position and the history of signals when an incident escalates.</w:t>
       </w:r>
     </w:p>
     <w:p>
@@ -1482,40 +1960,19 @@
           <w:bCs/>
           <w:highlight w:val="yellow"/>
         </w:rPr>
-        <w:t xml:space="preserve">No rental operations platform:</w:t>
-      </w:r>
-      <w:r>
-        <w:t xml:space="preserve"> </w:t>
-      </w:r>
-      <w:r>
-        <w:rPr>
-          <w:highlight w:val="yellow"/>
-        </w:rPr>
-        <w:t xml:space="preserve">Contracts, plans, handover and return, recurring payments, late, damage and loss charges are handled manually.</w:t>
-      </w:r>
-    </w:p>
-    <w:p>
-      <w:pPr>
-        <w:numPr>
-          <w:ilvl w:val="0"/>
-          <w:numId w:val="1001"/>
-        </w:numPr>
-      </w:pPr>
-      <w:r>
-        <w:rPr>
-          <w:b/>
-          <w:bCs/>
-        </w:rPr>
-        <w:t xml:space="preserve">No field visibility:</w:t>
-      </w:r>
-      <w:r>
-        <w:t xml:space="preserve"> </w:t>
-      </w:r>
-      <w:r>
-        <w:rPr>
-          <w:highlight w:val="yellow"/>
-        </w:rPr>
-        <w:t xml:space="preserve">Organizations have no live view of their own devices and alerts, on the web or inside their own systems.</w:t>
+        <w:t xml:space="preserve">TrekLink, as the provider:</w:t>
+      </w:r>
+      <w:r>
+        <w:rPr>
+          <w:highlight w:val="yellow"/>
+        </w:rPr>
+        <w:t xml:space="preserve"> </w:t>
+      </w:r>
+      <w:r>
+        <w:rPr>
+          <w:highlight w:val="yellow"/>
+        </w:rPr>
+        <w:t xml:space="preserve">track every rented device’s custody, condition and charges across many renters; deliver field events through long outages.</w:t>
       </w:r>
     </w:p>
     <w:p>
@@ -1877,10 +2334,7 @@
         <w:t xml:space="preserve">packaged as a single executable with a local web page</w:t>
       </w:r>
       <w:r>
-        <w:t xml:space="preserve"> </w:t>
-      </w:r>
-      <w:r>
-        <w:t xml:space="preserve">— async I/O for concurrent MQTT + LoRa serial communication</w:t>
+        <w:t xml:space="preserve">: async I/O for concurrent MQTT + LoRa serial communication</w:t>
       </w:r>
     </w:p>
     <w:p>
@@ -1901,7 +2355,7 @@
         <w:t xml:space="preserve"> </w:t>
       </w:r>
       <w:r>
-        <w:t xml:space="preserve">NestJS (TypeScript) — modular architecture with REST and WebSocket support</w:t>
+        <w:t xml:space="preserve">NestJS (TypeScript): modular architecture with REST and WebSocket support</w:t>
       </w:r>
     </w:p>
     <w:p>
@@ -1934,10 +2388,7 @@
         <w:t xml:space="preserve">with Prisma ORM</w:t>
       </w:r>
       <w:r>
-        <w:t xml:space="preserve"> </w:t>
-      </w:r>
-      <w:r>
-        <w:t xml:space="preserve">— ACID compliance for rental transactions and incident audit trail</w:t>
+        <w:t xml:space="preserve">: ACID compliance for rental transactions and incident audit trail</w:t>
       </w:r>
     </w:p>
     <w:p>
@@ -1958,7 +2409,7 @@
         <w:t xml:space="preserve"> </w:t>
       </w:r>
       <w:r>
-        <w:t xml:space="preserve">MQTT (Mosquitto) — QoS-based delivery between</w:t>
+        <w:t xml:space="preserve">MQTT (Mosquitto): QoS-based delivery between</w:t>
       </w:r>
       <w:r>
         <w:t xml:space="preserve"> </w:t>
@@ -1994,7 +2445,7 @@
         <w:t xml:space="preserve"> </w:t>
       </w:r>
       <w:r>
-        <w:t xml:space="preserve">Socket.io WebSocket — live dashboard updates</w:t>
+        <w:t xml:space="preserve">Socket.io WebSocket: live dashboard updates</w:t>
       </w:r>
       <w:r>
         <w:t xml:space="preserve"> </w:t>
@@ -2024,7 +2475,7 @@
         <w:t xml:space="preserve"> </w:t>
       </w:r>
       <w:r>
-        <w:t xml:space="preserve">React + TypeScript — role-based views with Leaflet.js map integration</w:t>
+        <w:t xml:space="preserve">React + TypeScript: role-based views with Leaflet.js map integration</w:t>
       </w:r>
     </w:p>
     <w:p>
@@ -2073,7 +2524,7 @@
         <w:t xml:space="preserve"> </w:t>
       </w:r>
       <w:r>
-        <w:t xml:space="preserve">Docker Compose + GitHub Actions — containerised deployment and CI/CD</w:t>
+        <w:t xml:space="preserve">Docker Compose + GitHub Actions: containerised deployment and CI/CD</w:t>
       </w:r>
     </w:p>
     <w:p>
@@ -3014,7 +3465,7 @@
           <w:b/>
           <w:bCs/>
         </w:rPr>
-        <w:t xml:space="preserve">Offline Recovery — Delivery Rate:</w:t>
+        <w:t xml:space="preserve">Offline Recovery: Delivery Rate:</w:t>
       </w:r>
       <w:r>
         <w:t xml:space="preserve"> </w:t>
@@ -3035,7 +3486,7 @@
           <w:b/>
           <w:bCs/>
         </w:rPr>
-        <w:t xml:space="preserve">Offline Recovery — Testability:</w:t>
+        <w:t xml:space="preserve">Offline Recovery: Testability:</w:t>
       </w:r>
       <w:r>
         <w:t xml:space="preserve"> </w:t>
@@ -3434,7 +3885,7 @@
         <w:t xml:space="preserve"> </w:t>
       </w:r>
       <w:r>
-        <w:t xml:space="preserve">SOS events trigger an asynchronous processing pipeline — event ingestion → idempotency check → incident creation → role-based notification → audit logging — where each stage is decoupled and independently testable.</w:t>
+        <w:t xml:space="preserve">SOS events trigger an asynchronous processing pipeline: event ingestion → idempotency check → incident creation → role-based notification → audit logging: where each stage is decoupled and independently testable.</w:t>
       </w:r>
     </w:p>
     <w:p>
@@ -3566,7 +4017,7 @@
           <w:b/>
           <w:bCs/>
         </w:rPr>
-        <w:t xml:space="preserve">Document the complete message schema — eventId structure, message types, payload format — before any gateway implementation begins.</w:t>
+        <w:t xml:space="preserve">Document the complete message schema: eventId structure, message types, payload format: before any gateway implementation begins.</w:t>
       </w:r>
     </w:p>
     <w:p>
@@ -4142,7 +4593,7 @@
           <w:b/>
           <w:bCs/>
         </w:rPr>
-        <w:t xml:space="preserve">TP1 — Requirements, Architecture &amp; Experimental Design (Weeks 1–3):</w:t>
+        <w:t xml:space="preserve">TP1: Requirements, Architecture &amp; Experimental Design (Weeks 1–3):</w:t>
       </w:r>
       <w:r>
         <w:t xml:space="preserve"> </w:t>
@@ -4163,7 +4614,7 @@
           <w:b/>
           <w:bCs/>
         </w:rPr>
-        <w:t xml:space="preserve">TP2 — Gateway Bridge &amp; Offline Synchronization (Weeks 2–6):</w:t>
+        <w:t xml:space="preserve">TP2: Gateway Bridge &amp; Offline Synchronization (Weeks 2–6):</w:t>
       </w:r>
       <w:r>
         <w:t xml:space="preserve"> </w:t>
@@ -4184,7 +4635,7 @@
           <w:b/>
           <w:bCs/>
         </w:rPr>
-        <w:t xml:space="preserve">TP3 — Core Backend &amp; Reliability Services (Weeks 3–7):</w:t>
+        <w:t xml:space="preserve">TP3: Core Backend &amp; Reliability Services (Weeks 3–7):</w:t>
       </w:r>
       <w:r>
         <w:t xml:space="preserve"> </w:t>
@@ -4205,7 +4656,7 @@
           <w:b/>
           <w:bCs/>
         </w:rPr>
-        <w:t xml:space="preserve">TP4 — Monitoring &amp; Incident Management (Weeks 5–9):</w:t>
+        <w:t xml:space="preserve">TP4: Monitoring &amp; Incident Management (Weeks 5–9):</w:t>
       </w:r>
       <w:r>
         <w:t xml:space="preserve"> </w:t>
@@ -4265,7 +4716,7 @@
           <w:b/>
           <w:bCs/>
         </w:rPr>
-        <w:t xml:space="preserve">TP5 — Business Operations (Weeks 6–10):</w:t>
+        <w:t xml:space="preserve">TP5: Business Operations (Weeks 6–10):</w:t>
       </w:r>
       <w:r>
         <w:t xml:space="preserve"> </w:t>
@@ -4292,13 +4743,13 @@
           <w:b/>
           <w:bCs/>
         </w:rPr>
-        <w:t xml:space="preserve">TP6 — Integration, Experimental Evaluation &amp; Deployment (Weeks 9–13):</w:t>
-      </w:r>
-      <w:r>
-        <w:t xml:space="preserve"> </w:t>
-      </w:r>
-      <w:r>
-        <w:t xml:space="preserve">Physical LoRa experiment execution (RQ1/RQ2 — 3–5 devices, connectivity-loss matrix, ≥ 20 trials per condition), offline/recovery experiment results, duplicate-event test results, concurrency/load test results, RQ3 SOS drill evaluation (randomized, ≥ 15 drills per condition, automatic timestamp recording), evaluation report, end-to-end integration test suite, Docker Compose deployment, GitHub Actions CI/CD pipeline, and final Capstone documentation.</w:t>
+        <w:t xml:space="preserve">TP6: Integration, Experimental Evaluation &amp; Deployment (Weeks 9–13):</w:t>
+      </w:r>
+      <w:r>
+        <w:t xml:space="preserve"> </w:t>
+      </w:r>
+      <w:r>
+        <w:t xml:space="preserve">Physical LoRa experiment execution (RQ1/RQ2: 3–5 devices, connectivity-loss matrix, ≥ 20 trials per condition), offline/recovery experiment results, duplicate-event test results, concurrency/load test results, RQ3 SOS drill evaluation (randomized, ≥ 15 drills per condition, automatic timestamp recording), evaluation report, end-to-end integration test suite, Docker Compose deployment, GitHub Actions CI/CD pipeline, and final Capstone documentation.</w:t>
       </w:r>
     </w:p>
     <w:p>
@@ -4327,7 +4778,7 @@
         <w:t xml:space="preserve"> </w:t>
       </w:r>
       <w:r>
-        <w:t xml:space="preserve">(Likelihood: Medium / Impact: High) — Simulate additional Gateway-to-Cloud load using MQTT scripts. Physical devices are required only for mesh-to-gateway experiments; simulation shall not be used to claim LoRa RF reliability.</w:t>
+        <w:t xml:space="preserve">(Likelihood: Medium / Impact: High): Simulate additional Gateway-to-Cloud load using MQTT scripts. Physical devices are required only for mesh-to-gateway experiments; simulation shall not be used to claim LoRa RF reliability.</w:t>
       </w:r>
     </w:p>
     <w:p>
@@ -4348,7 +4799,7 @@
         <w:t xml:space="preserve"> </w:t>
       </w:r>
       <w:r>
-        <w:t xml:space="preserve">(Likelihood: Medium / Impact: Medium) — Tune MQTT QoS level, reduce payload size, implement backpressure on the queue flush rate.</w:t>
+        <w:t xml:space="preserve">(Likelihood: Medium / Impact: Medium): Tune MQTT QoS level, reduce payload size, implement backpressure on the queue flush rate.</w:t>
       </w:r>
     </w:p>
     <w:p>
@@ -4369,7 +4820,7 @@
         <w:t xml:space="preserve"> </w:t>
       </w:r>
       <w:r>
-        <w:t xml:space="preserve">(Likelihood: High / Impact: Medium) — Use randomized simulation drills; independent observer triggers SOS and records timestamp; participants do not know exact trigger time in advance.</w:t>
+        <w:t xml:space="preserve">(Likelihood: High / Impact: Medium): Use randomized simulation drills; independent observer triggers SOS and records timestamp; participants do not know exact trigger time in advance.</w:t>
       </w:r>
     </w:p>
     <w:p>
@@ -4390,7 +4841,7 @@
         <w:t xml:space="preserve"> </w:t>
       </w:r>
       <w:r>
-        <w:t xml:space="preserve">(Likelihood: Medium / Impact: High) — Proof-of-concept gateway-to-backend integration completed in TP1 Week 2; does not wait for TP3.</w:t>
+        <w:t xml:space="preserve">(Likelihood: Medium / Impact: High): Proof-of-concept gateway-to-backend integration completed in TP1 Week 2; does not wait for TP3.</w:t>
       </w:r>
     </w:p>
     <w:p>
@@ -4411,7 +4862,7 @@
         <w:t xml:space="preserve"> </w:t>
       </w:r>
       <w:r>
-        <w:t xml:space="preserve">(Likelihood: Low / Impact: High) — Schema frozen and documented in TP1 before any gateway implementation begins.</w:t>
+        <w:t xml:space="preserve">(Likelihood: Low / Impact: High): Schema frozen and documented in TP1 before any gateway implementation begins.</w:t>
       </w:r>
     </w:p>
     <w:p>
@@ -4432,7 +4883,7 @@
         <w:t xml:space="preserve"> </w:t>
       </w:r>
       <w:r>
-        <w:t xml:space="preserve">(Likelihood: High / Impact: Medium) — Feature freeze after TP5 Week 10; additional features go to post-Capstone backlog.</w:t>
+        <w:t xml:space="preserve">(Likelihood: High / Impact: Medium): Feature freeze after TP5 Week 10; additional features go to post-Capstone backlog.</w:t>
       </w:r>
     </w:p>
     <w:p>
@@ -4464,22 +4915,10 @@
         <w:pStyle w:val="BodyText"/>
       </w:pPr>
       <w:r>
-        <w:t xml:space="preserve">Trekking</w:t>
-      </w:r>
-      <w:r>
-        <w:t xml:space="preserve"> </w:t>
-      </w:r>
-      <w:r>
-        <w:rPr>
-          <w:highlight w:val="yellow"/>
-        </w:rPr>
-        <w:t xml:space="preserve">companies and similar organizations</w:t>
-      </w:r>
-      <w:r>
-        <w:t xml:space="preserve"> </w:t>
-      </w:r>
-      <w:r>
-        <w:t xml:space="preserve">operating in cellular dead zones face two unsolved problems. First, field events generated during connectivity loss — including SOS alerts — are never delivered to the cloud because no persistent store-and-forward mechanism exists between the LoRa mesh and the agency backend. Second, when an SOS event does reach staff, there is no structured workflow to coordinate the response: no automatic incident record is created, no acknowledgment is tracked, and no audit trail exists.</w:t>
+        <w:rPr>
+          <w:highlight w:val="yellow"/>
+        </w:rPr>
+        <w:t xml:space="preserve">Trekking companies and similar organizations operating where cellular coverage is limited need field events, SOS alerts included, to reach their staff even after a long outage, and need each SOS handled as a coordinated incident with an owner, tracked acknowledgment and an audit trail.</w:t>
       </w:r>
     </w:p>
     <w:p>
@@ -4487,19 +4926,10 @@
         <w:pStyle w:val="BodyText"/>
       </w:pPr>
       <w:r>
-        <w:t xml:space="preserve">The existing TrekLink firmware prototype solves the field communication layer but leaves both problems unaddressed. This Capstone proposes a Gateway Bridge with priority-aware offline queuing and idempotent event processing, and an SOS-to-Incident pipeline with a formally defined lifecycle FSM</w:t>
-      </w:r>
-      <w:r>
-        <w:t xml:space="preserve"> </w:t>
-      </w:r>
-      <w:r>
-        <w:rPr>
-          <w:highlight w:val="yellow"/>
-        </w:rPr>
-        <w:t xml:space="preserve">and tiered escalation</w:t>
-      </w:r>
-      <w:r>
-        <w:t xml:space="preserve">, as the technical solutions to these two problems.</w:t>
+        <w:rPr>
+          <w:highlight w:val="yellow"/>
+        </w:rPr>
+        <w:t xml:space="preserve">The Summer 2026 TrekLink firmware provides the field communication layer. This Capstone adds a Field Station with priority-aware offline queuing and idempotent event processing, and an SOS-to-Incident pipeline with a formally defined lifecycle and tiered escalation, and evaluates both.</w:t>
       </w:r>
     </w:p>
     <w:p>
@@ -4740,10 +5170,7 @@
         <w:t xml:space="preserve">Field Station</w:t>
       </w:r>
       <w:r>
-        <w:t xml:space="preserve"> </w:t>
-      </w:r>
-      <w:r>
-        <w:t xml:space="preserve">— LoRa-to-MQTT-to-cloud synchronization with priority queue and idempotency; SOS, GPS, and selected telemetry message types; connectivity-loss/recovery experiments in a controlled lab environment; SOS-to-Incident workflow evaluation using controlled drills; organizations, asset and rental-contract modules</w:t>
+        <w:t xml:space="preserve">: LoRa-to-MQTT-to-cloud synchronization with priority queue and idempotency; SOS, GPS, and selected telemetry message types; connectivity-loss/recovery experiments in a controlled lab environment; SOS-to-Incident workflow evaluation using controlled drills; organizations, asset and rental-contract modules</w:t>
       </w:r>
       <w:r>
         <w:t xml:space="preserve"> </w:t>
@@ -4870,13 +5297,13 @@
           <w:b/>
           <w:bCs/>
         </w:rPr>
-        <w:t xml:space="preserve">Experiment 1 — Gateway Synchronization (RQ1 &amp; RQ2):</w:t>
-      </w:r>
-      <w:r>
-        <w:t xml:space="preserve"> </w:t>
-      </w:r>
-      <w:r>
-        <w:t xml:space="preserve">Use 3–5 physical TrekLink devices for all mesh-to-gateway reliability measurements. MQTT simulation scripts may supplement Gateway-to-Cloud workload evaluation only — not used to claim LoRa RF reliability. Apply connectivity-loss matrix: 0 s (control), 30 s, 2 min, 5 min, 10 min, 30 min; two reconnection patterns (immediate and delayed 60 s). Minimum 20 trials per condition. Measures: delivery rate (%), data-loss rate (%), duplicate rate (%), sync latency (mean / median / P95 in seconds), queue-recovery time (s), priority-ordering compliance rate (%).</w:t>
+        <w:t xml:space="preserve">Experiment 1: Gateway Synchronization (RQ1 &amp; RQ2):</w:t>
+      </w:r>
+      <w:r>
+        <w:t xml:space="preserve"> </w:t>
+      </w:r>
+      <w:r>
+        <w:t xml:space="preserve">Use 3–5 physical TrekLink devices for all mesh-to-gateway reliability measurements. MQTT simulation scripts may supplement Gateway-to-Cloud workload evaluation only, not used to claim LoRa RF reliability. Apply connectivity-loss matrix: 0 s (control), 30 s, 2 min, 5 min, 10 min, 30 min; two reconnection patterns (immediate and delayed 60 s). Minimum 20 trials per condition. Measures: delivery rate (%), data-loss rate (%), duplicate rate (%), sync latency (mean / median / P95 in seconds), queue-recovery time (s), priority-ordering compliance rate (%).</w:t>
       </w:r>
     </w:p>
     <w:p>
@@ -4891,7 +5318,7 @@
           <w:b/>
           <w:bCs/>
         </w:rPr>
-        <w:t xml:space="preserve">Experiment 2 — SOS-to-Incident Workflow (RQ3):</w:t>
+        <w:t xml:space="preserve">Experiment 2: SOS-to-Incident Workflow (RQ3):</w:t>
       </w:r>
       <w:r>
         <w:t xml:space="preserve"> </w:t>
@@ -5107,7 +5534,16 @@
         <w:t xml:space="preserve"> </w:t>
       </w:r>
       <w:r>
-        <w:t xml:space="preserve">(Meshtastic, RAK WisBlock Mesh): Multi-hop messaging, GPS, local SOS broadcast, fall detection. Gap: no agency-side rental workflow, no device fleet management, no persistent cloud incident pipeline, no store-and-forward to cloud.</w:t>
+        <w:t xml:space="preserve">(Meshtastic, RAK WisBlock Mesh): Multi-hop messaging, GPS, local SOS broadcast, fall detection.</w:t>
+      </w:r>
+      <w:r>
+        <w:t xml:space="preserve"> </w:t>
+      </w:r>
+      <w:r>
+        <w:rPr>
+          <w:highlight w:val="yellow"/>
+        </w:rPr>
+        <w:t xml:space="preserve">Designed to work independently of any infrastructure; TrekLink builds on it and adds the organization-side layer: device rental and fleet management, store-and-forward to the cloud, and an incident pipeline.</w:t>
       </w:r>
     </w:p>
     <w:p>
@@ -5122,13 +5558,13 @@
           <w:b/>
           <w:bCs/>
         </w:rPr>
-        <w:t xml:space="preserve">Commercial off-grid safety devices</w:t>
-      </w:r>
-      <w:r>
-        <w:t xml:space="preserve"> </w:t>
-      </w:r>
-      <w:r>
-        <w:t xml:space="preserve">(Garmin inReach Mini 2, SPOT Gen4, Zoleo): Satellite SOS, two-way messaging, GPS tracking. Gap: closed proprietary ecosystems; individual-use oriented; no fleet rental; no operational incident management.</w:t>
+        <w:t xml:space="preserve">IoT fleet management platforms</w:t>
+      </w:r>
+      <w:r>
+        <w:t xml:space="preserve"> </w:t>
+      </w:r>
+      <w:r>
+        <w:t xml:space="preserve">(AWS IoT Core, Azure IoT Hub, Balena): Device registration, telemetry ingestion, remote monitoring, lifecycle states. Gap: generic cloud platforms; no LoRa mesh integration; no store-and-forward for intermittent connectivity; no rental domain.</w:t>
       </w:r>
     </w:p>
     <w:p>
@@ -5143,13 +5579,13 @@
           <w:b/>
           <w:bCs/>
         </w:rPr>
-        <w:t xml:space="preserve">IoT fleet management platforms</w:t>
-      </w:r>
-      <w:r>
-        <w:t xml:space="preserve"> </w:t>
-      </w:r>
-      <w:r>
-        <w:t xml:space="preserve">(AWS IoT Core, Azure IoT Hub, Balena): Device registration, telemetry ingestion, remote monitoring, lifecycle states. Gap: generic cloud platforms; no LoRa mesh integration; no store-and-forward for intermittent connectivity; no rental domain.</w:t>
+        <w:t xml:space="preserve">Delay/Disruption-Tolerant and store-and-forward systems</w:t>
+      </w:r>
+      <w:r>
+        <w:t xml:space="preserve"> </w:t>
+      </w:r>
+      <w:r>
+        <w:t xml:space="preserve">(DTN RFC 4838 Bundle Protocol, MQTT-SN, LoRaWAN ADR): Message persistence and forwarding under intermittent connectivity. Gap: protocol-level designs; not integrated with business workflows or incident management.</w:t>
       </w:r>
     </w:p>
     <w:p>
@@ -5164,27 +5600,6 @@
           <w:b/>
           <w:bCs/>
         </w:rPr>
-        <w:t xml:space="preserve">Delay/Disruption-Tolerant and store-and-forward systems</w:t>
-      </w:r>
-      <w:r>
-        <w:t xml:space="preserve"> </w:t>
-      </w:r>
-      <w:r>
-        <w:t xml:space="preserve">(DTN RFC 4838 Bundle Protocol, MQTT-SN, LoRaWAN ADR): Message persistence and forwarding under intermittent connectivity. Gap: protocol-level designs; not integrated with business workflows or incident management.</w:t>
-      </w:r>
-    </w:p>
-    <w:p>
-      <w:pPr>
-        <w:numPr>
-          <w:ilvl w:val="0"/>
-          <w:numId w:val="1023"/>
-        </w:numPr>
-      </w:pPr>
-      <w:r>
-        <w:rPr>
-          <w:b/>
-          <w:bCs/>
-        </w:rPr>
         <w:t xml:space="preserve">Incident management systems</w:t>
       </w:r>
       <w:r>
@@ -5199,7 +5614,10 @@
         <w:pStyle w:val="FirstParagraph"/>
       </w:pPr>
       <w:r>
-        <w:t xml:space="preserve">Gap statement: TrekLink addresses the integration gap where all five dimensions — off-grid LoRa mesh communication, intermittent-connectivity store-and-forward synchronization, device rental lifecycle management, real-time field monitoring, and structured SOS-to-incident response — must be combined into a single domain-specific platform. Each existing solution addresses at most two of these dimensions.</w:t>
+        <w:rPr>
+          <w:highlight w:val="yellow"/>
+        </w:rPr>
+        <w:t xml:space="preserve">Gap statement: TrekLink combines five dimensions in one domain-specific platform: off-grid LoRa mesh communication, store-and-forward synchronization under intermittent connectivity, device rental lifecycle management, real-time field monitoring, and structured SOS-to-incident response.</w:t>
       </w:r>
     </w:p>
     <w:p>
@@ -5409,64 +5827,88 @@
     </w:p>
     <w:tbl>
       <w:tblPr>
-        <w:tblStyle w:val="Table"/>
-        <w:tblW w:type="pct" w:w="5000"/>
+        <w:tblStyle w:val="TableGrid"/>
+        <w:tblW w:type="dxa" w:w="9000"/>
         <w:jc w:val="left"/>
         <w:tblLayout w:type="fixed"/>
         <w:tblLook w:firstRow="1" w:lastRow="0" w:firstColumn="0" w:lastColumn="0" w:noHBand="0" w:noVBand="0" w:val="0020"/>
+        <w:tblBorders>
+          <w:top w:val="single" w:sz="4" w:space="0" w:color="000000"/>
+          <w:left w:val="single" w:sz="4" w:space="0" w:color="000000"/>
+          <w:bottom w:val="single" w:sz="4" w:space="0" w:color="000000"/>
+          <w:right w:val="single" w:sz="4" w:space="0" w:color="000000"/>
+          <w:insideH w:val="single" w:sz="4" w:space="0" w:color="000000"/>
+          <w:insideV w:val="single" w:sz="4" w:space="0" w:color="000000"/>
+        </w:tblBorders>
       </w:tblPr>
       <w:tblGrid>
-        <w:gridCol w:w="3099"/>
-        <w:gridCol w:w="4820"/>
+        <w:gridCol w:w="3719"/>
+        <w:gridCol w:w="5280"/>
       </w:tblGrid>
       <w:tr>
         <w:trPr>
           <w:tblHeader w:val="on"/>
         </w:trPr>
         <w:tc>
-          <w:tcPr/>
+          <w:tcPr>
+            <w:tcW w:w="3719" w:type="dxa"/>
+          </w:tcPr>
           <w:p>
             <w:pPr>
               <w:pStyle w:val="Compact"/>
+              <w:spacing w:after="0"/>
               <w:jc w:val="left"/>
             </w:pPr>
             <w:r>
               <w:rPr>
                 <w:b/>
                 <w:bCs/>
+                <w:sz w:val="18"/>
               </w:rPr>
               <w:t xml:space="preserve">Supervisor (If have)</w:t>
             </w:r>
             <w:r>
               <w:rPr>
+                <w:b/>
                 <w:i/>
                 <w:iCs/>
+                <w:sz w:val="18"/>
               </w:rPr>
               <w:t xml:space="preserve">(Sign and full name)</w:t>
             </w:r>
           </w:p>
         </w:tc>
         <w:tc>
-          <w:tcPr/>
+          <w:tcPr>
+            <w:tcW w:w="5280" w:type="dxa"/>
+          </w:tcPr>
           <w:p>
             <w:pPr>
               <w:pStyle w:val="Compact"/>
+              <w:spacing w:after="0"/>
               <w:jc w:val="left"/>
             </w:pPr>
             <w:r>
+              <w:rPr>
+                <w:b/>
+                <w:sz w:val="18"/>
+              </w:rPr>
               <w:t xml:space="preserve">HCM, date 25/07/2026</w:t>
             </w:r>
             <w:r>
               <w:rPr>
                 <w:b/>
                 <w:bCs/>
+                <w:sz w:val="18"/>
               </w:rPr>
               <w:t xml:space="preserve">On behalf of Registers</w:t>
             </w:r>
             <w:r>
               <w:rPr>
+                <w:b/>
                 <w:i/>
                 <w:iCs/>
+                <w:sz w:val="18"/>
               </w:rPr>
               <w:t xml:space="preserve">(Sign and full name)</w:t>
             </w:r>
@@ -7521,6 +7963,317 @@
         <w:right w:type="dxa" w:w="108.0"/>
       </w:tblCellMar>
     </w:tblPr>
+  </w:style>
+  <w:style w:styleId="BodyText" w:type="paragraph">
+    <w:name w:val="Body Text"/>
+    <w:basedOn w:val="Normal"/>
+    <w:link w:val="BodyTextChar"/>
+    <w:qFormat/>
+    <w:pPr>
+      <w:spacing w:after="180" w:before="180"/>
+    </w:pPr>
+  </w:style>
+  <w:style w:customStyle="1" w:styleId="FirstParagraph" w:type="paragraph">
+    <w:name w:val="First Paragraph"/>
+    <w:basedOn w:val="BodyText"/>
+    <w:next w:val="BodyText"/>
+    <w:qFormat/>
+  </w:style>
+  <w:style w:customStyle="1" w:styleId="Compact" w:type="paragraph">
+    <w:name w:val="Compact"/>
+    <w:basedOn w:val="BodyText"/>
+    <w:qFormat/>
+    <w:pPr>
+      <w:spacing w:after="36" w:before="36"/>
+    </w:pPr>
+  </w:style>
+  <w:style w:customStyle="1" w:styleId="Author" w:type="paragraph">
+    <w:name w:val="Author"/>
+    <w:next w:val="BodyText"/>
+    <w:qFormat/>
+    <w:pPr>
+      <w:keepNext/>
+      <w:keepLines/>
+      <w:jc w:val="center"/>
+    </w:pPr>
+  </w:style>
+  <w:style w:styleId="Date" w:type="paragraph">
+    <w:name w:val="Date"/>
+    <w:next w:val="BodyText"/>
+    <w:qFormat/>
+    <w:pPr>
+      <w:keepNext/>
+      <w:keepLines/>
+      <w:jc w:val="center"/>
+    </w:pPr>
+  </w:style>
+  <w:style w:customStyle="1" w:styleId="AbstractTitle" w:type="paragraph">
+    <w:name w:val="Abstract Title"/>
+    <w:basedOn w:val="Normal"/>
+    <w:next w:val="Abstract"/>
+    <w:qFormat/>
+    <w:pPr>
+      <w:keepNext/>
+      <w:keepLines/>
+      <w:spacing w:after="0" w:before="300"/>
+      <w:jc w:val="center"/>
+    </w:pPr>
+    <w:rPr>
+      <w:b/>
+      <w:color w:val="345A8A"/>
+      <w:sz w:val="20"/>
+      <w:szCs w:val="20"/>
+    </w:rPr>
+  </w:style>
+  <w:style w:customStyle="1" w:styleId="Abstract" w:type="paragraph">
+    <w:name w:val="Abstract"/>
+    <w:basedOn w:val="Normal"/>
+    <w:next w:val="BodyText"/>
+    <w:qFormat/>
+    <w:pPr>
+      <w:keepNext/>
+      <w:keepLines/>
+      <w:spacing w:after="300" w:before="100"/>
+    </w:pPr>
+    <w:rPr>
+      <w:sz w:val="20"/>
+      <w:szCs w:val="20"/>
+    </w:rPr>
+  </w:style>
+  <w:style w:styleId="Bibliography" w:type="paragraph">
+    <w:name w:val="Bibliography"/>
+    <w:basedOn w:val="Normal"/>
+    <w:next w:val="Bibliography"/>
+    <w:qFormat/>
+    <w:pPr/>
+    <w:rPr/>
+  </w:style>
+  <w:style w:styleId="Heading7" w:type="paragraph">
+    <w:name w:val="Heading 7"/>
+    <w:basedOn w:val="Normal"/>
+    <w:next w:val="BodyText"/>
+    <w:uiPriority w:val="9"/>
+    <w:unhideWhenUsed/>
+    <w:qFormat/>
+    <w:pPr>
+      <w:keepNext/>
+      <w:keepLines/>
+      <w:spacing w:after="0" w:before="200"/>
+      <w:outlineLvl w:val="6"/>
+    </w:pPr>
+    <w:rPr>
+      <w:rFonts w:asciiTheme="majorHAnsi" w:cstheme="majorBidi" w:eastAsiaTheme="majorEastAsia" w:hAnsiTheme="majorHAnsi"/>
+      <w:color w:themeColor="accent1" w:val="4F81BD"/>
+      <w:sz w:val="24"/>
+      <w:szCs w:val="24"/>
+    </w:rPr>
+  </w:style>
+  <w:style w:styleId="Heading8" w:type="paragraph">
+    <w:name w:val="Heading 8"/>
+    <w:basedOn w:val="Normal"/>
+    <w:next w:val="BodyText"/>
+    <w:uiPriority w:val="9"/>
+    <w:unhideWhenUsed/>
+    <w:qFormat/>
+    <w:pPr>
+      <w:keepNext/>
+      <w:keepLines/>
+      <w:spacing w:after="0" w:before="200"/>
+      <w:outlineLvl w:val="7"/>
+    </w:pPr>
+    <w:rPr>
+      <w:rFonts w:asciiTheme="majorHAnsi" w:cstheme="majorBidi" w:eastAsiaTheme="majorEastAsia" w:hAnsiTheme="majorHAnsi"/>
+      <w:color w:themeColor="accent1" w:val="4F81BD"/>
+      <w:sz w:val="24"/>
+      <w:szCs w:val="24"/>
+    </w:rPr>
+  </w:style>
+  <w:style w:styleId="Heading9" w:type="paragraph">
+    <w:name w:val="Heading 9"/>
+    <w:basedOn w:val="Normal"/>
+    <w:next w:val="BodyText"/>
+    <w:uiPriority w:val="9"/>
+    <w:unhideWhenUsed/>
+    <w:qFormat/>
+    <w:pPr>
+      <w:keepNext/>
+      <w:keepLines/>
+      <w:spacing w:after="0" w:before="200"/>
+      <w:outlineLvl w:val="8"/>
+    </w:pPr>
+    <w:rPr>
+      <w:rFonts w:asciiTheme="majorHAnsi" w:cstheme="majorBidi" w:eastAsiaTheme="majorEastAsia" w:hAnsiTheme="majorHAnsi"/>
+      <w:color w:themeColor="accent1" w:val="4F81BD"/>
+      <w:sz w:val="24"/>
+      <w:szCs w:val="24"/>
+    </w:rPr>
+  </w:style>
+  <w:style w:styleId="BlockText" w:type="paragraph">
+    <w:name w:val="Block Text"/>
+    <w:basedOn w:val="BodyText"/>
+    <w:next w:val="BodyText"/>
+    <w:uiPriority w:val="9"/>
+    <w:unhideWhenUsed/>
+    <w:qFormat/>
+    <w:pPr>
+      <w:spacing w:after="100" w:before="100"/>
+      <w:ind w:firstLine="0" w:left="480" w:right="480"/>
+    </w:pPr>
+  </w:style>
+  <w:style w:styleId="FootnoteText" w:type="paragraph">
+    <w:name w:val="Footnote Text"/>
+    <w:basedOn w:val="Normal"/>
+    <w:next w:val="FootnoteText"/>
+    <w:uiPriority w:val="9"/>
+    <w:unhideWhenUsed/>
+    <w:qFormat/>
+  </w:style>
+  <w:style w:styleId="FootnoteBlockText" w:type="paragraph">
+    <w:name w:val="Footnote Block Text"/>
+    <w:basedOn w:val="Footnote Text"/>
+    <w:next w:val="Footnote Text"/>
+    <w:uiPriority w:val="9"/>
+    <w:unhideWhenUsed/>
+    <w:qFormat/>
+    <w:pPr>
+      <w:spacing w:after="100" w:before="100"/>
+      <w:ind w:firstLine="0" w:left="480" w:right="480"/>
+    </w:pPr>
+  </w:style>
+  <w:style w:default="1" w:styleId="DefaultParagraphFont" w:type="character">
+    <w:name w:val="Default Paragraph Font"/>
+    <w:semiHidden/>
+    <w:unhideWhenUsed/>
+  </w:style>
+  <w:style w:default="1" w:styleId="Table" w:type="table">
+    <w:name w:val="Table"/>
+    <w:basedOn w:val="TableNormal"/>
+    <w:semiHidden/>
+    <w:unhideWhenUsed/>
+    <w:qFormat/>
+    <w:tblPr>
+      <w:tblInd w:type="dxa" w:w="0"/>
+      <w:tblCellMar>
+        <w:top w:type="dxa" w:w="0"/>
+        <w:left w:type="dxa" w:w="108"/>
+        <w:bottom w:type="dxa" w:w="0"/>
+        <w:right w:type="dxa" w:w="108"/>
+      </w:tblCellMar>
+    </w:tblPr>
+    <w:tblStylePr w:type="firstRow">
+      <w:tblPr>
+        <w:jc w:val="left"/>
+        <w:tblInd w:type="dxa" w:w="0"/>
+      </w:tblPr>
+      <w:trPr>
+        <w:jc w:val="left"/>
+      </w:trPr>
+      <w:tcPr>
+        <w:tcBorders>
+          <w:bottom w:val="single"/>
+        </w:tcBorders>
+        <w:vAlign w:val="bottom"/>
+      </w:tcPr>
+    </w:tblStylePr>
+  </w:style>
+  <w:style w:customStyle="1" w:styleId="DefinitionTerm" w:type="paragraph">
+    <w:name w:val="Definition Term"/>
+    <w:basedOn w:val="Normal"/>
+    <w:next w:val="Definition"/>
+    <w:pPr>
+      <w:keepNext/>
+      <w:keepLines/>
+      <w:spacing w:after="0"/>
+    </w:pPr>
+    <w:rPr>
+      <w:b/>
+    </w:rPr>
+  </w:style>
+  <w:style w:customStyle="1" w:styleId="Definition" w:type="paragraph">
+    <w:name w:val="Definition"/>
+    <w:basedOn w:val="Normal"/>
+  </w:style>
+  <w:style w:styleId="Caption" w:type="paragraph">
+    <w:name w:val="Caption"/>
+    <w:basedOn w:val="Normal"/>
+    <w:link w:val="BodyTextChar"/>
+    <w:pPr>
+      <w:spacing w:after="120" w:before="0"/>
+    </w:pPr>
+    <w:rPr>
+      <w:i/>
+    </w:rPr>
+  </w:style>
+  <w:style w:customStyle="1" w:styleId="TableCaption" w:type="paragraph">
+    <w:name w:val="Table Caption"/>
+    <w:basedOn w:val="Caption"/>
+    <w:pPr>
+      <w:keepNext/>
+    </w:pPr>
+  </w:style>
+  <w:style w:customStyle="1" w:styleId="ImageCaption" w:type="paragraph">
+    <w:name w:val="Image Caption"/>
+    <w:basedOn w:val="Caption"/>
+  </w:style>
+  <w:style w:customStyle="1" w:styleId="Figure" w:type="paragraph">
+    <w:name w:val="Figure"/>
+    <w:basedOn w:val="Normal"/>
+  </w:style>
+  <w:style w:customStyle="1" w:styleId="CaptionedFigure" w:type="paragraph">
+    <w:name w:val="Captioned Figure"/>
+    <w:basedOn w:val="Figure"/>
+    <w:pPr>
+      <w:keepNext/>
+    </w:pPr>
+  </w:style>
+  <w:style w:customStyle="1" w:styleId="BodyTextChar" w:type="character">
+    <w:name w:val="Body Text Char"/>
+    <w:basedOn w:val="DefaultParagraphFont"/>
+    <w:link w:val="BodyText"/>
+  </w:style>
+  <w:style w:customStyle="1" w:styleId="VerbatimChar" w:type="character">
+    <w:name w:val="Verbatim Char"/>
+    <w:basedOn w:val="BodyTextChar"/>
+    <w:rPr>
+      <w:rFonts w:ascii="Consolas" w:hAnsi="Consolas"/>
+      <w:sz w:val="22"/>
+    </w:rPr>
+  </w:style>
+  <w:style w:customStyle="1" w:styleId="SectionNumber" w:type="character">
+    <w:name w:val="Section Number"/>
+    <w:basedOn w:val="BodyTextChar"/>
+  </w:style>
+  <w:style w:styleId="FootnoteReference" w:type="character">
+    <w:name w:val="Footnote Reference"/>
+    <w:basedOn w:val="BodyTextChar"/>
+    <w:rPr>
+      <w:vertAlign w:val="superscript"/>
+    </w:rPr>
+  </w:style>
+  <w:style w:styleId="Hyperlink" w:type="character">
+    <w:name w:val="Hyperlink"/>
+    <w:basedOn w:val="BodyTextChar"/>
+    <w:rPr>
+      <w:color w:themeColor="accent1" w:val="4F81BD"/>
+    </w:rPr>
+  </w:style>
+  <w:style w:styleId="TOCHeading" w:type="paragraph">
+    <w:name w:val="TOC Heading"/>
+    <w:basedOn w:val="Heading1"/>
+    <w:next w:val="BodyText"/>
+    <w:uiPriority w:val="39"/>
+    <w:unhideWhenUsed/>
+    <w:qFormat/>
+    <w:pPr>
+      <w:spacing w:before="240" w:line="259" w:lineRule="auto"/>
+      <w:outlineLvl w:val="9"/>
+    </w:pPr>
+    <w:rPr>
+      <w:rFonts w:asciiTheme="majorHAnsi" w:cstheme="majorBidi" w:eastAsiaTheme="majorEastAsia" w:hAnsiTheme="majorHAnsi"/>
+      <w:b w:val="0"/>
+      <w:bCs w:val="0"/>
+      <w:color w:themeColor="accent1" w:themeShade="BF" w:val="365F91"/>
+    </w:rPr>
   </w:style>
   <w:style w:type="paragraph" w:customStyle="1" w:styleId="SourceCode">
     <w:name w:val="Source Code"/>

</xml_diff>

<commit_message>
docs: ship the adjusted form as clean and highlighted copies
Follow the original registration form layout: drop the cover note and
the Section 4 Review 1 sentence. The build now writes two .docx files,
a clean copy with no highlights and a highlighted copy that marks every
change for the supervisor.

Co-Authored-By: Claude Opus 5.5 <noreply@anthropic.com>
</commit_message>
<xml_diff>
--- a/topics/docx/Phieu_FA26SE159_adjusted_2026-10.docx
+++ b/topics/docx/Phieu_FA26SE159_adjusted_2026-10.docx
@@ -51,429 +51,7 @@
     </w:p>
     <w:p>
       <w:pPr>
-        <w:pStyle w:val="BlockText"/>
-      </w:pPr>
-      <w:r>
-        <w:rPr>
-          <w:b/>
-          <w:bCs/>
-        </w:rPr>
-        <w:t xml:space="preserve">Adjusted registration form, October 2026.</w:t>
-      </w:r>
-      <w:r>
-        <w:t xml:space="preserve"> </w:t>
-      </w:r>
-      <w:r>
-        <w:t xml:space="preserve">Every new or changed passage is</w:t>
-      </w:r>
-      <w:r>
-        <w:t xml:space="preserve"> </w:t>
-      </w:r>
-      <w:r>
-        <w:rPr>
-          <w:highlight w:val="yellow"/>
-        </w:rPr>
-        <w:t xml:space="preserve">highlighted</w:t>
-      </w:r>
-      <w:r>
-        <w:t xml:space="preserve">.</w:t>
-      </w:r>
-      <w:r>
-        <w:t xml:space="preserve"> </w:t>
-      </w:r>
-      <w:r>
-        <w:t xml:space="preserve">Prepared after Review 1 (2026-10-01) on the supervisor’s instruction of 2026-10-02 that the title</w:t>
-      </w:r>
-      <w:r>
-        <w:t xml:space="preserve"> </w:t>
-      </w:r>
-      <w:r>
-        <w:t xml:space="preserve">stays and the form may be adjusted one last time. Decisions behind it: D-033 to D-035 in</w:t>
-      </w:r>
-      <w:r>
-        <w:t xml:space="preserve"> </w:t>
-      </w:r>
-      <w:r>
-        <w:rPr>
-          <w:rStyle w:val="VerbatimChar"/>
-        </w:rPr>
-        <w:t xml:space="preserve">_docs/00-project-context/03-decisions-and-risk-register.md</w:t>
-      </w:r>
-      <w:r>
-        <w:t xml:space="preserve">.</w:t>
-      </w:r>
-    </w:p>
-    <w:tbl>
-      <w:tblPr>
-        <w:tblStyle w:val="TableGrid"/>
-        <w:tblW w:type="dxa" w:w="9000"/>
-        <w:jc w:val="left"/>
-        <w:tblLayout w:type="fixed"/>
-        <w:tblLook w:firstRow="1" w:lastRow="0" w:firstColumn="0" w:lastColumn="0" w:noHBand="0" w:noVBand="0" w:val="0020"/>
-        <w:tblBorders>
-          <w:top w:val="single" w:sz="4" w:space="0" w:color="000000"/>
-          <w:left w:val="single" w:sz="4" w:space="0" w:color="000000"/>
-          <w:bottom w:val="single" w:sz="4" w:space="0" w:color="000000"/>
-          <w:right w:val="single" w:sz="4" w:space="0" w:color="000000"/>
-          <w:insideH w:val="single" w:sz="4" w:space="0" w:color="000000"/>
-          <w:insideV w:val="single" w:sz="4" w:space="0" w:color="000000"/>
-        </w:tblBorders>
-      </w:tblPr>
-      <w:tblGrid>
-        <w:gridCol w:w="1065"/>
-        <w:gridCol w:w="7935"/>
-      </w:tblGrid>
-      <w:tr>
-        <w:trPr>
-          <w:tblHeader w:val="on"/>
-        </w:trPr>
-        <w:tc>
-          <w:tcPr>
-            <w:tcW w:w="1065" w:type="dxa"/>
-          </w:tcPr>
-          <w:p>
-            <w:pPr>
-              <w:pStyle w:val="Compact"/>
-              <w:spacing w:after="0"/>
-              <w:jc w:val="left"/>
-            </w:pPr>
-            <w:r>
-              <w:rPr>
-                <w:b/>
-                <w:sz w:val="18"/>
-              </w:rPr>
-              <w:t xml:space="preserve">Section</w:t>
-            </w:r>
-          </w:p>
-        </w:tc>
-        <w:tc>
-          <w:tcPr>
-            <w:tcW w:w="7935" w:type="dxa"/>
-          </w:tcPr>
-          <w:p>
-            <w:pPr>
-              <w:pStyle w:val="Compact"/>
-              <w:spacing w:after="0"/>
-              <w:jc w:val="left"/>
-            </w:pPr>
-            <w:r>
-              <w:rPr>
-                <w:b/>
-                <w:sz w:val="18"/>
-              </w:rPr>
-              <w:t xml:space="preserve">Change</w:t>
-            </w:r>
-          </w:p>
-        </w:tc>
-      </w:tr>
-      <w:tr>
-        <w:tc>
-          <w:tcPr>
-            <w:tcW w:w="1065" w:type="dxa"/>
-          </w:tcPr>
-          <w:p>
-            <w:pPr>
-              <w:pStyle w:val="Compact"/>
-              <w:spacing w:after="0"/>
-              <w:jc w:val="left"/>
-            </w:pPr>
-            <w:r>
-              <w:rPr>
-                <w:sz w:val="18"/>
-              </w:rPr>
-              <w:t xml:space="preserve">1</w:t>
-            </w:r>
-          </w:p>
-        </w:tc>
-        <w:tc>
-          <w:tcPr>
-            <w:tcW w:w="7935" w:type="dxa"/>
-          </w:tcPr>
-          <w:p>
-            <w:pPr>
-              <w:pStyle w:val="Compact"/>
-              <w:spacing w:after="0"/>
-              <w:jc w:val="left"/>
-            </w:pPr>
-            <w:r>
-              <w:rPr>
-                <w:sz w:val="18"/>
-              </w:rPr>
-              <w:t xml:space="preserve">Co-supervisor added, as listed in the Review 1 minutes</w:t>
-            </w:r>
-          </w:p>
-        </w:tc>
-      </w:tr>
-      <w:tr>
-        <w:tc>
-          <w:tcPr>
-            <w:tcW w:w="1065" w:type="dxa"/>
-          </w:tcPr>
-          <w:p>
-            <w:pPr>
-              <w:pStyle w:val="Compact"/>
-              <w:spacing w:after="0"/>
-              <w:jc w:val="left"/>
-            </w:pPr>
-            <w:r>
-              <w:rPr>
-                <w:sz w:val="18"/>
-              </w:rPr>
-              <w:t xml:space="preserve">3.2 a</w:t>
-            </w:r>
-          </w:p>
-        </w:tc>
-        <w:tc>
-          <w:tcPr>
-            <w:tcW w:w="7935" w:type="dxa"/>
-          </w:tcPr>
-          <w:p>
-            <w:pPr>
-              <w:pStyle w:val="Compact"/>
-              <w:spacing w:after="0"/>
-              <w:jc w:val="left"/>
-            </w:pPr>
-            <w:r>
-              <w:rPr>
-                <w:sz w:val="18"/>
-              </w:rPr>
-              <w:t xml:space="preserve">Context rewritten as market context, identified gap and project opportunity, as in the Review 1 minutes; needs listed per party; scope boundary credits targeted firmware work</w:t>
-            </w:r>
-          </w:p>
-        </w:tc>
-      </w:tr>
-      <w:tr>
-        <w:tc>
-          <w:tcPr>
-            <w:tcW w:w="1065" w:type="dxa"/>
-          </w:tcPr>
-          <w:p>
-            <w:pPr>
-              <w:pStyle w:val="Compact"/>
-              <w:spacing w:after="0"/>
-              <w:jc w:val="left"/>
-            </w:pPr>
-            <w:r>
-              <w:rPr>
-                <w:sz w:val="18"/>
-              </w:rPr>
-              <w:t xml:space="preserve">3.2 b</w:t>
-            </w:r>
-          </w:p>
-        </w:tc>
-        <w:tc>
-          <w:tcPr>
-            <w:tcW w:w="7935" w:type="dxa"/>
-          </w:tcPr>
-          <w:p>
-            <w:pPr>
-              <w:pStyle w:val="Compact"/>
-              <w:spacing w:after="0"/>
-              <w:jc w:val="left"/>
-            </w:pPr>
-            <w:r>
-              <w:rPr>
-                <w:sz w:val="18"/>
-              </w:rPr>
-              <w:t xml:space="preserve">Solutions rewritten: organization and rental management, asset management, Field Station, tiered alerts, organization API; eventId formula corrected; Prisma and SePay added</w:t>
-            </w:r>
-          </w:p>
-        </w:tc>
-      </w:tr>
-      <w:tr>
-        <w:tc>
-          <w:tcPr>
-            <w:tcW w:w="1065" w:type="dxa"/>
-          </w:tcPr>
-          <w:p>
-            <w:pPr>
-              <w:pStyle w:val="Compact"/>
-              <w:spacing w:after="0"/>
-              <w:jc w:val="left"/>
-            </w:pPr>
-            <w:r>
-              <w:rPr>
-                <w:sz w:val="18"/>
-              </w:rPr>
-              <w:t xml:space="preserve">3.2 c</w:t>
-            </w:r>
-          </w:p>
-        </w:tc>
-        <w:tc>
-          <w:tcPr>
-            <w:tcW w:w="7935" w:type="dxa"/>
-          </w:tcPr>
-          <w:p>
-            <w:pPr>
-              <w:pStyle w:val="Compact"/>
-              <w:spacing w:after="0"/>
-              <w:jc w:val="left"/>
-            </w:pPr>
-            <w:r>
-              <w:rPr>
-                <w:sz w:val="18"/>
-              </w:rPr>
-              <w:t xml:space="preserve">Actors replaced: TrekLink Admin and Staff, Organization Manager and Operator, Organization System; Customer, Guide, bookings, trips and trek packages removed</w:t>
-            </w:r>
-          </w:p>
-        </w:tc>
-      </w:tr>
-      <w:tr>
-        <w:tc>
-          <w:tcPr>
-            <w:tcW w:w="1065" w:type="dxa"/>
-          </w:tcPr>
-          <w:p>
-            <w:pPr>
-              <w:pStyle w:val="Compact"/>
-              <w:spacing w:after="0"/>
-              <w:jc w:val="left"/>
-            </w:pPr>
-            <w:r>
-              <w:rPr>
-                <w:sz w:val="18"/>
-              </w:rPr>
-              <w:t xml:space="preserve">3.2 d</w:t>
-            </w:r>
-          </w:p>
-        </w:tc>
-        <w:tc>
-          <w:tcPr>
-            <w:tcW w:w="7935" w:type="dxa"/>
-          </w:tcPr>
-          <w:p>
-            <w:pPr>
-              <w:pStyle w:val="Compact"/>
-              <w:spacing w:after="0"/>
-              <w:jc w:val="left"/>
-            </w:pPr>
-            <w:r>
-              <w:rPr>
-                <w:sz w:val="18"/>
-              </w:rPr>
-              <w:t xml:space="preserve">Tenant isolation added to security; scalability stated per organization</w:t>
-            </w:r>
-          </w:p>
-        </w:tc>
-      </w:tr>
-      <w:tr>
-        <w:tc>
-          <w:tcPr>
-            <w:tcW w:w="1065" w:type="dxa"/>
-          </w:tcPr>
-          <w:p>
-            <w:pPr>
-              <w:pStyle w:val="Compact"/>
-              <w:spacing w:after="0"/>
-              <w:jc w:val="left"/>
-            </w:pPr>
-            <w:r>
-              <w:rPr>
-                <w:sz w:val="18"/>
-              </w:rPr>
-              <w:t xml:space="preserve">3.2 e to g</w:t>
-            </w:r>
-          </w:p>
-        </w:tc>
-        <w:tc>
-          <w:tcPr>
-            <w:tcW w:w="7935" w:type="dxa"/>
-          </w:tcPr>
-          <w:p>
-            <w:pPr>
-              <w:pStyle w:val="Compact"/>
-              <w:spacing w:after="0"/>
-              <w:jc w:val="left"/>
-            </w:pPr>
-            <w:r>
-              <w:rPr>
-                <w:sz w:val="18"/>
-              </w:rPr>
-              <w:t xml:space="preserve">State machines, RBAC, modules, products and task packages aligned</w:t>
-            </w:r>
-          </w:p>
-        </w:tc>
-      </w:tr>
-      <w:tr>
-        <w:tc>
-          <w:tcPr>
-            <w:tcW w:w="1065" w:type="dxa"/>
-          </w:tcPr>
-          <w:p>
-            <w:pPr>
-              <w:pStyle w:val="Compact"/>
-              <w:spacing w:after="0"/>
-              <w:jc w:val="left"/>
-            </w:pPr>
-            <w:r>
-              <w:rPr>
-                <w:sz w:val="18"/>
-              </w:rPr>
-              <w:t xml:space="preserve">3.3</w:t>
-            </w:r>
-          </w:p>
-        </w:tc>
-        <w:tc>
-          <w:tcPr>
-            <w:tcW w:w="7935" w:type="dxa"/>
-          </w:tcPr>
-          <w:p>
-            <w:pPr>
-              <w:pStyle w:val="Compact"/>
-              <w:spacing w:after="0"/>
-              <w:jc w:val="left"/>
-            </w:pPr>
-            <w:r>
-              <w:rPr>
-                <w:sz w:val="18"/>
-              </w:rPr>
-              <w:t xml:space="preserve">Research problem reworded; RQ1 to RQ3 unchanged in substance; satellite messengers removed from related works, as the panel asked for comparison within Vietnam only</w:t>
-            </w:r>
-          </w:p>
-        </w:tc>
-      </w:tr>
-      <w:tr>
-        <w:tc>
-          <w:tcPr>
-            <w:tcW w:w="1065" w:type="dxa"/>
-          </w:tcPr>
-          <w:p>
-            <w:pPr>
-              <w:pStyle w:val="Compact"/>
-              <w:spacing w:after="0"/>
-              <w:jc w:val="left"/>
-            </w:pPr>
-            <w:r>
-              <w:rPr>
-                <w:sz w:val="18"/>
-              </w:rPr>
-              <w:t xml:space="preserve">4</w:t>
-            </w:r>
-          </w:p>
-        </w:tc>
-        <w:tc>
-          <w:tcPr>
-            <w:tcW w:w="7935" w:type="dxa"/>
-          </w:tcPr>
-          <w:p>
-            <w:pPr>
-              <w:pStyle w:val="Compact"/>
-              <w:spacing w:after="0"/>
-              <w:jc w:val="left"/>
-            </w:pPr>
-            <w:r>
-              <w:rPr>
-                <w:sz w:val="18"/>
-              </w:rPr>
-              <w:t xml:space="preserve">Firmware and hardware credit; reason for the adjustment</w:t>
-            </w:r>
-          </w:p>
-        </w:tc>
-      </w:tr>
-    </w:tbl>
-    <w:p>
-      <w:pPr>
-        <w:pStyle w:val="FirstParagraph"/>
+        <w:pStyle w:val="BodyText"/>
       </w:pPr>
       <w:r>
         <w:rPr>
@@ -892,7 +470,6 @@
             <w:r>
               <w:rPr>
                 <w:sz w:val="18"/>
-                <w:highlight w:val="yellow"/>
               </w:rPr>
               <w:t xml:space="preserve">Co-supervisor</w:t>
             </w:r>
@@ -911,7 +488,6 @@
             <w:r>
               <w:rPr>
                 <w:sz w:val="18"/>
-                <w:highlight w:val="yellow"/>
               </w:rPr>
               <w:t xml:space="preserve">Bùi Văn Phúc</w:t>
             </w:r>
@@ -952,7 +528,6 @@
             <w:r>
               <w:rPr>
                 <w:sz w:val="18"/>
-                <w:highlight w:val="yellow"/>
               </w:rPr>
               <w:t xml:space="preserve">Giảng viên</w:t>
             </w:r>
@@ -1745,20 +1320,13 @@
         <w:rPr>
           <w:b/>
           <w:bCs/>
-          <w:highlight w:val="yellow"/>
         </w:rPr>
         <w:t xml:space="preserve">Market context.</w:t>
       </w:r>
       <w:r>
-        <w:rPr>
-          <w:highlight w:val="yellow"/>
-        </w:rPr>
-        <w:t xml:space="preserve"> </w:t>
-      </w:r>
-      <w:r>
-        <w:rPr>
-          <w:highlight w:val="yellow"/>
-        </w:rPr>
+        <w:t xml:space="preserve"> </w:t>
+      </w:r>
+      <w:r>
         <w:t xml:space="preserve">Trekking in Vietnam often takes place in remote mountainous areas, on routes such as Tà Năng–Phan Dũng, Tả Liên Sơn and Bạch Mộc Lương Tử, where cellular connectivity is limited or unavailable for long stretches. Many groups from different companies share the same routes on the same day.</w:t>
       </w:r>
     </w:p>
@@ -1770,20 +1338,13 @@
         <w:rPr>
           <w:b/>
           <w:bCs/>
-          <w:highlight w:val="yellow"/>
         </w:rPr>
         <w:t xml:space="preserve">Identified gap.</w:t>
       </w:r>
       <w:r>
-        <w:rPr>
-          <w:highlight w:val="yellow"/>
-        </w:rPr>
-        <w:t xml:space="preserve"> </w:t>
-      </w:r>
-      <w:r>
-        <w:rPr>
-          <w:highlight w:val="yellow"/>
-        </w:rPr>
+        <w:t xml:space="preserve"> </w:t>
+      </w:r>
+      <w:r>
         <w:t xml:space="preserve">Integrated platforms combining off-grid IoT communication, monitoring, device management and structured incident coordination are not yet widely adopted in Vietnam’s trekking service market.</w:t>
       </w:r>
     </w:p>
@@ -1795,20 +1356,13 @@
         <w:rPr>
           <w:b/>
           <w:bCs/>
-          <w:highlight w:val="yellow"/>
         </w:rPr>
         <w:t xml:space="preserve">Project opportunity.</w:t>
       </w:r>
       <w:r>
-        <w:rPr>
-          <w:highlight w:val="yellow"/>
-        </w:rPr>
-        <w:t xml:space="preserve"> </w:t>
-      </w:r>
-      <w:r>
-        <w:rPr>
-          <w:highlight w:val="yellow"/>
-        </w:rPr>
+        <w:t xml:space="preserve"> </w:t>
+      </w:r>
+      <w:r>
         <w:t xml:space="preserve">TrekLink addresses this gap by extending its existing LoRa mesh communication technology into an integrated operational platform designed for the Vietnamese trekking environment.</w:t>
       </w:r>
     </w:p>
@@ -1825,9 +1379,6 @@
         <w:pStyle w:val="BodyText"/>
       </w:pPr>
       <w:r>
-        <w:rPr>
-          <w:highlight w:val="yellow"/>
-        </w:rPr>
         <w:t xml:space="preserve">TrekLink is a smart-device management platform whose customers are trekking companies; it does not manage tours. TrekLink owns the devices, the firmware, the Field Station software and the cloud platform, and rents devices to organizations by plan. Many organizations use one platform, each managing its own members, on-duty roster, rented devices, alerts and API keys; each keeps its own trips, customers and emergency response outside the platform.</w:t>
       </w:r>
     </w:p>
@@ -1846,9 +1397,6 @@
         <w:t xml:space="preserve"> </w:t>
       </w:r>
       <w:r>
-        <w:rPr>
-          <w:highlight w:val="yellow"/>
-        </w:rPr>
         <w:t xml:space="preserve">The LoRa mesh firmware and the hardware built by this team in Summer 2026 are the technical foundation. Targeted firmware enhancements made during the Capstone (the durable on-device queue, SOS beaconing fixes, radio power compliance) are in scope and credited; rearchitecting the mesh stack is not. The Capstone covers the Field Station (gateway bridge), offline-resilient synchronization, the cloud backend, organization and asset management, rental contracts, incident management with tiered alerts, live telemetry with an organization API, billing, system integration, and experimental evaluation.</w:t>
       </w:r>
     </w:p>
@@ -1857,9 +1405,6 @@
         <w:pStyle w:val="BodyText"/>
       </w:pPr>
       <w:r>
-        <w:rPr>
-          <w:highlight w:val="yellow"/>
-        </w:rPr>
         <w:t xml:space="preserve">The needs this Capstone serves, per party:</w:t>
       </w:r>
     </w:p>
@@ -1874,20 +1419,13 @@
         <w:rPr>
           <w:b/>
           <w:bCs/>
-          <w:highlight w:val="yellow"/>
         </w:rPr>
         <w:t xml:space="preserve">Trekkers and guides:</w:t>
       </w:r>
       <w:r>
-        <w:rPr>
-          <w:highlight w:val="yellow"/>
-        </w:rPr>
-        <w:t xml:space="preserve"> </w:t>
-      </w:r>
-      <w:r>
-        <w:rPr>
-          <w:highlight w:val="yellow"/>
-        </w:rPr>
+        <w:t xml:space="preserve"> </w:t>
+      </w:r>
+      <w:r>
         <w:t xml:space="preserve">share position and raise an alert from places a phone cannot reach.</w:t>
       </w:r>
     </w:p>
@@ -1902,20 +1440,13 @@
         <w:rPr>
           <w:b/>
           <w:bCs/>
-          <w:highlight w:val="yellow"/>
         </w:rPr>
         <w:t xml:space="preserve">Trekking companies:</w:t>
       </w:r>
       <w:r>
-        <w:rPr>
-          <w:highlight w:val="yellow"/>
-        </w:rPr>
-        <w:t xml:space="preserve"> </w:t>
-      </w:r>
-      <w:r>
-        <w:rPr>
-          <w:highlight w:val="yellow"/>
-        </w:rPr>
+        <w:t xml:space="preserve"> </w:t>
+      </w:r>
+      <w:r>
         <w:t xml:space="preserve">see their own groups and devices, and receive alerts with a clear owner and a record, without buying or maintaining the hardware.</w:t>
       </w:r>
     </w:p>
@@ -1930,20 +1461,13 @@
         <w:rPr>
           <w:b/>
           <w:bCs/>
-          <w:highlight w:val="yellow"/>
         </w:rPr>
         <w:t xml:space="preserve">Local authorities and rescue units:</w:t>
       </w:r>
       <w:r>
-        <w:rPr>
-          <w:highlight w:val="yellow"/>
-        </w:rPr>
-        <w:t xml:space="preserve"> </w:t>
-      </w:r>
-      <w:r>
-        <w:rPr>
-          <w:highlight w:val="yellow"/>
-        </w:rPr>
+        <w:t xml:space="preserve"> </w:t>
+      </w:r>
+      <w:r>
         <w:t xml:space="preserve">receive a timely report with the last known position and the history of signals when an incident escalates.</w:t>
       </w:r>
     </w:p>
@@ -1958,20 +1482,13 @@
         <w:rPr>
           <w:b/>
           <w:bCs/>
-          <w:highlight w:val="yellow"/>
         </w:rPr>
         <w:t xml:space="preserve">TrekLink, as the provider:</w:t>
       </w:r>
       <w:r>
-        <w:rPr>
-          <w:highlight w:val="yellow"/>
-        </w:rPr>
-        <w:t xml:space="preserve"> </w:t>
-      </w:r>
-      <w:r>
-        <w:rPr>
-          <w:highlight w:val="yellow"/>
-        </w:rPr>
+        <w:t xml:space="preserve"> </w:t>
+      </w:r>
+      <w:r>
         <w:t xml:space="preserve">track every rented device’s custody, condition and charges across many renters; deliver field events through long outages.</w:t>
       </w:r>
     </w:p>
@@ -1992,37 +1509,7 @@
         <w:pStyle w:val="BodyText"/>
       </w:pPr>
       <w:r>
-        <w:t xml:space="preserve">TrekLink extends the existing LoRa mesh firmware into</w:t>
-      </w:r>
-      <w:r>
-        <w:t xml:space="preserve"> </w:t>
-      </w:r>
-      <w:r>
-        <w:rPr>
-          <w:highlight w:val="yellow"/>
-        </w:rPr>
-        <w:t xml:space="preserve">an enterprise device-rental platform built on asset management</w:t>
-      </w:r>
-      <w:r>
-        <w:t xml:space="preserve"> </w:t>
-      </w:r>
-      <w:r>
-        <w:t xml:space="preserve">through</w:t>
-      </w:r>
-      <w:r>
-        <w:t xml:space="preserve"> </w:t>
-      </w:r>
-      <w:r>
-        <w:rPr>
-          <w:highlight w:val="yellow"/>
-        </w:rPr>
-        <w:t xml:space="preserve">six</w:t>
-      </w:r>
-      <w:r>
-        <w:t xml:space="preserve"> </w:t>
-      </w:r>
-      <w:r>
-        <w:t xml:space="preserve">core capabilities:</w:t>
+        <w:t xml:space="preserve">TrekLink extends the existing LoRa mesh firmware into an enterprise device-rental platform built on asset management through six core capabilities:</w:t>
       </w:r>
     </w:p>
     <w:p>
@@ -2036,7 +1523,6 @@
         <w:rPr>
           <w:b/>
           <w:bCs/>
-          <w:highlight w:val="yellow"/>
         </w:rPr>
         <w:t xml:space="preserve">Organization and rental management:</w:t>
       </w:r>
@@ -2044,9 +1530,6 @@
         <w:t xml:space="preserve"> </w:t>
       </w:r>
       <w:r>
-        <w:rPr>
-          <w:highlight w:val="yellow"/>
-        </w:rPr>
         <w:t xml:space="preserve">Organizations self-register and are verified and approved by TrekLink. They rent devices by monthly plan (half the term fee at the start as a holding fee, half at the end, renewing until notice) or by day plan (3, 4 or 7 days, paid in full at handover, priced above the monthly rate per day), with a minimum order quantity. Handover and return happen in person at the TrekLink counter with a signed handover note; payments are recorded, online through the SePay gateway (VietQR, sandbox) or at the counter.</w:t>
       </w:r>
     </w:p>
@@ -2061,7 +1544,6 @@
         <w:rPr>
           <w:b/>
           <w:bCs/>
-          <w:highlight w:val="yellow"/>
         </w:rPr>
         <w:t xml:space="preserve">Asset management:</w:t>
       </w:r>
@@ -2069,9 +1551,6 @@
         <w:t xml:space="preserve"> </w:t>
       </w:r>
       <w:r>
-        <w:rPr>
-          <w:highlight w:val="yellow"/>
-        </w:rPr>
         <w:t xml:space="preserve">Each physical device has two identities, a printed asset tag and its radio node number, and an eight-state lifecycle: In Intake → Available → Reserved → Rented → Returned → Maintenance → Lost → Retired. Devices are provisioned with the renter’s channel key at handover and reset and inspected on return before they can be rented again.</w:t>
       </w:r>
     </w:p>
@@ -2087,71 +1566,13 @@
           <w:b/>
           <w:bCs/>
         </w:rPr>
-        <w:t xml:space="preserve">Offline-Resilient</w:t>
-      </w:r>
-      <w:r>
-        <w:rPr>
-          <w:b/>
-          <w:bCs/>
-        </w:rPr>
-        <w:t xml:space="preserve"> </w:t>
-      </w:r>
-      <w:r>
-        <w:rPr>
-          <w:b/>
-          <w:bCs/>
-          <w:highlight w:val="yellow"/>
-        </w:rPr>
-        <w:t xml:space="preserve">Field Station</w:t>
-      </w:r>
-      <w:r>
-        <w:rPr>
-          <w:b/>
-          <w:bCs/>
-        </w:rPr>
-        <w:t xml:space="preserve">:</w:t>
-      </w:r>
-      <w:r>
-        <w:t xml:space="preserve"> </w:t>
-      </w:r>
-      <w:r>
-        <w:t xml:space="preserve">Each field event is identified by</w:t>
-      </w:r>
-      <w:r>
-        <w:t xml:space="preserve"> </w:t>
-      </w:r>
-      <w:r>
-        <w:rPr>
-          <w:highlight w:val="yellow"/>
-        </w:rPr>
-        <w:t xml:space="preserve">eventId = sha256(nodeNum : packetId), derived from identifiers the firmware already transmits</w:t>
-      </w:r>
-      <w:r>
-        <w:t xml:space="preserve">. When Internet connectivity is unavailable, the</w:t>
-      </w:r>
-      <w:r>
-        <w:t xml:space="preserve"> </w:t>
-      </w:r>
-      <w:r>
-        <w:rPr>
-          <w:highlight w:val="yellow"/>
-        </w:rPr>
-        <w:t xml:space="preserve">Field Station, a single executable that the organization runs on its own laptop with one rented node on a USB port,</w:t>
-      </w:r>
-      <w:r>
-        <w:t xml:space="preserve"> </w:t>
-      </w:r>
-      <w:r>
-        <w:t xml:space="preserve">persistently stores events in a local SQLite queue and shows the local mesh to the operators on site. Safety-critical SOS events are assigned P0 priority and synchronized first on reconnection; GPS updates are P2 and routine telemetry P3.</w:t>
-      </w:r>
-      <w:r>
-        <w:t xml:space="preserve"> </w:t>
-      </w:r>
-      <w:r>
-        <w:rPr>
-          <w:highlight w:val="yellow"/>
-        </w:rPr>
-        <w:t xml:space="preserve">Each device also keeps its own durable queue.</w:t>
+        <w:t xml:space="preserve">Offline-Resilient Field Station:</w:t>
+      </w:r>
+      <w:r>
+        <w:t xml:space="preserve"> </w:t>
+      </w:r>
+      <w:r>
+        <w:t xml:space="preserve">Each field event is identified by eventId = sha256(nodeNum : packetId), derived from identifiers the firmware already transmits. When Internet connectivity is unavailable, the Field Station, a single executable that the organization runs on its own laptop with one rented node on a USB port, persistently stores events in a local SQLite queue and shows the local mesh to the operators on site. Safety-critical SOS events are assigned P0 priority and synchronized first on reconnection; GPS updates are P2 and routine telemetry P3. Each device also keeps its own durable queue.</w:t>
       </w:r>
     </w:p>
     <w:p>
@@ -2172,19 +1593,7 @@
         <w:t xml:space="preserve"> </w:t>
       </w:r>
       <w:r>
-        <w:t xml:space="preserve">The cloud backend uses the Event ID as an idempotency key. Regardless of how many times the same event is delivered, the backend creates exactly one Incident</w:t>
-      </w:r>
-      <w:r>
-        <w:t xml:space="preserve"> </w:t>
-      </w:r>
-      <w:r>
-        <w:rPr>
-          <w:highlight w:val="yellow"/>
-        </w:rPr>
-        <w:t xml:space="preserve">and one alert per tier</w:t>
-      </w:r>
-      <w:r>
-        <w:t xml:space="preserve">, preventing alert fatigue and ensuring data consistency.</w:t>
+        <w:t xml:space="preserve">The cloud backend uses the Event ID as an idempotency key. Regardless of how many times the same event is delivered, due to retransmission, reconnection replay, or duplicate LoRa broadcast, the backend creates exactly one Incident and one alert per tier, preventing alert fatigue and ensuring data consistency.</w:t>
       </w:r>
     </w:p>
     <w:p>
@@ -2199,37 +1608,12 @@
           <w:b/>
           <w:bCs/>
         </w:rPr>
-        <w:t xml:space="preserve">Incident Management</w:t>
-      </w:r>
-      <w:r>
-        <w:rPr>
-          <w:b/>
-          <w:bCs/>
-        </w:rPr>
-        <w:t xml:space="preserve"> </w:t>
-      </w:r>
-      <w:r>
-        <w:rPr>
-          <w:b/>
-          <w:bCs/>
-          <w:highlight w:val="yellow"/>
-        </w:rPr>
-        <w:t xml:space="preserve">with tiered alerts</w:t>
-      </w:r>
-      <w:r>
-        <w:rPr>
-          <w:b/>
-          <w:bCs/>
-        </w:rPr>
-        <w:t xml:space="preserve">:</w:t>
-      </w:r>
-      <w:r>
-        <w:t xml:space="preserve"> </w:t>
-      </w:r>
-      <w:r>
-        <w:rPr>
-          <w:highlight w:val="yellow"/>
-        </w:rPr>
+        <w:t xml:space="preserve">Incident Management with tiered alerts:</w:t>
+      </w:r>
+      <w:r>
+        <w:t xml:space="preserve"> </w:t>
+      </w:r>
+      <w:r>
         <w:t xml:space="preserve">Each SOS episode becomes one incident routed to the organization holding the device. Alerts go to its on-duty member, then its backup, then its Manager, each after a timeout; if nobody acknowledges, the incident escalates to TrekLink, which reports to the authorities. The organization runs the response and reports status back. Every transition is atomic and audited with actor, time and reason.</w:t>
       </w:r>
     </w:p>
@@ -2244,7 +1628,6 @@
         <w:rPr>
           <w:b/>
           <w:bCs/>
-          <w:highlight w:val="yellow"/>
         </w:rPr>
         <w:t xml:space="preserve">Live telemetry:</w:t>
       </w:r>
@@ -2252,9 +1635,6 @@
         <w:t xml:space="preserve"> </w:t>
       </w:r>
       <w:r>
-        <w:rPr>
-          <w:highlight w:val="yellow"/>
-        </w:rPr>
         <w:t xml:space="preserve">Each organization sees only its own rented devices, positions, battery levels and alerts on a live map, and can read the same data in its own systems through a REST and WebSocket API with an organization key.</w:t>
       </w:r>
     </w:p>
@@ -2284,16 +1664,7 @@
         <w:t xml:space="preserve"> </w:t>
       </w:r>
       <w:r>
-        <w:t xml:space="preserve">ESP32/ESP32-S3 + TrekLink firmware</w:t>
-      </w:r>
-      <w:r>
-        <w:t xml:space="preserve"> </w:t>
-      </w:r>
-      <w:r>
-        <w:rPr>
-          <w:highlight w:val="yellow"/>
-        </w:rPr>
-        <w:t xml:space="preserve">(team-built; targeted enhancements in scope)</w:t>
+        <w:t xml:space="preserve">ESP32/ESP32-S3 + TrekLink firmware (team-built; targeted enhancements in scope)</w:t>
       </w:r>
     </w:p>
     <w:p>
@@ -2307,34 +1678,14 @@
         <w:rPr>
           <w:b/>
           <w:bCs/>
-          <w:highlight w:val="yellow"/>
-        </w:rPr>
-        <w:t xml:space="preserve">Field Station</w:t>
-      </w:r>
-      <w:r>
-        <w:rPr>
-          <w:b/>
-          <w:bCs/>
-        </w:rPr>
-        <w:t xml:space="preserve">:</w:t>
-      </w:r>
-      <w:r>
-        <w:t xml:space="preserve"> </w:t>
-      </w:r>
-      <w:r>
-        <w:t xml:space="preserve">Node.js (TypeScript)</w:t>
-      </w:r>
-      <w:r>
-        <w:t xml:space="preserve"> </w:t>
-      </w:r>
-      <w:r>
-        <w:rPr>
-          <w:highlight w:val="yellow"/>
-        </w:rPr>
-        <w:t xml:space="preserve">packaged as a single executable with a local web page</w:t>
-      </w:r>
-      <w:r>
-        <w:t xml:space="preserve">: async I/O for concurrent MQTT + LoRa serial communication</w:t>
+        </w:rPr>
+        <w:t xml:space="preserve">Field Station:</w:t>
+      </w:r>
+      <w:r>
+        <w:t xml:space="preserve"> </w:t>
+      </w:r>
+      <w:r>
+        <w:t xml:space="preserve">Node.js (TypeScript) packaged as a single executable with a local web page: async I/O for concurrent MQTT + LoRa serial communication</w:t>
       </w:r>
     </w:p>
     <w:p>
@@ -2376,19 +1727,7 @@
         <w:t xml:space="preserve"> </w:t>
       </w:r>
       <w:r>
-        <w:t xml:space="preserve">PostgreSQL</w:t>
-      </w:r>
-      <w:r>
-        <w:t xml:space="preserve"> </w:t>
-      </w:r>
-      <w:r>
-        <w:rPr>
-          <w:highlight w:val="yellow"/>
-        </w:rPr>
-        <w:t xml:space="preserve">with Prisma ORM</w:t>
-      </w:r>
-      <w:r>
-        <w:t xml:space="preserve">: ACID compliance for rental transactions and incident audit trail</w:t>
+        <w:t xml:space="preserve">PostgreSQL with Prisma ORM: ACID compliance for rental transactions and incident audit trail</w:t>
       </w:r>
     </w:p>
     <w:p>
@@ -2409,22 +1748,7 @@
         <w:t xml:space="preserve"> </w:t>
       </w:r>
       <w:r>
-        <w:t xml:space="preserve">MQTT (Mosquitto): QoS-based delivery between</w:t>
-      </w:r>
-      <w:r>
-        <w:t xml:space="preserve"> </w:t>
-      </w:r>
-      <w:r>
-        <w:rPr>
-          <w:highlight w:val="yellow"/>
-        </w:rPr>
-        <w:t xml:space="preserve">Field Station</w:t>
-      </w:r>
-      <w:r>
-        <w:t xml:space="preserve"> </w:t>
-      </w:r>
-      <w:r>
-        <w:t xml:space="preserve">and backend</w:t>
+        <w:t xml:space="preserve">MQTT (Mosquitto): QoS-based delivery between Field Station and backend</w:t>
       </w:r>
     </w:p>
     <w:p>
@@ -2445,16 +1769,7 @@
         <w:t xml:space="preserve"> </w:t>
       </w:r>
       <w:r>
-        <w:t xml:space="preserve">Socket.io WebSocket: live dashboard updates</w:t>
-      </w:r>
-      <w:r>
-        <w:t xml:space="preserve"> </w:t>
-      </w:r>
-      <w:r>
-        <w:rPr>
-          <w:highlight w:val="yellow"/>
-        </w:rPr>
-        <w:t xml:space="preserve">and the organization API stream</w:t>
+        <w:t xml:space="preserve">Socket.io WebSocket: live dashboard updates and the organization API stream</w:t>
       </w:r>
     </w:p>
     <w:p>
@@ -2489,20 +1804,13 @@
         <w:rPr>
           <w:b/>
           <w:bCs/>
-          <w:highlight w:val="yellow"/>
         </w:rPr>
         <w:t xml:space="preserve">Payment gateway:</w:t>
       </w:r>
       <w:r>
-        <w:rPr>
-          <w:highlight w:val="yellow"/>
-        </w:rPr>
-        <w:t xml:space="preserve"> </w:t>
-      </w:r>
-      <w:r>
-        <w:rPr>
-          <w:highlight w:val="yellow"/>
-        </w:rPr>
+        <w:t xml:space="preserve"> </w:t>
+      </w:r>
+      <w:r>
         <w:t xml:space="preserve">SePay (VietQR with confirming webhook), sandbox environment</w:t>
       </w:r>
     </w:p>
@@ -2551,16 +1859,8 @@
         <w:rPr>
           <w:b/>
           <w:bCs/>
-          <w:highlight w:val="yellow"/>
-        </w:rPr>
-        <w:t xml:space="preserve">TrekLink Admin</w:t>
-      </w:r>
-      <w:r>
-        <w:rPr>
-          <w:b/>
-          <w:bCs/>
-        </w:rPr>
-        <w:t xml:space="preserve">:</w:t>
+        </w:rPr>
+        <w:t xml:space="preserve">TrekLink Admin:</w:t>
       </w:r>
     </w:p>
     <w:p>
@@ -2576,16 +1876,7 @@
         <w:pStyle w:val="BodyText"/>
       </w:pPr>
       <w:r>
-        <w:t xml:space="preserve">•</w:t>
-      </w:r>
-      <w:r>
-        <w:t xml:space="preserve"> </w:t>
-      </w:r>
-      <w:r>
-        <w:rPr>
-          <w:highlight w:val="yellow"/>
-        </w:rPr>
-        <w:t xml:space="preserve">Manage platform accounts, roles, permissions, and system configurations.</w:t>
+        <w:t xml:space="preserve">• Manage platform accounts, roles, permissions, and system configurations.</w:t>
       </w:r>
     </w:p>
     <w:p>
@@ -2601,16 +1892,7 @@
         <w:pStyle w:val="BodyText"/>
       </w:pPr>
       <w:r>
-        <w:t xml:space="preserve">•</w:t>
-      </w:r>
-      <w:r>
-        <w:t xml:space="preserve"> </w:t>
-      </w:r>
-      <w:r>
-        <w:rPr>
-          <w:highlight w:val="yellow"/>
-        </w:rPr>
-        <w:t xml:space="preserve">Manage rental plans and prices: monthly price per variant, day-plan lengths and premium, minimum order quantity, late, damage and loss charges.</w:t>
+        <w:t xml:space="preserve">• Manage rental plans and prices: monthly price per variant, day-plan lengths and premium, minimum order quantity, late, damage and loss charges.</w:t>
       </w:r>
     </w:p>
     <w:p>
@@ -2618,16 +1900,7 @@
         <w:pStyle w:val="BodyText"/>
       </w:pPr>
       <w:r>
-        <w:t xml:space="preserve">•</w:t>
-      </w:r>
-      <w:r>
-        <w:t xml:space="preserve"> </w:t>
-      </w:r>
-      <w:r>
-        <w:rPr>
-          <w:highlight w:val="yellow"/>
-        </w:rPr>
-        <w:t xml:space="preserve">Approve damage charges above the threshold (never as the inspector) and retire devices.</w:t>
+        <w:t xml:space="preserve">• Approve damage charges above the threshold (never as the inspector) and retire devices.</w:t>
       </w:r>
     </w:p>
     <w:p>
@@ -2650,16 +1923,8 @@
         <w:rPr>
           <w:b/>
           <w:bCs/>
-          <w:highlight w:val="yellow"/>
-        </w:rPr>
-        <w:t xml:space="preserve">TrekLink Staff</w:t>
-      </w:r>
-      <w:r>
-        <w:rPr>
-          <w:b/>
-          <w:bCs/>
-        </w:rPr>
-        <w:t xml:space="preserve">:</w:t>
+        </w:rPr>
+        <w:t xml:space="preserve">TrekLink Staff:</w:t>
       </w:r>
     </w:p>
     <w:p>
@@ -2667,16 +1932,7 @@
         <w:pStyle w:val="FirstParagraph"/>
       </w:pPr>
       <w:r>
-        <w:t xml:space="preserve">•</w:t>
-      </w:r>
-      <w:r>
-        <w:t xml:space="preserve"> </w:t>
-      </w:r>
-      <w:r>
-        <w:rPr>
-          <w:highlight w:val="yellow"/>
-        </w:rPr>
-        <w:t xml:space="preserve">Verify organizations in person or by phone and record the signed master contract.</w:t>
+        <w:t xml:space="preserve">• Verify organizations in person or by phone and record the signed master contract.</w:t>
       </w:r>
     </w:p>
     <w:p>
@@ -2684,16 +1940,7 @@
         <w:pStyle w:val="BodyText"/>
       </w:pPr>
       <w:r>
-        <w:t xml:space="preserve">•</w:t>
-      </w:r>
-      <w:r>
-        <w:t xml:space="preserve"> </w:t>
-      </w:r>
-      <w:r>
-        <w:rPr>
-          <w:highlight w:val="yellow"/>
-        </w:rPr>
-        <w:t xml:space="preserve">Register devices (asset tag and node number), run intake checks, and record maintenance.</w:t>
+        <w:t xml:space="preserve">• Register devices (asset tag and node number), run intake checks, and record maintenance.</w:t>
       </w:r>
     </w:p>
     <w:p>
@@ -2701,16 +1948,7 @@
         <w:pStyle w:val="BodyText"/>
       </w:pPr>
       <w:r>
-        <w:t xml:space="preserve">•</w:t>
-      </w:r>
-      <w:r>
-        <w:t xml:space="preserve"> </w:t>
-      </w:r>
-      <w:r>
-        <w:rPr>
-          <w:highlight w:val="yellow"/>
-        </w:rPr>
-        <w:t xml:space="preserve">Approve rental contracts, reserving devices without over-allocation.</w:t>
+        <w:t xml:space="preserve">• Approve rental contracts, reserving devices without over-allocation.</w:t>
       </w:r>
     </w:p>
     <w:p>
@@ -2718,16 +1956,7 @@
         <w:pStyle w:val="BodyText"/>
       </w:pPr>
       <w:r>
-        <w:t xml:space="preserve">•</w:t>
-      </w:r>
-      <w:r>
-        <w:t xml:space="preserve"> </w:t>
-      </w:r>
-      <w:r>
-        <w:rPr>
-          <w:highlight w:val="yellow"/>
-        </w:rPr>
-        <w:t xml:space="preserve">Provision devices with the organization’s channel key and hand them over at the counter with a signed handover note.</w:t>
+        <w:t xml:space="preserve">• Provision devices with the organization’s channel key and hand them over at the counter with a signed handover note.</w:t>
       </w:r>
     </w:p>
     <w:p>
@@ -2735,16 +1964,7 @@
         <w:pStyle w:val="BodyText"/>
       </w:pPr>
       <w:r>
-        <w:t xml:space="preserve">•</w:t>
-      </w:r>
-      <w:r>
-        <w:t xml:space="preserve"> </w:t>
-      </w:r>
-      <w:r>
-        <w:rPr>
-          <w:highlight w:val="yellow"/>
-        </w:rPr>
-        <w:t xml:space="preserve">Check devices in, reset and inspect them, record damage and loss, and close contracts.</w:t>
+        <w:t xml:space="preserve">• Check devices in, reset and inspect them, record damage and loss, and close contracts.</w:t>
       </w:r>
     </w:p>
     <w:p>
@@ -2752,16 +1972,7 @@
         <w:pStyle w:val="BodyText"/>
       </w:pPr>
       <w:r>
-        <w:t xml:space="preserve">•</w:t>
-      </w:r>
-      <w:r>
-        <w:t xml:space="preserve"> </w:t>
-      </w:r>
-      <w:r>
-        <w:rPr>
-          <w:highlight w:val="yellow"/>
-        </w:rPr>
-        <w:t xml:space="preserve">Record counter payments, and run stock-takes.</w:t>
+        <w:t xml:space="preserve">• Record counter payments, and run stock-takes.</w:t>
       </w:r>
     </w:p>
     <w:p>
@@ -2769,16 +1980,7 @@
         <w:pStyle w:val="BodyText"/>
       </w:pPr>
       <w:r>
-        <w:t xml:space="preserve">•</w:t>
-      </w:r>
-      <w:r>
-        <w:t xml:space="preserve"> </w:t>
-      </w:r>
-      <w:r>
-        <w:rPr>
-          <w:highlight w:val="yellow"/>
-        </w:rPr>
-        <w:t xml:space="preserve">Handle escalated and unrouted incidents and record reports to the authorities.</w:t>
+        <w:t xml:space="preserve">• Handle escalated and unrouted incidents and record reports to the authorities.</w:t>
       </w:r>
     </w:p>
     <w:p>
@@ -2793,16 +1995,8 @@
         <w:rPr>
           <w:b/>
           <w:bCs/>
-          <w:highlight w:val="yellow"/>
-        </w:rPr>
-        <w:t xml:space="preserve">Organization Manager</w:t>
-      </w:r>
-      <w:r>
-        <w:rPr>
-          <w:b/>
-          <w:bCs/>
-        </w:rPr>
-        <w:t xml:space="preserve">:</w:t>
+        </w:rPr>
+        <w:t xml:space="preserve">Organization Manager:</w:t>
       </w:r>
     </w:p>
     <w:p>
@@ -2810,16 +2004,7 @@
         <w:pStyle w:val="FirstParagraph"/>
       </w:pPr>
       <w:r>
-        <w:t xml:space="preserve">•</w:t>
-      </w:r>
-      <w:r>
-        <w:t xml:space="preserve"> </w:t>
-      </w:r>
-      <w:r>
-        <w:rPr>
-          <w:highlight w:val="yellow"/>
-        </w:rPr>
-        <w:t xml:space="preserve">Register the organization, sign the master contract and handover notes.</w:t>
+        <w:t xml:space="preserve">• Register the organization, sign the master contract and handover notes.</w:t>
       </w:r>
     </w:p>
     <w:p>
@@ -2827,16 +2012,7 @@
         <w:pStyle w:val="BodyText"/>
       </w:pPr>
       <w:r>
-        <w:t xml:space="preserve">•</w:t>
-      </w:r>
-      <w:r>
-        <w:t xml:space="preserve"> </w:t>
-      </w:r>
-      <w:r>
-        <w:rPr>
-          <w:highlight w:val="yellow"/>
-        </w:rPr>
-        <w:t xml:space="preserve">Request rental contracts (plan, hardware variant, quantity, start date), pay online or at the counter, and give notice on monthly contracts.</w:t>
+        <w:t xml:space="preserve">• Request rental contracts (plan, hardware variant, quantity, start date), pay online or at the counter, and give notice on monthly contracts.</w:t>
       </w:r>
     </w:p>
     <w:p>
@@ -2844,16 +2020,7 @@
         <w:pStyle w:val="BodyText"/>
       </w:pPr>
       <w:r>
-        <w:t xml:space="preserve">•</w:t>
-      </w:r>
-      <w:r>
-        <w:t xml:space="preserve"> </w:t>
-      </w:r>
-      <w:r>
-        <w:rPr>
-          <w:highlight w:val="yellow"/>
-        </w:rPr>
-        <w:t xml:space="preserve">Manage the organization’s members, on-duty roster (primary and backup per shift), and API keys.</w:t>
+        <w:t xml:space="preserve">• Manage the organization’s members, on-duty roster (primary and backup per shift), and API keys.</w:t>
       </w:r>
     </w:p>
     <w:p>
@@ -2861,16 +2028,7 @@
         <w:pStyle w:val="BodyText"/>
       </w:pPr>
       <w:r>
-        <w:t xml:space="preserve">•</w:t>
-      </w:r>
-      <w:r>
-        <w:t xml:space="preserve"> </w:t>
-      </w:r>
-      <w:r>
-        <w:rPr>
-          <w:highlight w:val="yellow"/>
-        </w:rPr>
-        <w:t xml:space="preserve">View contracts, terms, invoices, and payments; act as the last organization alert tier.</w:t>
+        <w:t xml:space="preserve">• View contracts, terms, invoices, and payments; act as the last organization alert tier.</w:t>
       </w:r>
     </w:p>
     <w:p>
@@ -2885,16 +2043,8 @@
         <w:rPr>
           <w:b/>
           <w:bCs/>
-          <w:highlight w:val="yellow"/>
-        </w:rPr>
-        <w:t xml:space="preserve">Organization Operator (on-duty member)</w:t>
-      </w:r>
-      <w:r>
-        <w:rPr>
-          <w:b/>
-          <w:bCs/>
-        </w:rPr>
-        <w:t xml:space="preserve">:</w:t>
+        </w:rPr>
+        <w:t xml:space="preserve">Organization Operator (on-duty member):</w:t>
       </w:r>
     </w:p>
     <w:p>
@@ -2902,16 +2052,7 @@
         <w:pStyle w:val="FirstParagraph"/>
       </w:pPr>
       <w:r>
-        <w:t xml:space="preserve">•</w:t>
-      </w:r>
-      <w:r>
-        <w:t xml:space="preserve"> </w:t>
-      </w:r>
-      <w:r>
-        <w:rPr>
-          <w:highlight w:val="yellow"/>
-        </w:rPr>
-        <w:t xml:space="preserve">Receive SOS alerts, acknowledge incidents, report response status and outcome, or declare a false alarm.</w:t>
+        <w:t xml:space="preserve">• Receive SOS alerts, acknowledge incidents, report response status and outcome, or declare a false alarm.</w:t>
       </w:r>
     </w:p>
     <w:p>
@@ -2919,16 +2060,7 @@
         <w:pStyle w:val="BodyText"/>
       </w:pPr>
       <w:r>
-        <w:t xml:space="preserve">•</w:t>
-      </w:r>
-      <w:r>
-        <w:t xml:space="preserve"> </w:t>
-      </w:r>
-      <w:r>
-        <w:rPr>
-          <w:highlight w:val="yellow"/>
-        </w:rPr>
-        <w:t xml:space="preserve">View the organization’s rented devices, positions, battery, and alerts on the live map.</w:t>
+        <w:t xml:space="preserve">• View the organization’s rented devices, positions, battery, and alerts on the live map.</w:t>
       </w:r>
     </w:p>
     <w:p>
@@ -2936,16 +2068,7 @@
         <w:pStyle w:val="BodyText"/>
       </w:pPr>
       <w:r>
-        <w:t xml:space="preserve">•</w:t>
-      </w:r>
-      <w:r>
-        <w:t xml:space="preserve"> </w:t>
-      </w:r>
-      <w:r>
-        <w:rPr>
-          <w:highlight w:val="yellow"/>
-        </w:rPr>
-        <w:t xml:space="preserve">Run the Field Station on site and view the local mesh offline; optionally label each device with its holder.</w:t>
+        <w:t xml:space="preserve">• Run the Field Station on site and view the local mesh offline; optionally label each device with its holder.</w:t>
       </w:r>
     </w:p>
     <w:p>
@@ -2960,16 +2083,8 @@
         <w:rPr>
           <w:b/>
           <w:bCs/>
-          <w:highlight w:val="yellow"/>
-        </w:rPr>
-        <w:t xml:space="preserve">Organization System (API client)</w:t>
-      </w:r>
-      <w:r>
-        <w:rPr>
-          <w:b/>
-          <w:bCs/>
-        </w:rPr>
-        <w:t xml:space="preserve">:</w:t>
+        </w:rPr>
+        <w:t xml:space="preserve">Organization System (API client):</w:t>
       </w:r>
     </w:p>
     <w:p>
@@ -2977,16 +2092,7 @@
         <w:pStyle w:val="FirstParagraph"/>
       </w:pPr>
       <w:r>
-        <w:t xml:space="preserve">•</w:t>
-      </w:r>
-      <w:r>
-        <w:t xml:space="preserve"> </w:t>
-      </w:r>
-      <w:r>
-        <w:rPr>
-          <w:highlight w:val="yellow"/>
-        </w:rPr>
-        <w:t xml:space="preserve">Read the organization’s live positions, telemetry, and incident events over REST and WebSocket with an organization API key.</w:t>
+        <w:t xml:space="preserve">• Read the organization’s live positions, telemetry, and incident events over REST and WebSocket with an organization API key.</w:t>
       </w:r>
     </w:p>
     <w:p>
@@ -3001,16 +2107,8 @@
         <w:rPr>
           <w:b/>
           <w:bCs/>
-          <w:highlight w:val="yellow"/>
-        </w:rPr>
-        <w:t xml:space="preserve">Asset Management</w:t>
-      </w:r>
-      <w:r>
-        <w:rPr>
-          <w:b/>
-          <w:bCs/>
-        </w:rPr>
-        <w:t xml:space="preserve">:</w:t>
+        </w:rPr>
+        <w:t xml:space="preserve">Asset Management:</w:t>
       </w:r>
     </w:p>
     <w:p>
@@ -3018,16 +2116,7 @@
         <w:pStyle w:val="FirstParagraph"/>
       </w:pPr>
       <w:r>
-        <w:t xml:space="preserve">•</w:t>
-      </w:r>
-      <w:r>
-        <w:t xml:space="preserve"> </w:t>
-      </w:r>
-      <w:r>
-        <w:rPr>
-          <w:highlight w:val="yellow"/>
-        </w:rPr>
-        <w:t xml:space="preserve">Register each physical unit with asset tag, node number, hardware variant, firmware version, and status; neither identity is ever reused.</w:t>
+        <w:t xml:space="preserve">• Register each physical unit with asset tag, node number, hardware variant, firmware version, and status; neither identity is ever reused.</w:t>
       </w:r>
     </w:p>
     <w:p>
@@ -3035,16 +2124,7 @@
         <w:pStyle w:val="BodyText"/>
       </w:pPr>
       <w:r>
-        <w:t xml:space="preserve">•</w:t>
-      </w:r>
-      <w:r>
-        <w:t xml:space="preserve"> </w:t>
-      </w:r>
-      <w:r>
-        <w:rPr>
-          <w:highlight w:val="yellow"/>
-        </w:rPr>
-        <w:t xml:space="preserve">Manage the eight-state device lifecycle: In Intake → Available → Reserved → Rented → Returned → Maintenance → Lost → Retired.</w:t>
+        <w:t xml:space="preserve">• Manage the eight-state device lifecycle: In Intake → Available → Reserved → Rented → Returned → Maintenance → Lost → Retired.</w:t>
       </w:r>
     </w:p>
     <w:p>
@@ -3060,16 +2140,7 @@
         <w:pStyle w:val="BodyText"/>
       </w:pPr>
       <w:r>
-        <w:t xml:space="preserve">•</w:t>
-      </w:r>
-      <w:r>
-        <w:t xml:space="preserve"> </w:t>
-      </w:r>
-      <w:r>
-        <w:rPr>
-          <w:highlight w:val="yellow"/>
-        </w:rPr>
-        <w:t xml:space="preserve">Maintain custody, contract, incident, inspection, and maintenance histories; reset every returned device before it can be rented again.</w:t>
+        <w:t xml:space="preserve">• Maintain custody, contract, incident, inspection, and maintenance histories; reset every returned device before it can be rented again.</w:t>
       </w:r>
     </w:p>
     <w:p>
@@ -3077,7 +2148,7 @@
         <w:pStyle w:val="BodyText"/>
       </w:pPr>
       <w:r>
-        <w:t xml:space="preserve">• Schedule maintenance and prevent unavailable devices from being allocated.</w:t>
+        <w:t xml:space="preserve">• Schedule maintenance and prevent unavailable or expired-maintenance devices from being allocated.</w:t>
       </w:r>
     </w:p>
     <w:p>
@@ -3101,19 +2172,7 @@
         <w:pStyle w:val="FirstParagraph"/>
       </w:pPr>
       <w:r>
-        <w:t xml:space="preserve">• Each field event shall carry</w:t>
-      </w:r>
-      <w:r>
-        <w:t xml:space="preserve"> </w:t>
-      </w:r>
-      <w:r>
-        <w:rPr>
-          <w:highlight w:val="yellow"/>
-        </w:rPr>
-        <w:t xml:space="preserve">an eventId derived as sha256(nodeNum : packetId)</w:t>
-      </w:r>
-      <w:r>
-        <w:t xml:space="preserve">, source device, event type, UTC timestamp, and priority tier.</w:t>
+        <w:t xml:space="preserve">• Each field event shall contain an eventId derived as sha256(nodeNum : packetId), source device ID, event type, UTC timestamp, and priority tier.</w:t>
       </w:r>
     </w:p>
     <w:p>
@@ -3121,31 +2180,7 @@
         <w:pStyle w:val="BodyText"/>
       </w:pPr>
       <w:r>
-        <w:t xml:space="preserve">• The</w:t>
-      </w:r>
-      <w:r>
-        <w:t xml:space="preserve"> </w:t>
-      </w:r>
-      <w:r>
-        <w:rPr>
-          <w:highlight w:val="yellow"/>
-        </w:rPr>
-        <w:t xml:space="preserve">Field Station</w:t>
-      </w:r>
-      <w:r>
-        <w:t xml:space="preserve"> </w:t>
-      </w:r>
-      <w:r>
-        <w:t xml:space="preserve">shall persist unsent events in a local SQLite queue when cloud connectivity is unavailable</w:t>
-      </w:r>
-      <w:r>
-        <w:rPr>
-          <w:highlight w:val="yellow"/>
-        </w:rPr>
-        <w:t xml:space="preserve">, and each device shall keep its own durable queue</w:t>
-      </w:r>
-      <w:r>
-        <w:t xml:space="preserve">.</w:t>
+        <w:t xml:space="preserve">• The Field Station shall persist unsent events in a local SQLite queue when cloud connectivity is unavailable, and each device shall keep its own durable queue.</w:t>
       </w:r>
     </w:p>
     <w:p>
@@ -3208,16 +2243,8 @@
         <w:rPr>
           <w:b/>
           <w:bCs/>
-          <w:highlight w:val="yellow"/>
-        </w:rPr>
-        <w:t xml:space="preserve">Live Telemetry &amp; Incident Management</w:t>
-      </w:r>
-      <w:r>
-        <w:rPr>
-          <w:b/>
-          <w:bCs/>
-        </w:rPr>
-        <w:t xml:space="preserve">:</w:t>
+        </w:rPr>
+        <w:t xml:space="preserve">Live Telemetry &amp; Incident Management:</w:t>
       </w:r>
     </w:p>
     <w:p>
@@ -3225,16 +2252,7 @@
         <w:pStyle w:val="FirstParagraph"/>
       </w:pPr>
       <w:r>
-        <w:t xml:space="preserve">•</w:t>
-      </w:r>
-      <w:r>
-        <w:t xml:space="preserve"> </w:t>
-      </w:r>
-      <w:r>
-        <w:rPr>
-          <w:highlight w:val="yellow"/>
-        </w:rPr>
-        <w:t xml:space="preserve">Display each organization’s rented devices, positions, device status, and last-seen information on a real-time map, scoped to that organization on the server; offer the same data through the organization API.</w:t>
+        <w:t xml:space="preserve">• Display each organization’s rented devices, positions, device status, and last-seen information on a real-time map, scoped to that organization on the server; offer the same data through the organization API.</w:t>
       </w:r>
     </w:p>
     <w:p>
@@ -3242,16 +2260,7 @@
         <w:pStyle w:val="BodyText"/>
       </w:pPr>
       <w:r>
-        <w:t xml:space="preserve">• Create an Incident automatically when a valid SOS event is received and idempotency check passes</w:t>
-      </w:r>
-      <w:r>
-        <w:rPr>
-          <w:highlight w:val="yellow"/>
-        </w:rPr>
-        <w:t xml:space="preserve">, and route it to the organization holding the device</w:t>
-      </w:r>
-      <w:r>
-        <w:t xml:space="preserve">.</w:t>
+        <w:t xml:space="preserve">• Create an Incident automatically when a valid SOS event is received and idempotency check passes, and route it to the organization holding the device.</w:t>
       </w:r>
     </w:p>
     <w:p>
@@ -3259,16 +2268,7 @@
         <w:pStyle w:val="BodyText"/>
       </w:pPr>
       <w:r>
-        <w:t xml:space="preserve">•</w:t>
-      </w:r>
-      <w:r>
-        <w:t xml:space="preserve"> </w:t>
-      </w:r>
-      <w:r>
-        <w:rPr>
-          <w:highlight w:val="yellow"/>
-        </w:rPr>
-        <w:t xml:space="preserve">Alert the organization’s on-duty member within 2 seconds of incident creation, then the backup and the Manager after configurable timeouts; escalate to TrekLink when nobody acknowledges.</w:t>
+        <w:t xml:space="preserve">• Alert the organization’s on-duty member within 2 seconds of incident creation, then the backup and the Manager after configurable timeouts; escalate to TrekLink when nobody acknowledges.</w:t>
       </w:r>
     </w:p>
     <w:p>
@@ -3276,16 +2276,7 @@
         <w:pStyle w:val="BodyText"/>
       </w:pPr>
       <w:r>
-        <w:t xml:space="preserve">•</w:t>
-      </w:r>
-      <w:r>
-        <w:t xml:space="preserve"> </w:t>
-      </w:r>
-      <w:r>
-        <w:rPr>
-          <w:highlight w:val="yellow"/>
-        </w:rPr>
-        <w:t xml:space="preserve">Support the incident lifecycle with tiered notification, acknowledgement, response, resolution, false alarm, escalation, authority report, reopen, and close.</w:t>
+        <w:t xml:space="preserve">• Support the incident lifecycle with tiered notification, acknowledgement, response, resolution, false alarm, escalation, authority report, reopen, and close.</w:t>
       </w:r>
     </w:p>
     <w:p>
@@ -3309,16 +2300,7 @@
         <w:pStyle w:val="BodyText"/>
       </w:pPr>
       <w:r>
-        <w:t xml:space="preserve">•</w:t>
-      </w:r>
-      <w:r>
-        <w:t xml:space="preserve"> </w:t>
-      </w:r>
-      <w:r>
-        <w:rPr>
-          <w:highlight w:val="yellow"/>
-        </w:rPr>
-        <w:t xml:space="preserve">Keep an incident owned at every moment: either a named owner or a running tier timeout.</w:t>
+        <w:t xml:space="preserve">• Keep an incident owned at every moment: either a named owner or a running tier timeout.</w:t>
       </w:r>
     </w:p>
     <w:p>
@@ -3342,16 +2324,7 @@
         <w:pStyle w:val="FirstParagraph"/>
       </w:pPr>
       <w:r>
-        <w:t xml:space="preserve">•</w:t>
-      </w:r>
-      <w:r>
-        <w:t xml:space="preserve"> </w:t>
-      </w:r>
-      <w:r>
-        <w:rPr>
-          <w:highlight w:val="yellow"/>
-        </w:rPr>
-        <w:t xml:space="preserve">Calculate monthly term fees (holding fee and balance) and day-plan fees per device and hardware variant, plus late, damage, and loss charges.</w:t>
+        <w:t xml:space="preserve">• Calculate monthly term fees (holding fee and balance) and day-plan fees per device and hardware variant, plus late, damage, and loss charges.</w:t>
       </w:r>
     </w:p>
     <w:p>
@@ -3367,16 +2340,7 @@
         <w:pStyle w:val="BodyText"/>
       </w:pPr>
       <w:r>
-        <w:t xml:space="preserve">•</w:t>
-      </w:r>
-      <w:r>
-        <w:t xml:space="preserve"> </w:t>
-      </w:r>
-      <w:r>
-        <w:rPr>
-          <w:highlight w:val="yellow"/>
-        </w:rPr>
-        <w:t xml:space="preserve">Integrate the SePay payment gateway (VietQR, confirming webhook) in its sandbox environment, and record counter payments.</w:t>
+        <w:t xml:space="preserve">• Integrate the SePay payment gateway (VietQR, confirming webhook) in its sandbox environment, and record counter payments.</w:t>
       </w:r>
     </w:p>
     <w:p>
@@ -3384,19 +2348,7 @@
         <w:pStyle w:val="BodyText"/>
       </w:pPr>
       <w:r>
-        <w:t xml:space="preserve">• Generate reports on</w:t>
-      </w:r>
-      <w:r>
-        <w:t xml:space="preserve"> </w:t>
-      </w:r>
-      <w:r>
-        <w:rPr>
-          <w:highlight w:val="yellow"/>
-        </w:rPr>
-        <w:t xml:space="preserve">contracts, fleet utilization, revenue, overdue and lost devices, maintenance, incidents, and response performance</w:t>
-      </w:r>
-      <w:r>
-        <w:t xml:space="preserve">.</w:t>
+        <w:t xml:space="preserve">• Generate reports on contracts, fleet utilization, revenue, overdue and lost devices, maintenance, incidents, and response performance.</w:t>
       </w:r>
     </w:p>
     <w:p>
@@ -3618,16 +2570,7 @@
         <w:t xml:space="preserve"> </w:t>
       </w:r>
       <w:r>
-        <w:t xml:space="preserve">JWT-based authentication, RBAC, TLS-encrypted transport, bcrypt password hashing, and auditable access to sensitive incident data.</w:t>
-      </w:r>
-      <w:r>
-        <w:t xml:space="preserve"> </w:t>
-      </w:r>
-      <w:r>
-        <w:rPr>
-          <w:highlight w:val="yellow"/>
-        </w:rPr>
-        <w:t xml:space="preserve">No organization shall be able to read another organization’s devices, positions, incidents, contracts, or invoices, verified by a cross-organization test per module.</w:t>
+        <w:t xml:space="preserve">JWT-based authentication, RBAC, TLS-encrypted transport, bcrypt password hashing, and auditable access to sensitive incident data. No organization shall be able to read another organization’s devices, positions, incidents, contracts, or invoices, verified by a cross-organization test per module.</w:t>
       </w:r>
     </w:p>
     <w:p>
@@ -3648,22 +2591,7 @@
         <w:t xml:space="preserve"> </w:t>
       </w:r>
       <w:r>
-        <w:t xml:space="preserve">Every incident state transition, device lifecycle transition, and</w:t>
-      </w:r>
-      <w:r>
-        <w:t xml:space="preserve"> </w:t>
-      </w:r>
-      <w:r>
-        <w:rPr>
-          <w:highlight w:val="yellow"/>
-        </w:rPr>
-        <w:t xml:space="preserve">rental contract</w:t>
-      </w:r>
-      <w:r>
-        <w:t xml:space="preserve"> </w:t>
-      </w:r>
-      <w:r>
-        <w:t xml:space="preserve">event shall be traceable to an actor (user ID + role) and a UTC timestamp.</w:t>
+        <w:t xml:space="preserve">Every incident state transition, device lifecycle transition, and rental contract event shall be traceable to an actor (user ID + role) and a UTC timestamp.</w:t>
       </w:r>
     </w:p>
     <w:p>
@@ -3684,22 +2612,7 @@
         <w:t xml:space="preserve"> </w:t>
       </w:r>
       <w:r>
-        <w:t xml:space="preserve">The system shall support at least</w:t>
-      </w:r>
-      <w:r>
-        <w:t xml:space="preserve"> </w:t>
-      </w:r>
-      <w:r>
-        <w:rPr>
-          <w:highlight w:val="yellow"/>
-        </w:rPr>
-        <w:t xml:space="preserve">10 organizations and 50 rented TrekLink devices concurrently</w:t>
-      </w:r>
-      <w:r>
-        <w:t xml:space="preserve"> </w:t>
-      </w:r>
-      <w:r>
-        <w:t xml:space="preserve">without architectural changes.</w:t>
+        <w:t xml:space="preserve">The system shall support at least 10 organizations and 50 rented TrekLink devices concurrently without architectural changes.</w:t>
       </w:r>
     </w:p>
     <w:p>
@@ -3765,22 +2678,7 @@
         <w:t xml:space="preserve"> </w:t>
       </w:r>
       <w:r>
-        <w:t xml:space="preserve">Model</w:t>
-      </w:r>
-      <w:r>
-        <w:t xml:space="preserve"> </w:t>
-      </w:r>
-      <w:r>
-        <w:rPr>
-          <w:highlight w:val="yellow"/>
-        </w:rPr>
-        <w:t xml:space="preserve">the eight-state device lifecycle, the incident lifecycle with tiered notification and escalation, and the organization and rental-contract lifecycles</w:t>
-      </w:r>
-      <w:r>
-        <w:t xml:space="preserve"> </w:t>
-      </w:r>
-      <w:r>
-        <w:t xml:space="preserve">with controlled, auditable state transitions. Each transition is an atomic, logged operation.</w:t>
+        <w:t xml:space="preserve">Model the eight-state device lifecycle, the incident lifecycle with tiered notification and escalation, and the organization and rental-contract lifecycles with controlled, auditable state transitions. Each transition is an atomic, logged operation.</w:t>
       </w:r>
     </w:p>
     <w:p>
@@ -3885,7 +2783,7 @@
         <w:t xml:space="preserve"> </w:t>
       </w:r>
       <w:r>
-        <w:t xml:space="preserve">SOS events trigger an asynchronous processing pipeline: event ingestion → idempotency check → incident creation → role-based notification → audit logging: where each stage is decoupled and independently testable.</w:t>
+        <w:t xml:space="preserve">SOS events trigger an asynchronous processing pipeline: event ingestion → idempotency check → incident creation → role-based notification → audit logging, where each stage is decoupled and independently testable.</w:t>
       </w:r>
     </w:p>
     <w:p>
@@ -3900,47 +2798,13 @@
           <w:b/>
           <w:bCs/>
         </w:rPr>
-        <w:t xml:space="preserve">Role-Based Access Control (RBAC)</w:t>
-      </w:r>
-      <w:r>
-        <w:rPr>
-          <w:b/>
-          <w:bCs/>
-        </w:rPr>
-        <w:t xml:space="preserve"> </w:t>
-      </w:r>
-      <w:r>
-        <w:rPr>
-          <w:b/>
-          <w:bCs/>
-          <w:highlight w:val="yellow"/>
-        </w:rPr>
-        <w:t xml:space="preserve">and multi-tenancy</w:t>
-      </w:r>
-      <w:r>
-        <w:rPr>
-          <w:b/>
-          <w:bCs/>
-        </w:rPr>
-        <w:t xml:space="preserve">:</w:t>
-      </w:r>
-      <w:r>
-        <w:t xml:space="preserve"> </w:t>
-      </w:r>
-      <w:r>
-        <w:t xml:space="preserve">Fine-grained permissions enforced at the API layer for</w:t>
-      </w:r>
-      <w:r>
-        <w:t xml:space="preserve"> </w:t>
-      </w:r>
-      <w:r>
-        <w:rPr>
-          <w:highlight w:val="yellow"/>
-        </w:rPr>
-        <w:t xml:space="preserve">TrekLink Admin and Staff and for each organization’s Manager and Operators, with every organization’s data isolated on the server</w:t>
-      </w:r>
-      <w:r>
-        <w:t xml:space="preserve">.</w:t>
+        <w:t xml:space="preserve">Role-Based Access Control (RBAC) and multi-tenancy:</w:t>
+      </w:r>
+      <w:r>
+        <w:t xml:space="preserve"> </w:t>
+      </w:r>
+      <w:r>
+        <w:t xml:space="preserve">Fine-grained permissions enforced at the API layer for TrekLink Admin and Staff and for each organization’s Manager and Operators, with every organization’s data isolated on the server.</w:t>
       </w:r>
     </w:p>
     <w:p>
@@ -3961,22 +2825,7 @@
         <w:t xml:space="preserve"> </w:t>
       </w:r>
       <w:r>
-        <w:t xml:space="preserve">Domain-driven modular design separates</w:t>
-      </w:r>
-      <w:r>
-        <w:t xml:space="preserve"> </w:t>
-      </w:r>
-      <w:r>
-        <w:rPr>
-          <w:highlight w:val="yellow"/>
-        </w:rPr>
-        <w:t xml:space="preserve">gateway synchronization, organizations, devices, rental contracts, incidents, monitoring, billing, and platform services</w:t>
-      </w:r>
-      <w:r>
-        <w:t xml:space="preserve"> </w:t>
-      </w:r>
-      <w:r>
-        <w:t xml:space="preserve">into independent NestJS modules with documented REST and WebSocket APIs.</w:t>
+        <w:t xml:space="preserve">Domain-driven modular design separates gateway synchronization, organizations, devices, rental contracts, incidents, monitoring, billing, and platform services into independent NestJS modules with documented REST and WebSocket APIs.</w:t>
       </w:r>
     </w:p>
     <w:p>
@@ -3988,36 +2837,7 @@
           <w:b/>
           <w:bCs/>
         </w:rPr>
-        <w:t xml:space="preserve">Practical:</w:t>
-      </w:r>
-      <w:r>
-        <w:rPr>
-          <w:b/>
-          <w:bCs/>
-        </w:rPr>
-        <w:t xml:space="preserve"> </w:t>
-      </w:r>
-      <w:r>
-        <w:rPr>
-          <w:b/>
-          <w:bCs/>
-          <w:highlight w:val="yellow"/>
-        </w:rPr>
-        <w:t xml:space="preserve">Build on the team’s ESP32/ESP32-S3 LoRa mesh firmware and hardware (Summer 2026), with targeted enhancements.</w:t>
-      </w:r>
-      <w:r>
-        <w:rPr>
-          <w:b/>
-          <w:bCs/>
-        </w:rPr>
-        <w:t xml:space="preserve"> </w:t>
-      </w:r>
-      <w:r>
-        <w:rPr>
-          <w:b/>
-          <w:bCs/>
-        </w:rPr>
-        <w:t xml:space="preserve">Document the complete message schema: eventId structure, message types, payload format: before any gateway implementation begins.</w:t>
+        <w:t xml:space="preserve">Practical: Build on the team’s ESP32/ESP32-S3 LoRa mesh firmware and hardware (Summer 2026), with targeted enhancements. Document the complete message schema (eventId structure, message types, payload format) before any gateway implementation begins.</w:t>
       </w:r>
     </w:p>
     <w:p>
@@ -4028,31 +2848,7 @@
         </w:numPr>
       </w:pPr>
       <w:r>
-        <w:t xml:space="preserve">Develop the</w:t>
-      </w:r>
-      <w:r>
-        <w:t xml:space="preserve"> </w:t>
-      </w:r>
-      <w:r>
-        <w:rPr>
-          <w:highlight w:val="yellow"/>
-        </w:rPr>
-        <w:t xml:space="preserve">Field Station</w:t>
-      </w:r>
-      <w:r>
-        <w:t xml:space="preserve"> </w:t>
-      </w:r>
-      <w:r>
-        <w:t xml:space="preserve">(Node.js/TypeScript): LoRa-to-serial message parser, SQLite persistent priority queue, MQTT uplink publisher, reconnection flush logic, health reporter</w:t>
-      </w:r>
-      <w:r>
-        <w:rPr>
-          <w:highlight w:val="yellow"/>
-        </w:rPr>
-        <w:t xml:space="preserve">, local web page, and single-executable packaging</w:t>
-      </w:r>
-      <w:r>
-        <w:t xml:space="preserve">.</w:t>
+        <w:t xml:space="preserve">Develop the Field Station (Node.js/TypeScript): LoRa-to-serial message parser, SQLite persistent priority queue, MQTT uplink publisher, reconnection flush logic, Field Station health reporter, local web page, and single-executable packaging.</w:t>
       </w:r>
     </w:p>
     <w:p>
@@ -4063,55 +2859,7 @@
         </w:numPr>
       </w:pPr>
       <w:r>
-        <w:t xml:space="preserve">Develop the NestJS backend: auth/RBAC module,</w:t>
-      </w:r>
-      <w:r>
-        <w:t xml:space="preserve"> </w:t>
-      </w:r>
-      <w:r>
-        <w:rPr>
-          <w:highlight w:val="yellow"/>
-        </w:rPr>
-        <w:t xml:space="preserve">organizations module, asset (device) module, rental contract module</w:t>
-      </w:r>
-      <w:r>
-        <w:t xml:space="preserve">, gateway sync module (idempotent event ingestion), incident module (</w:t>
-      </w:r>
-      <w:r>
-        <w:rPr>
-          <w:highlight w:val="yellow"/>
-        </w:rPr>
-        <w:t xml:space="preserve">tiered alerts</w:t>
-      </w:r>
-      <w:r>
-        <w:t xml:space="preserve"> </w:t>
-      </w:r>
-      <w:r>
-        <w:t xml:space="preserve">+ WebSocket notifications), billing module</w:t>
-      </w:r>
-      <w:r>
-        <w:t xml:space="preserve"> </w:t>
-      </w:r>
-      <w:r>
-        <w:rPr>
-          <w:highlight w:val="yellow"/>
-        </w:rPr>
-        <w:t xml:space="preserve">(SePay)</w:t>
-      </w:r>
-      <w:r>
-        <w:t xml:space="preserve">, and reporting module. Apply PostgreSQL migrations via</w:t>
-      </w:r>
-      <w:r>
-        <w:t xml:space="preserve"> </w:t>
-      </w:r>
-      <w:r>
-        <w:rPr>
-          <w:highlight w:val="yellow"/>
-        </w:rPr>
-        <w:t xml:space="preserve">Prisma</w:t>
-      </w:r>
-      <w:r>
-        <w:t xml:space="preserve">.</w:t>
+        <w:t xml:space="preserve">Develop the NestJS backend: auth/RBAC module, organizations module, asset (device) module, rental contract module, gateway sync module (idempotent event ingestion), incident module (tiered alerts + WebSocket notifications), billing module (SePay), and reporting module. Apply PostgreSQL migrations via Prisma.</w:t>
       </w:r>
     </w:p>
     <w:p>
@@ -4122,31 +2870,7 @@
         </w:numPr>
       </w:pPr>
       <w:r>
-        <w:t xml:space="preserve">Develop the React/TypeScript web client: role-based views</w:t>
-      </w:r>
-      <w:r>
-        <w:t xml:space="preserve"> </w:t>
-      </w:r>
-      <w:r>
-        <w:rPr>
-          <w:highlight w:val="yellow"/>
-        </w:rPr>
-        <w:t xml:space="preserve">for TrekLink and for organizations</w:t>
-      </w:r>
-      <w:r>
-        <w:t xml:space="preserve">, real-time map (Leaflet.js), incident dashboard with WebSocket updates,</w:t>
-      </w:r>
-      <w:r>
-        <w:t xml:space="preserve"> </w:t>
-      </w:r>
-      <w:r>
-        <w:rPr>
-          <w:highlight w:val="yellow"/>
-        </w:rPr>
-        <w:t xml:space="preserve">contract and asset management interfaces, the organization API</w:t>
-      </w:r>
-      <w:r>
-        <w:t xml:space="preserve">, and reporting views.</w:t>
+        <w:t xml:space="preserve">Develop the React/TypeScript web client: role-based views for TrekLink and for organizations, real-time operational map (Leaflet.js), incident dashboard with WebSocket updates, contract and asset management interfaces, the organization API, and reporting views.</w:t>
       </w:r>
     </w:p>
     <w:p>
@@ -4195,47 +2919,13 @@
           <w:b/>
           <w:bCs/>
         </w:rPr>
-        <w:t xml:space="preserve">TrekLink</w:t>
-      </w:r>
-      <w:r>
-        <w:rPr>
-          <w:b/>
-          <w:bCs/>
-        </w:rPr>
-        <w:t xml:space="preserve"> </w:t>
-      </w:r>
-      <w:r>
-        <w:rPr>
-          <w:b/>
-          <w:bCs/>
-          <w:highlight w:val="yellow"/>
-        </w:rPr>
-        <w:t xml:space="preserve">Rental Platform</w:t>
-      </w:r>
-      <w:r>
-        <w:rPr>
-          <w:b/>
-          <w:bCs/>
-        </w:rPr>
-        <w:t xml:space="preserve">:</w:t>
-      </w:r>
-      <w:r>
-        <w:t xml:space="preserve"> </w:t>
-      </w:r>
-      <w:r>
-        <w:t xml:space="preserve">Integrated web application</w:t>
-      </w:r>
-      <w:r>
-        <w:t xml:space="preserve"> </w:t>
-      </w:r>
-      <w:r>
-        <w:rPr>
-          <w:highlight w:val="yellow"/>
-        </w:rPr>
-        <w:t xml:space="preserve">for TrekLink Admin and Staff and for each organization’s Manager and Operators</w:t>
-      </w:r>
-      <w:r>
-        <w:t xml:space="preserve">.</w:t>
+        <w:t xml:space="preserve">TrekLink Rental Platform:</w:t>
+      </w:r>
+      <w:r>
+        <w:t xml:space="preserve"> </w:t>
+      </w:r>
+      <w:r>
+        <w:t xml:space="preserve">Integrated web application for TrekLink Admin and Staff and for each organization’s Manager and Operators.</w:t>
       </w:r>
     </w:p>
     <w:p>
@@ -4249,46 +2939,14 @@
         <w:rPr>
           <w:b/>
           <w:bCs/>
-          <w:highlight w:val="yellow"/>
-        </w:rPr>
-        <w:t xml:space="preserve">Field Station</w:t>
-      </w:r>
-      <w:r>
-        <w:rPr>
-          <w:b/>
-          <w:bCs/>
-        </w:rPr>
-        <w:t xml:space="preserve">:</w:t>
-      </w:r>
-      <w:r>
-        <w:t xml:space="preserve"> </w:t>
-      </w:r>
-      <w:r>
-        <w:t xml:space="preserve">LoRa-to-cloud gateway</w:t>
-      </w:r>
-      <w:r>
-        <w:t xml:space="preserve"> </w:t>
-      </w:r>
-      <w:r>
-        <w:rPr>
-          <w:highlight w:val="yellow"/>
-        </w:rPr>
-        <w:t xml:space="preserve">run on the organization’s laptop</w:t>
-      </w:r>
-      <w:r>
-        <w:t xml:space="preserve"> </w:t>
-      </w:r>
-      <w:r>
-        <w:t xml:space="preserve">with persistent SQLite priority queue (P0–P3), idempotent MQTT synchronization, reconnection flush, health reporting</w:t>
-      </w:r>
-      <w:r>
-        <w:rPr>
-          <w:highlight w:val="yellow"/>
-        </w:rPr>
-        <w:t xml:space="preserve">, and a local offline view</w:t>
-      </w:r>
-      <w:r>
-        <w:t xml:space="preserve">. Primary new hardware-integration deliverable.</w:t>
+        </w:rPr>
+        <w:t xml:space="preserve">Field Station:</w:t>
+      </w:r>
+      <w:r>
+        <w:t xml:space="preserve"> </w:t>
+      </w:r>
+      <w:r>
+        <w:t xml:space="preserve">LoRa-to-cloud gateway run on the organization’s laptop with persistent SQLite priority queue (P0–P3), idempotent MQTT synchronization, reconnection flush, health reporting, and a local offline view. Primary new hardware-integration deliverable.</w:t>
       </w:r>
     </w:p>
     <w:p>
@@ -4323,24 +2981,13 @@
         <w:rPr>
           <w:b/>
           <w:bCs/>
-          <w:highlight w:val="yellow"/>
-        </w:rPr>
-        <w:t xml:space="preserve">Organization &amp; Rental Contract Module</w:t>
-      </w:r>
-      <w:r>
-        <w:rPr>
-          <w:b/>
-          <w:bCs/>
-        </w:rPr>
-        <w:t xml:space="preserve">:</w:t>
-      </w:r>
-      <w:r>
-        <w:t xml:space="preserve"> </w:t>
-      </w:r>
-      <w:r>
-        <w:rPr>
-          <w:highlight w:val="yellow"/>
-        </w:rPr>
+        </w:rPr>
+        <w:t xml:space="preserve">Organization &amp; Rental Contract Module:</w:t>
+      </w:r>
+      <w:r>
+        <w:t xml:space="preserve"> </w:t>
+      </w:r>
+      <w:r>
         <w:t xml:space="preserve">Organization registration and approval, members, on-duty roster, API keys, monthly and day plans, handover, terms, notice, overdue and default.</w:t>
       </w:r>
     </w:p>
@@ -4355,24 +3002,13 @@
         <w:rPr>
           <w:b/>
           <w:bCs/>
-          <w:highlight w:val="yellow"/>
-        </w:rPr>
-        <w:t xml:space="preserve">Asset Management Module</w:t>
-      </w:r>
-      <w:r>
-        <w:rPr>
-          <w:b/>
-          <w:bCs/>
-        </w:rPr>
-        <w:t xml:space="preserve">:</w:t>
-      </w:r>
-      <w:r>
-        <w:t xml:space="preserve"> </w:t>
-      </w:r>
-      <w:r>
-        <w:rPr>
-          <w:highlight w:val="yellow"/>
-        </w:rPr>
+        </w:rPr>
+        <w:t xml:space="preserve">Asset Management Module:</w:t>
+      </w:r>
+      <w:r>
+        <w:t xml:space="preserve"> </w:t>
+      </w:r>
+      <w:r>
         <w:t xml:space="preserve">Eight-state device lifecycle, intake, provisioning, reset, inspection, maintenance, loss, and stock-take.</w:t>
       </w:r>
     </w:p>
@@ -4394,19 +3030,7 @@
         <w:t xml:space="preserve"> </w:t>
       </w:r>
       <w:r>
-        <w:t xml:space="preserve">Automatic Incident creation from SOS events,</w:t>
-      </w:r>
-      <w:r>
-        <w:t xml:space="preserve"> </w:t>
-      </w:r>
-      <w:r>
-        <w:rPr>
-          <w:highlight w:val="yellow"/>
-        </w:rPr>
-        <w:t xml:space="preserve">tiered alerts with escalation to TrekLink and authority-report records</w:t>
-      </w:r>
-      <w:r>
-        <w:t xml:space="preserve">, WebSocket notification, response tracking, and append-only audit history.</w:t>
+        <w:t xml:space="preserve">Automatic Incident creation from SOS events, tiered alerts with escalation to TrekLink and authority-report records, WebSocket notification, response tracking, and append-only audit history.</w:t>
       </w:r>
     </w:p>
     <w:p>
@@ -4420,24 +3044,13 @@
         <w:rPr>
           <w:b/>
           <w:bCs/>
-          <w:highlight w:val="yellow"/>
-        </w:rPr>
-        <w:t xml:space="preserve">Live Telemetry Module</w:t>
-      </w:r>
-      <w:r>
-        <w:rPr>
-          <w:b/>
-          <w:bCs/>
-        </w:rPr>
-        <w:t xml:space="preserve">:</w:t>
-      </w:r>
-      <w:r>
-        <w:t xml:space="preserve"> </w:t>
-      </w:r>
-      <w:r>
-        <w:rPr>
-          <w:highlight w:val="yellow"/>
-        </w:rPr>
+        </w:rPr>
+        <w:t xml:space="preserve">Live Telemetry Module:</w:t>
+      </w:r>
+      <w:r>
+        <w:t xml:space="preserve"> </w:t>
+      </w:r>
+      <w:r>
         <w:t xml:space="preserve">Organization-scoped live map, device telemetry, positions, Field Station connectivity, and a REST and WebSocket API per organization.</w:t>
       </w:r>
     </w:p>
@@ -4452,24 +3065,13 @@
         <w:rPr>
           <w:b/>
           <w:bCs/>
-          <w:highlight w:val="yellow"/>
-        </w:rPr>
-        <w:t xml:space="preserve">Billing Module</w:t>
-      </w:r>
-      <w:r>
-        <w:rPr>
-          <w:b/>
-          <w:bCs/>
-        </w:rPr>
-        <w:t xml:space="preserve">:</w:t>
-      </w:r>
-      <w:r>
-        <w:t xml:space="preserve"> </w:t>
-      </w:r>
-      <w:r>
-        <w:rPr>
-          <w:highlight w:val="yellow"/>
-        </w:rPr>
+        </w:rPr>
+        <w:t xml:space="preserve">Billing Module:</w:t>
+      </w:r>
+      <w:r>
+        <w:t xml:space="preserve"> </w:t>
+      </w:r>
+      <w:r>
         <w:t xml:space="preserve">Term and day-plan pricing, late, damage and loss charges, invoices, and SePay payments (sandbox).</w:t>
       </w:r>
     </w:p>
@@ -4512,19 +3114,7 @@
         <w:t xml:space="preserve"> </w:t>
       </w:r>
       <w:r>
-        <w:t xml:space="preserve">SRS with</w:t>
-      </w:r>
-      <w:r>
-        <w:t xml:space="preserve"> </w:t>
-      </w:r>
-      <w:r>
-        <w:rPr>
-          <w:highlight w:val="yellow"/>
-        </w:rPr>
-        <w:t xml:space="preserve">UML State Machine Diagrams (Device, Incident, Organization, Rental Contract)</w:t>
-      </w:r>
-      <w:r>
-        <w:t xml:space="preserve">, system architecture, database schema, API reference, test plan, deployment guide, and user guide.</w:t>
+        <w:t xml:space="preserve">SRS with UML State Machine Diagrams (Device, Incident, Organization, Rental Contract), system architecture, database schema, API reference, test plan, deployment guide, and user guide.</w:t>
       </w:r>
     </w:p>
     <w:p>
@@ -4662,46 +3252,7 @@
         <w:t xml:space="preserve"> </w:t>
       </w:r>
       <w:r>
-        <w:t xml:space="preserve">Real-time telemetry ingestion, Leaflet.js</w:t>
-      </w:r>
-      <w:r>
-        <w:t xml:space="preserve"> </w:t>
-      </w:r>
-      <w:r>
-        <w:rPr>
-          <w:highlight w:val="yellow"/>
-        </w:rPr>
-        <w:t xml:space="preserve">organization-scoped</w:t>
-      </w:r>
-      <w:r>
-        <w:t xml:space="preserve"> </w:t>
-      </w:r>
-      <w:r>
-        <w:t xml:space="preserve">map with WebSocket live updates,</w:t>
-      </w:r>
-      <w:r>
-        <w:t xml:space="preserve"> </w:t>
-      </w:r>
-      <w:r>
-        <w:rPr>
-          <w:highlight w:val="yellow"/>
-        </w:rPr>
-        <w:t xml:space="preserve">the organization telemetry API</w:t>
-      </w:r>
-      <w:r>
-        <w:t xml:space="preserve">, SOS-to-Incident processing pipeline,</w:t>
-      </w:r>
-      <w:r>
-        <w:t xml:space="preserve"> </w:t>
-      </w:r>
-      <w:r>
-        <w:rPr>
-          <w:highlight w:val="yellow"/>
-        </w:rPr>
-        <w:t xml:space="preserve">tiered-alert incident FSM with escalation</w:t>
-      </w:r>
-      <w:r>
-        <w:t xml:space="preserve">, acknowledgment workflows, and append-only incident audit trail.</w:t>
+        <w:t xml:space="preserve">Real-time telemetry ingestion, Leaflet.js organization-scoped map with WebSocket live updates, the organization telemetry API, SOS-to-Incident processing pipeline, tiered-alert incident FSM with escalation, acknowledgment workflows, and append-only incident audit trail.</w:t>
       </w:r>
     </w:p>
     <w:p>
@@ -4722,13 +3273,7 @@
         <w:t xml:space="preserve"> </w:t>
       </w:r>
       <w:r>
-        <w:rPr>
-          <w:highlight w:val="yellow"/>
-        </w:rPr>
-        <w:t xml:space="preserve">Organization onboarding, rental contracts and plans, device reservation, handover and check-in at the counter, reset and inspection, billing with SePay, TrekLink and organization web views</w:t>
-      </w:r>
-      <w:r>
-        <w:t xml:space="preserve">, operational dashboards, audit log views, and management reports.</w:t>
+        <w:t xml:space="preserve">Organization onboarding, rental contracts and plans, device reservation, handover and check-in at the counter, reset and inspection, billing with SePay, TrekLink and organization web views, operational dashboards, audit log views, and management reports.</w:t>
       </w:r>
     </w:p>
     <w:p>
@@ -4915,9 +3460,6 @@
         <w:pStyle w:val="BodyText"/>
       </w:pPr>
       <w:r>
-        <w:rPr>
-          <w:highlight w:val="yellow"/>
-        </w:rPr>
         <w:t xml:space="preserve">Trekking companies and similar organizations operating where cellular coverage is limited need field events, SOS alerts included, to reach their staff even after a long outage, and need each SOS handled as a coordinated incident with an owner, tracked acknowledgment and an audit trail.</w:t>
       </w:r>
     </w:p>
@@ -4926,9 +3468,6 @@
         <w:pStyle w:val="BodyText"/>
       </w:pPr>
       <w:r>
-        <w:rPr>
-          <w:highlight w:val="yellow"/>
-        </w:rPr>
         <w:t xml:space="preserve">The Summer 2026 TrekLink firmware provides the field communication layer. This Capstone adds a Field Station with priority-aware offline queuing and idempotent event processing, and an SOS-to-Incident pipeline with a formally defined lifecycle and tiered escalation, and evaluates both.</w:t>
       </w:r>
     </w:p>
@@ -5008,19 +3547,7 @@
         <w:pStyle w:val="FirstParagraph"/>
       </w:pPr>
       <w:r>
-        <w:t xml:space="preserve">RQ1 and RQ2 directly evaluate the Event Reliability &amp; Offline Synchronization functional requirements. RQ3 directly evaluates the Incident Management functional requirements and the</w:t>
-      </w:r>
-      <w:r>
-        <w:t xml:space="preserve"> </w:t>
-      </w:r>
-      <w:r>
-        <w:rPr>
-          <w:highlight w:val="yellow"/>
-        </w:rPr>
-        <w:t xml:space="preserve">incident FSM</w:t>
-      </w:r>
-      <w:r>
-        <w:t xml:space="preserve">. All three RQs trace back to specific functional requirements, system modules, task packages, and experiment conditions defined in this proposal.</w:t>
+        <w:t xml:space="preserve">RQ1 and RQ2 directly evaluate the Event Reliability &amp; Offline Synchronization functional requirements. RQ3 directly evaluates the Incident Management functional requirements and the incident FSM. All three RQs trace back to specific functional requirements, system modules, task packages, and experiment conditions defined in this proposal.</w:t>
       </w:r>
     </w:p>
     <w:p>
@@ -5083,19 +3610,7 @@
         </w:numPr>
       </w:pPr>
       <w:r>
-        <w:t xml:space="preserve">Design and implement an SOS-to-Incident pipeline with a formally defined FSM,</w:t>
-      </w:r>
-      <w:r>
-        <w:t xml:space="preserve"> </w:t>
-      </w:r>
-      <w:r>
-        <w:rPr>
-          <w:highlight w:val="yellow"/>
-        </w:rPr>
-        <w:t xml:space="preserve">tiered notification and escalation</w:t>
-      </w:r>
-      <w:r>
-        <w:t xml:space="preserve">, and append-only audit trail.</w:t>
+        <w:t xml:space="preserve">Design and implement an SOS-to-Incident pipeline with a formally defined FSM, tiered notification and escalation, and append-only audit trail.</w:t>
       </w:r>
     </w:p>
     <w:p>
@@ -5117,19 +3632,7 @@
         </w:numPr>
       </w:pPr>
       <w:r>
-        <w:t xml:space="preserve">Integrate the evaluated gateway and incident mechanisms into a complete</w:t>
-      </w:r>
-      <w:r>
-        <w:t xml:space="preserve"> </w:t>
-      </w:r>
-      <w:r>
-        <w:rPr>
-          <w:highlight w:val="yellow"/>
-        </w:rPr>
-        <w:t xml:space="preserve">multi-organization rental platform covering asset management, rental contracts, live telemetry, and billing</w:t>
-      </w:r>
-      <w:r>
-        <w:t xml:space="preserve">.</w:t>
+        <w:t xml:space="preserve">Integrate the evaluated gateway and incident mechanisms into a complete multi-organization rental platform covering asset management, rental contracts, live telemetry, and billing.</w:t>
       </w:r>
     </w:p>
     <w:p>
@@ -5149,40 +3652,7 @@
         <w:pStyle w:val="BodyText"/>
       </w:pPr>
       <w:r>
-        <w:t xml:space="preserve">In scope: TrekLink ESP32/ESP32-S3 devices and LoRa mesh (</w:t>
-      </w:r>
-      <w:r>
-        <w:rPr>
-          <w:highlight w:val="yellow"/>
-        </w:rPr>
-        <w:t xml:space="preserve">Summer 2026 firmware with targeted enhancements</w:t>
-      </w:r>
-      <w:r>
-        <w:t xml:space="preserve">);</w:t>
-      </w:r>
-      <w:r>
-        <w:t xml:space="preserve"> </w:t>
-      </w:r>
-      <w:r>
-        <w:rPr>
-          <w:highlight w:val="yellow"/>
-        </w:rPr>
-        <w:t xml:space="preserve">Field Station</w:t>
-      </w:r>
-      <w:r>
-        <w:t xml:space="preserve">: LoRa-to-MQTT-to-cloud synchronization with priority queue and idempotency; SOS, GPS, and selected telemetry message types; connectivity-loss/recovery experiments in a controlled lab environment; SOS-to-Incident workflow evaluation using controlled drills; organizations, asset and rental-contract modules</w:t>
-      </w:r>
-      <w:r>
-        <w:t xml:space="preserve"> </w:t>
-      </w:r>
-      <w:r>
-        <w:rPr>
-          <w:highlight w:val="yellow"/>
-        </w:rPr>
-        <w:t xml:space="preserve">with multi-tenancy</w:t>
-      </w:r>
-      <w:r>
-        <w:t xml:space="preserve">; responsive web client (desktop/tablet); sandbox payment only.</w:t>
+        <w:t xml:space="preserve">In scope: TrekLink ESP32/ESP32-S3 devices and LoRa mesh (Summer 2026 firmware with targeted enhancements); Field Station: LoRa-to-MQTT-to-cloud synchronization with priority queue and idempotency; SOS, GPS, and selected telemetry message types; connectivity-loss/recovery experiments in a controlled lab environment; SOS-to-Incident workflow evaluation using controlled drills; organizations, asset and rental-contract modules with multi-tenancy; responsive web client (desktop/tablet); sandbox payment only.</w:t>
       </w:r>
     </w:p>
     <w:p>
@@ -5190,28 +3660,7 @@
         <w:pStyle w:val="BodyText"/>
       </w:pPr>
       <w:r>
-        <w:t xml:space="preserve">Out of scope:</w:t>
-      </w:r>
-      <w:r>
-        <w:t xml:space="preserve"> </w:t>
-      </w:r>
-      <w:r>
-        <w:rPr>
-          <w:highlight w:val="yellow"/>
-        </w:rPr>
-        <w:t xml:space="preserve">Mesh-stack rearchitecture</w:t>
-      </w:r>
-      <w:r>
-        <w:t xml:space="preserve">, native mobile apps, commercial payment, hardware radio certification</w:t>
-      </w:r>
-      <w:r>
-        <w:rPr>
-          <w:highlight w:val="yellow"/>
-        </w:rPr>
-        <w:t xml:space="preserve">, individual renters, and the organizations’ own trip and rescue operations</w:t>
-      </w:r>
-      <w:r>
-        <w:t xml:space="preserve">.</w:t>
+        <w:t xml:space="preserve">Out of scope: Mesh-stack rearchitecture, native mobile apps, commercial payment, hardware radio certification, individual renters, and the organizations’ own trip and rescue operations.</w:t>
       </w:r>
     </w:p>
     <w:p>
@@ -5324,19 +3773,7 @@
         <w:t xml:space="preserve"> </w:t>
       </w:r>
       <w:r>
-        <w:t xml:space="preserve">Controlled emergency drills with 1 TrekLink device, 1</w:t>
-      </w:r>
-      <w:r>
-        <w:t xml:space="preserve"> </w:t>
-      </w:r>
-      <w:r>
-        <w:rPr>
-          <w:highlight w:val="yellow"/>
-        </w:rPr>
-        <w:t xml:space="preserve">Field Station, 1 organization with an on-duty member and a backup</w:t>
-      </w:r>
-      <w:r>
-        <w:t xml:space="preserve">, minimum 3 participants rotating. Scenario order randomized; participants do not know exact SOS trigger time; independent observer triggers SOS and starts external timer. All TrekLink-condition timestamps recorded automatically by the backend; baseline timestamps recorded by independent observer (hardware stopwatch). 15–20 drills per condition; vary network latency (LAN and 4G hotspot). Measures: MTTA (mean / median / P95 in seconds), MTTR (mean / median in minutes), traceability score (% of FSM transitions with complete actor + timestamp + action), missed-alert rate (%), duplicate-alert rate (%), incident-completion rate (%).</w:t>
+        <w:t xml:space="preserve">Controlled emergency drills with 1 TrekLink device, 1 Field Station, 1 organization with an on-duty member and a backup, minimum 3 participants rotating. Scenario order randomized; participants do not know exact SOS trigger time; independent observer triggers SOS and starts external timer. All TrekLink-condition timestamps recorded automatically by the backend; baseline timestamps recorded by independent observer (hardware stopwatch). 15–20 drills per condition; vary network latency (LAN and 4G hotspot). Measures: MTTA (mean / median / P95 in seconds), MTTR (mean / median in minutes), traceability score (% of FSM transitions with complete actor + timestamp + action), missed-alert rate (%), duplicate-alert rate (%), incident-completion rate (%).</w:t>
       </w:r>
     </w:p>
     <w:p>
@@ -5432,19 +3869,7 @@
         <w:t xml:space="preserve"> </w:t>
       </w:r>
       <w:r>
-        <w:t xml:space="preserve">with a formally specified</w:t>
-      </w:r>
-      <w:r>
-        <w:t xml:space="preserve"> </w:t>
-      </w:r>
-      <w:r>
-        <w:rPr>
-          <w:highlight w:val="yellow"/>
-        </w:rPr>
-        <w:t xml:space="preserve">FSM, tiered notification and escalation chain</w:t>
-      </w:r>
-      <w:r>
-        <w:t xml:space="preserve">, and append-only audit trail, directly traceable to measurable research outcomes.</w:t>
+        <w:t xml:space="preserve">with a formally specified FSM, tiered notification and escalation chain, and append-only audit trail, directly traceable to measurable research outcomes.</w:t>
       </w:r>
     </w:p>
     <w:p>
@@ -5486,22 +3911,7 @@
         <w:t xml:space="preserve"> </w:t>
       </w:r>
       <w:r>
-        <w:t xml:space="preserve">demonstrating end-to-end integration of an open-source LoRa mesh prototype into a</w:t>
-      </w:r>
-      <w:r>
-        <w:t xml:space="preserve"> </w:t>
-      </w:r>
-      <w:r>
-        <w:rPr>
-          <w:highlight w:val="yellow"/>
-        </w:rPr>
-        <w:t xml:space="preserve">multi-organization rental platform</w:t>
-      </w:r>
-      <w:r>
-        <w:t xml:space="preserve"> </w:t>
-      </w:r>
-      <w:r>
-        <w:t xml:space="preserve">for trekking agencies.</w:t>
+        <w:t xml:space="preserve">demonstrating end-to-end integration of an open-source LoRa mesh prototype into a multi-organization rental platform for trekking agencies.</w:t>
       </w:r>
     </w:p>
     <w:p>
@@ -5534,16 +3944,7 @@
         <w:t xml:space="preserve"> </w:t>
       </w:r>
       <w:r>
-        <w:t xml:space="preserve">(Meshtastic, RAK WisBlock Mesh): Multi-hop messaging, GPS, local SOS broadcast, fall detection.</w:t>
-      </w:r>
-      <w:r>
-        <w:t xml:space="preserve"> </w:t>
-      </w:r>
-      <w:r>
-        <w:rPr>
-          <w:highlight w:val="yellow"/>
-        </w:rPr>
-        <w:t xml:space="preserve">Designed to work independently of any infrastructure; TrekLink builds on it and adds the organization-side layer: device rental and fleet management, store-and-forward to the cloud, and an incident pipeline.</w:t>
+        <w:t xml:space="preserve">(Meshtastic, RAK WisBlock Mesh): Multi-hop messaging, GPS, local SOS broadcast, fall detection. Designed to work independently of any infrastructure; TrekLink builds on it and adds the organization-side layer: device rental and fleet management, store-and-forward to the cloud, and an incident pipeline.</w:t>
       </w:r>
     </w:p>
     <w:p>
@@ -5614,9 +4015,6 @@
         <w:pStyle w:val="FirstParagraph"/>
       </w:pPr>
       <w:r>
-        <w:rPr>
-          <w:highlight w:val="yellow"/>
-        </w:rPr>
         <w:t xml:space="preserve">Gap statement: TrekLink combines five dimensions in one domain-specific platform: off-grid LoRa mesh communication, store-and-forward synchronization under intermittent connectivity, device rental lifecycle management, real-time field monitoring, and structured SOS-to-incident response.</w:t>
       </w:r>
     </w:p>
@@ -5819,10 +4217,7 @@
         <w:pStyle w:val="BodyText"/>
       </w:pPr>
       <w:r>
-        <w:rPr>
-          <w:highlight w:val="yellow"/>
-        </w:rPr>
-        <w:t xml:space="preserve">The TrekLink LoRa mesh firmware and hardware (ESP32/ESP32-S3) are an output of this team’s Summer 2026 project and the technical foundation of this Capstone. Targeted firmware enhancements made during the Capstone are in scope and credited; the hardware design effort is documented in the reports. The scope was adjusted after Review 1 (2026-10-01) so that the product matches the registered title: an enterprise device-rental platform for trekking agencies, built on asset management, with multi-tenancy in scope.</w:t>
+        <w:t xml:space="preserve">The TrekLink LoRa mesh firmware and hardware (ESP32/ESP32-S3) are an output of this team’s Summer 2026 project and the technical foundation of this Capstone. Targeted firmware enhancements made during the Capstone are in scope and credited; the hardware design effort is documented in the reports.</w:t>
       </w:r>
     </w:p>
     <w:tbl>
@@ -5842,8 +4237,8 @@
         </w:tblBorders>
       </w:tblPr>
       <w:tblGrid>
-        <w:gridCol w:w="3719"/>
-        <w:gridCol w:w="5280"/>
+        <w:gridCol w:w="3610"/>
+        <w:gridCol w:w="5389"/>
       </w:tblGrid>
       <w:tr>
         <w:trPr>
@@ -5851,7 +4246,7 @@
         </w:trPr>
         <w:tc>
           <w:tcPr>
-            <w:tcW w:w="3719" w:type="dxa"/>
+            <w:tcW w:w="3610" w:type="dxa"/>
           </w:tcPr>
           <w:p>
             <w:pPr>
@@ -5880,7 +4275,7 @@
         </w:tc>
         <w:tc>
           <w:tcPr>
-            <w:tcW w:w="5280" w:type="dxa"/>
+            <w:tcW w:w="5389" w:type="dxa"/>
           </w:tcPr>
           <w:p>
             <w:pPr>
@@ -5893,7 +4288,7 @@
                 <w:b/>
                 <w:sz w:val="18"/>
               </w:rPr>
-              <w:t xml:space="preserve">HCM, date 25/07/2026</w:t>
+              <w:t xml:space="preserve">HCM, date ____/____/2026</w:t>
             </w:r>
             <w:r>
               <w:rPr>

</xml_diff>

<commit_message>
docs: name the payment provider by role in the adjusted form
Replace SePay with the third-party payment gateway in the six places
the form named it, so the provider can change without editing the
registration form. Both .docx copies are rebuilt.

Co-Authored-By: Claude Opus 5.5 <noreply@anthropic.com>
</commit_message>
<xml_diff>
--- a/topics/docx/Phieu_FA26SE159_adjusted_2026-10.docx
+++ b/topics/docx/Phieu_FA26SE159_adjusted_2026-10.docx
@@ -1530,7 +1530,7 @@
         <w:t xml:space="preserve"> </w:t>
       </w:r>
       <w:r>
-        <w:t xml:space="preserve">Organizations self-register and are verified and approved by TrekLink. They rent devices by monthly plan (half the term fee at the start as a holding fee, half at the end, renewing until notice) or by day plan (3, 4 or 7 days, paid in full at handover, priced above the monthly rate per day), with a minimum order quantity. Handover and return happen in person at the TrekLink counter with a signed handover note; payments are recorded, online through the SePay gateway (VietQR, sandbox) or at the counter.</w:t>
+        <w:t xml:space="preserve">Organizations self-register and are verified and approved by TrekLink. They rent devices by monthly plan (half the term fee at the start as a holding fee, half at the end, renewing until notice) or by day plan (3, 4 or 7 days, paid in full at handover, priced above the monthly rate per day), with a minimum order quantity. Handover and return happen in person at the TrekLink counter with a signed handover note; payments are recorded, online through a third-party payment gateway (VietQR, sandbox) or at the counter.</w:t>
       </w:r>
     </w:p>
     <w:p>
@@ -1811,7 +1811,7 @@
         <w:t xml:space="preserve"> </w:t>
       </w:r>
       <w:r>
-        <w:t xml:space="preserve">SePay (VietQR with confirming webhook), sandbox environment</w:t>
+        <w:t xml:space="preserve">third-party payment gateway (VietQR with confirming webhook), sandbox environment</w:t>
       </w:r>
     </w:p>
     <w:p>
@@ -2340,7 +2340,7 @@
         <w:pStyle w:val="BodyText"/>
       </w:pPr>
       <w:r>
-        <w:t xml:space="preserve">• Integrate the SePay payment gateway (VietQR, confirming webhook) in its sandbox environment, and record counter payments.</w:t>
+        <w:t xml:space="preserve">• Integrate a third-party payment gateway (VietQR, confirming webhook) in its sandbox environment, and record counter payments.</w:t>
       </w:r>
     </w:p>
     <w:p>
@@ -2859,7 +2859,7 @@
         </w:numPr>
       </w:pPr>
       <w:r>
-        <w:t xml:space="preserve">Develop the NestJS backend: auth/RBAC module, organizations module, asset (device) module, rental contract module, gateway sync module (idempotent event ingestion), incident module (tiered alerts + WebSocket notifications), billing module (SePay), and reporting module. Apply PostgreSQL migrations via Prisma.</w:t>
+        <w:t xml:space="preserve">Develop the NestJS backend: auth/RBAC module, organizations module, asset (device) module, rental contract module, gateway sync module (idempotent event ingestion), incident module (tiered alerts + WebSocket notifications), billing module (payment gateway), and reporting module. Apply PostgreSQL migrations via Prisma.</w:t>
       </w:r>
     </w:p>
     <w:p>
@@ -3072,7 +3072,7 @@
         <w:t xml:space="preserve"> </w:t>
       </w:r>
       <w:r>
-        <w:t xml:space="preserve">Term and day-plan pricing, late, damage and loss charges, invoices, and SePay payments (sandbox).</w:t>
+        <w:t xml:space="preserve">Term and day-plan pricing, late, damage and loss charges, invoices, and online payments through the payment gateway (sandbox).</w:t>
       </w:r>
     </w:p>
     <w:p>
@@ -3273,7 +3273,7 @@
         <w:t xml:space="preserve"> </w:t>
       </w:r>
       <w:r>
-        <w:t xml:space="preserve">Organization onboarding, rental contracts and plans, device reservation, handover and check-in at the counter, reset and inspection, billing with SePay, TrekLink and organization web views, operational dashboards, audit log views, and management reports.</w:t>
+        <w:t xml:space="preserve">Organization onboarding, rental contracts and plans, device reservation, handover and check-in at the counter, reset and inspection, billing with online payments, TrekLink and organization web views, operational dashboards, audit log views, and management reports.</w:t>
       </w:r>
     </w:p>
     <w:p>

</xml_diff>

<commit_message>
docs: answer the co-supervisor review in the adjusted form
Co-Authored-By: Claude Opus 5.5 <noreply@anthropic.com>
</commit_message>
<xml_diff>
--- a/topics/docx/Phieu_FA26SE159_adjusted_2026-10.docx
+++ b/topics/docx/Phieu_FA26SE159_adjusted_2026-10.docx
@@ -1551,7 +1551,7 @@
         <w:t xml:space="preserve"> </w:t>
       </w:r>
       <w:r>
-        <w:t xml:space="preserve">Each physical device has two identities, a printed asset tag and its radio node number, and an eight-state lifecycle: In Intake → Available → Reserved → Rented → Returned → Maintenance → Lost → Retired. Devices are provisioned with the renter’s channel key at handover and reset and inspected on return before they can be rented again.</w:t>
+        <w:t xml:space="preserve">Each physical device has two identities, a printed asset tag and its radio node number, and an eight-state lifecycle: In Intake, Available, Reserved, Rented, Returned, Maintenance, Lost and Retired. The main transitions are: Available to Reserved at contract approval, Reserved to Rented at handover, Rented to Returned at check-in or to Lost when reported lost, Returned to Available after reset and a passed inspection or to Maintenance after a failed one, Maintenance to Available after repair or to Retired, and Lost to Returned when recovered. Devices are provisioned with the renter’s channel key at handover and reset and inspected on return before they can be rented again.</w:t>
       </w:r>
     </w:p>
     <w:p>
@@ -1572,7 +1572,7 @@
         <w:t xml:space="preserve"> </w:t>
       </w:r>
       <w:r>
-        <w:t xml:space="preserve">Each field event is identified by eventId = sha256(nodeNum : packetId), derived from identifiers the firmware already transmits. When Internet connectivity is unavailable, the Field Station, a single executable that the organization runs on its own laptop with one rented node on a USB port, persistently stores events in a local SQLite queue and shows the local mesh to the operators on site. Safety-critical SOS events are assigned P0 priority and synchronized first on reconnection; GPS updates are P2 and routine telemetry P3. Each device also keeps its own durable queue.</w:t>
+        <w:t xml:space="preserve">Each field event is identified by eventId = sha256(nodeNum : packetId), derived from identifiers the firmware already transmits. When Internet connectivity is unavailable, the Field Station, a single executable that the organization runs on its own laptop with one rented node on a USB port, persistently stores events in a local SQLite queue and shows the local mesh to the operators on site. Safety-critical SOS events are assigned P0 priority and synchronized first on reconnection; GPS updates are P2 and routine telemetry P3. Each device also keeps its own durable queue. Each event records when it occurred and the source of that time, and belongs to the organization that held the device at that moment, so an event that synchronizes after the device was returned and rented again reaches the earlier renter and never the new one.</w:t>
       </w:r>
     </w:p>
     <w:p>
@@ -2124,7 +2124,7 @@
         <w:pStyle w:val="BodyText"/>
       </w:pPr>
       <w:r>
-        <w:t xml:space="preserve">• Manage the eight-state device lifecycle: In Intake → Available → Reserved → Rented → Returned → Maintenance → Lost → Retired.</w:t>
+        <w:t xml:space="preserve">• Manage the eight-state device lifecycle (In Intake, Available, Reserved, Rented, Returned, Maintenance, Lost, Retired) through its allowed transitions only; for example, a returned device goes back to Available after a passed inspection, and a rented device can be recorded Lost.</w:t>
       </w:r>
     </w:p>
     <w:p>
@@ -3294,7 +3294,7 @@
         <w:t xml:space="preserve"> </w:t>
       </w:r>
       <w:r>
-        <w:t xml:space="preserve">Physical LoRa experiment execution (RQ1/RQ2: 3–5 devices, connectivity-loss matrix, ≥ 20 trials per condition), offline/recovery experiment results, duplicate-event test results, concurrency/load test results, RQ3 SOS drill evaluation (randomized, ≥ 15 drills per condition, automatic timestamp recording), evaluation report, end-to-end integration test suite, Docker Compose deployment, GitHub Actions CI/CD pipeline, and final Capstone documentation.</w:t>
+        <w:t xml:space="preserve">Physical LoRa experiment execution (RQ1/RQ2: 3–5 devices, connectivity-loss matrix, ≥ 20 trials per condition), offline/recovery experiment results, duplicate-event test results, concurrency/load test results, cross-organization isolation suite results with at least two organizations per module, simulated multi-organization load test results, RQ3 SOS drill evaluation (randomized, ≥ 15 drills per condition, automatic timestamp recording), evaluation report, end-to-end integration test suite, Docker Compose deployment, GitHub Actions CI/CD pipeline, and final Capstone documentation.</w:t>
       </w:r>
     </w:p>
     <w:p>
@@ -3773,7 +3773,7 @@
         <w:t xml:space="preserve"> </w:t>
       </w:r>
       <w:r>
-        <w:t xml:space="preserve">Controlled emergency drills with 1 TrekLink device, 1 Field Station, 1 organization with an on-duty member and a backup, minimum 3 participants rotating. Scenario order randomized; participants do not know exact SOS trigger time; independent observer triggers SOS and starts external timer. All TrekLink-condition timestamps recorded automatically by the backend; baseline timestamps recorded by independent observer (hardware stopwatch). 15–20 drills per condition; vary network latency (LAN and 4G hotspot). Measures: MTTA (mean / median / P95 in seconds), MTTR (mean / median in minutes), traceability score (% of FSM transitions with complete actor + timestamp + action), missed-alert rate (%), duplicate-alert rate (%), incident-completion rate (%).</w:t>
+        <w:t xml:space="preserve">Controlled emergency drills with two organizations at once, each with 1 TrekLink device, 1 Field Station, an on-duty member and a backup, minimum 4 participants rotating. Scenario order randomized; participants do not know exact SOS trigger time; independent observer triggers SOS and starts external timer. All TrekLink-condition timestamps recorded automatically by the backend; baseline timestamps recorded by independent observer (hardware stopwatch). 15–20 drills per condition; vary network latency (LAN and 4G hotspot). Measures: MTTA (mean / median / P95 in seconds), MTTR (mean / median in minutes), traceability score (% of FSM transitions with complete actor + timestamp + action), missed-alert rate (%), duplicate-alert rate (%), incident-completion rate (%), cross-organization leakage (alerts or positions delivered to the wrong organization, expected 0).</w:t>
       </w:r>
     </w:p>
     <w:p>
@@ -3794,7 +3794,7 @@
         <w:t xml:space="preserve"> </w:t>
       </w:r>
       <w:r>
-        <w:t xml:space="preserve">End-to-end test cases for all functional requirements, idempotency tests (10× same eventId → 1 Incident), concurrency tests (20 simultaneous events → 0 duplicates), RBAC validation, and audit-log completeness check.</w:t>
+        <w:t xml:space="preserve">End-to-end test cases for all functional requirements, idempotency tests (10× same eventId → 1 Incident), concurrency tests (20 simultaneous events → 0 duplicates), RBAC validation, audit-log completeness check, a cross-organization isolation suite with at least two organizations per module (including an event that synchronizes after its device was returned and rented to another organization), and a load test with simulated devices and Field Stations at 10 organizations, 50 rented devices and 20 simultaneous Field Station submissions.</w:t>
       </w:r>
     </w:p>
     <w:p>

</xml_diff>

<commit_message>
docs: apply D-045 and D-046 to the form and the figure records
Co-Authored-By: Claude Opus 5.5 <noreply@anthropic.com>
</commit_message>
<xml_diff>
--- a/topics/docx/Phieu_FA26SE159_adjusted_2026-10.docx
+++ b/topics/docx/Phieu_FA26SE159_adjusted_2026-10.docx
@@ -1551,7 +1551,7 @@
         <w:t xml:space="preserve"> </w:t>
       </w:r>
       <w:r>
-        <w:t xml:space="preserve">Each physical device has two identities, a printed asset tag and its radio node number, and an eight-state lifecycle: In Intake, Available, Reserved, Rented, Returned, Maintenance, Lost and Retired. The main transitions are: Available to Reserved at contract approval, Reserved to Rented at handover, Rented to Returned at check-in or to Lost when reported lost, Returned to Available after reset and a passed inspection or to Maintenance after a failed one, Maintenance to Available after repair or to Retired, and Lost to Returned when recovered. Devices are provisioned with the renter’s channel key at handover and reset and inspected on return before they can be rented again.</w:t>
+        <w:t xml:space="preserve">Each physical device has two identities, a printed asset tag and its radio node number, and a nine-state lifecycle: In Intake, Available, Reserved, Rented, Returned, Maintenance, Lost, Retired and Disposed. The main transitions are: Available to Reserved at contract approval, Reserved to Rented at handover, Rented to Returned at check-in, Returned to Available after reset and a passed inspection or to Maintenance after a failed one, Maintenance to Available after repair or to Retired, and Retired to Disposed after a verified wipe. A loss can be reported from any of the six working states; it opens a loss case, which ends with the device recovered to Returned or with the loss settled and the device Retired. The renter bears a loss only when the device was in its custody. Devices are provisioned with the renter’s channel key at handover and reset and inspected on return before they can be rented again.</w:t>
       </w:r>
     </w:p>
     <w:p>
@@ -1932,7 +1932,7 @@
         <w:pStyle w:val="FirstParagraph"/>
       </w:pPr>
       <w:r>
-        <w:t xml:space="preserve">• Verify organizations in person or by phone and record the signed master contract.</w:t>
+        <w:t xml:space="preserve">• Verify organizations in person or by phone and record the signed master contract, including the non-disclosure agreement and the Field Station software licence; record suspected fraud, theft, IP or NDA breaches as compliance cases.</w:t>
       </w:r>
     </w:p>
     <w:p>
@@ -2124,7 +2124,7 @@
         <w:pStyle w:val="BodyText"/>
       </w:pPr>
       <w:r>
-        <w:t xml:space="preserve">• Manage the eight-state device lifecycle (In Intake, Available, Reserved, Rented, Returned, Maintenance, Lost, Retired) through its allowed transitions only; for example, a returned device goes back to Available after a passed inspection, and a rented device can be recorded Lost.</w:t>
+        <w:t xml:space="preserve">• Manage the nine-state device lifecycle (In Intake, Available, Reserved, Rented, Returned, Maintenance, Lost, Retired, Disposed) through its allowed transitions only; for example, a returned device goes back to Available after a passed inspection, and a device in any working state can be reported Lost.</w:t>
       </w:r>
     </w:p>
     <w:p>
@@ -2132,6 +2132,14 @@
         <w:pStyle w:val="BodyText"/>
       </w:pPr>
       <w:r>
+        <w:t xml:space="preserve">• Handle each lost device as a loss case: custody decided from the rental history, channel key exposure flagged, recovery or a charge by custody with an Admin waiver, and a police report reference for suspected theft or fraud; replace a faulty or lost unit on a running contract at the counter.</w:t>
+      </w:r>
+    </w:p>
+    <w:p>
+      <w:pPr>
+        <w:pStyle w:val="BodyText"/>
+      </w:pPr>
+      <w:r>
         <w:t xml:space="preserve">• Record battery level, last-seen time, latest GPS position, and telemetry status.</w:t>
       </w:r>
     </w:p>
@@ -2678,7 +2686,7 @@
         <w:t xml:space="preserve"> </w:t>
       </w:r>
       <w:r>
-        <w:t xml:space="preserve">Model the eight-state device lifecycle, the incident lifecycle with tiered notification and escalation, and the organization and rental-contract lifecycles with controlled, auditable state transitions. Each transition is an atomic, logged operation.</w:t>
+        <w:t xml:space="preserve">Model the nine-state device lifecycle with its loss case, the incident lifecycle with tiered notification and escalation, and the organization and rental-contract lifecycles with controlled, auditable state transitions. Each transition is an atomic, logged operation.</w:t>
       </w:r>
     </w:p>
     <w:p>
@@ -3009,7 +3017,7 @@
         <w:t xml:space="preserve"> </w:t>
       </w:r>
       <w:r>
-        <w:t xml:space="preserve">Eight-state device lifecycle, intake, provisioning, reset, inspection, maintenance, loss, and stock-take.</w:t>
+        <w:t xml:space="preserve">Nine-state device lifecycle, intake, provisioning, reset, inspection, maintenance, loss cases, replacement, disposal, and stock-take.</w:t>
       </w:r>
     </w:p>
     <w:p>

</xml_diff>

<commit_message>
docs: record D-047 periodic maintenance and apply it to the form
D-047: service plan per hardware variant, weekly scan with a look-ahead of the
run period plus devices.maintenanceLeadDays, units on a contract routed at
check-in, cost approval above devices.maintenanceApprovalThresholdVnd by an
Admin who did not estimate, firmware update as maintenance. Risk row and a
pointer on D-035. Chapter 13 below-floor tables regenerated from the 2026-10-14
measurements. Adjusted form lines on scheduled maintenance; both .docx rebuilt.

Co-Authored-By: Claude Opus 5.5 <noreply@anthropic.com>
</commit_message>
<xml_diff>
--- a/topics/docx/Phieu_FA26SE159_adjusted_2026-10.docx
+++ b/topics/docx/Phieu_FA26SE159_adjusted_2026-10.docx
@@ -2156,7 +2156,7 @@
         <w:pStyle w:val="BodyText"/>
       </w:pPr>
       <w:r>
-        <w:t xml:space="preserve">• Schedule maintenance and prevent unavailable or expired-maintenance devices from being allocated.</w:t>
+        <w:t xml:space="preserve">• Schedule maintenance by a service plan per hardware variant and a weekly scan, record its cost with Admin approval above a threshold and each firmware update, and prevent unavailable or due-for-service devices from being allocated.</w:t>
       </w:r>
     </w:p>
     <w:p>
@@ -3017,7 +3017,7 @@
         <w:t xml:space="preserve"> </w:t>
       </w:r>
       <w:r>
-        <w:t xml:space="preserve">Nine-state device lifecycle, intake, provisioning, reset, inspection, maintenance, loss cases, replacement, disposal, and stock-take.</w:t>
+        <w:t xml:space="preserve">Nine-state device lifecycle, intake, provisioning, reset, inspection, scheduled maintenance with cost approval, loss cases, replacement, disposal, and stock-take.</w:t>
       </w:r>
     </w:p>
     <w:p>

</xml_diff>

<commit_message>
docs: registration context quotes the Review 2 context slide
Section 3.2 a) Context opens with the problem and solution text of Review 2 slide 2, word for word, in place of the market context, gap and opportunity paragraphs. The two .docx files are edited to match, since pandoc is not installed on this machine; the submitted PDFs are capstone 61af17b.

Checksum: baef11502819e4ab0c3fae2c7ba0a4cba01ee3cb58a833097ea16269f15eaf2334
</commit_message>
<xml_diff>
--- a/topics/docx/Phieu_FA26SE159_adjusted_2026-10.docx
+++ b/topics/docx/Phieu_FA26SE159_adjusted_2026-10.docx
@@ -1321,13 +1321,10 @@
           <w:b/>
           <w:bCs/>
         </w:rPr>
-        <w:t xml:space="preserve">Market context.</w:t>
-      </w:r>
-      <w:r>
-        <w:t xml:space="preserve"> </w:t>
-      </w:r>
-      <w:r>
-        <w:t xml:space="preserve">Trekking in Vietnam often takes place in remote mountainous areas, on routes such as Tà Năng–Phan Dũng, Tả Liên Sơn and Bạch Mộc Lương Tử, where cellular connectivity is limited or unavailable for long stretches. Many groups from different companies share the same routes on the same day.</w:t>
+        <w:t>The problem.</w:t>
+      </w:r>
+      <w:r>
+        <w:t xml:space="preserve"> Trekking companies lead groups through mountain routes where phone coverage is limited or absent for long stretches. Satellite messengers cost more to buy and run, so few groups carry them. In Vietnam, the market for trekking and off-grid communication systems is still new, with room of potential.</w:t>
       </w:r>
     </w:p>
     <w:p>
@@ -1339,31 +1336,10 @@
           <w:b/>
           <w:bCs/>
         </w:rPr>
-        <w:t xml:space="preserve">Identified gap.</w:t>
-      </w:r>
-      <w:r>
-        <w:t xml:space="preserve"> </w:t>
-      </w:r>
-      <w:r>
-        <w:t xml:space="preserve">Integrated platforms combining off-grid IoT communication, monitoring, device management and structured incident coordination are not yet widely adopted in Vietnam’s trekking service market.</w:t>
-      </w:r>
-    </w:p>
-    <w:p>
-      <w:pPr>
-        <w:pStyle w:val="BodyText"/>
-      </w:pPr>
-      <w:r>
-        <w:rPr>
-          <w:b/>
-          <w:bCs/>
-        </w:rPr>
-        <w:t xml:space="preserve">Project opportunity.</w:t>
-      </w:r>
-      <w:r>
-        <w:t xml:space="preserve"> </w:t>
-      </w:r>
-      <w:r>
-        <w:t xml:space="preserve">TrekLink addresses this gap by extending its existing LoRa mesh communication technology into an integrated operational platform designed for the Vietnamese trekking environment.</w:t>
+        <w:t>The solution.</w:t>
+      </w:r>
+      <w:r>
+        <w:t xml:space="preserve"> TrekLink builds LoRa mesh devices and rents them to organizations through one platform hosted by TrekLink. Organizations rent by plan. An SOS alerts their own on-duty staff first, then TrekLink Staff if nobody answers. Our Meshtastic-based firmware relays messages over several hops; the platform adds live monitoring.</w:t>
       </w:r>
     </w:p>
     <w:p>

</xml_diff>